<commit_message>
Final touches on documentation and added javadoc
</commit_message>
<xml_diff>
--- a/КУРСОВ ПРОЕКТ.docx
+++ b/КУРСОВ ПРОЕКТ.docx
@@ -171,6 +171,12 @@
           <w:rFonts w:ascii="Times New Roman" w:hAnsi="Times New Roman" w:cs="Times New Roman"/>
         </w:rPr>
       </w:pPr>
+      <w:r>
+        <w:rPr>
+          <w:rFonts w:ascii="Times New Roman" w:hAnsi="Times New Roman" w:cs="Times New Roman"/>
+        </w:rPr>
+        <w:t>Катедра: Софтуерни и интернет технологии</w:t>
+      </w:r>
     </w:p>
     <w:p>
       <w:pPr>
@@ -189,6 +195,18 @@
         </w:rPr>
         <w:t>Тема:</w:t>
       </w:r>
+    </w:p>
+    <w:p>
+      <w:pPr>
+        <w:jc w:val="center"/>
+        <w:rPr>
+          <w:rFonts w:ascii="Times New Roman" w:hAnsi="Times New Roman" w:cs="Times New Roman"/>
+          <w:sz w:val="24"/>
+          <w:szCs w:val="24"/>
+        </w:rPr>
+      </w:pPr>
+      <w:bookmarkStart w:id="0" w:name="_GoBack"/>
+      <w:bookmarkEnd w:id="0"/>
     </w:p>
     <w:p>
       <w:pPr>
@@ -525,16 +543,6 @@
         </w:rPr>
         <w:tab/>
       </w:r>
-    </w:p>
-    <w:p>
-      <w:pPr>
-        <w:jc w:val="center"/>
-        <w:rPr>
-          <w:rFonts w:ascii="Times New Roman" w:hAnsi="Times New Roman" w:cs="Times New Roman"/>
-          <w:sz w:val="24"/>
-          <w:szCs w:val="24"/>
-        </w:rPr>
-      </w:pPr>
     </w:p>
     <w:p>
       <w:pPr>
@@ -2077,7 +2085,17 @@
                 <w:sz w:val="24"/>
                 <w:szCs w:val="24"/>
               </w:rPr>
-              <w:t>4.1.2 Реализация на epsilonClosure()</w:t>
+              <w:t xml:space="preserve">4.1.2 Реализация на </w:t>
+            </w:r>
+            <w:r>
+              <w:rPr>
+                <w:rStyle w:val="Hyperlink"/>
+                <w:rFonts w:ascii="Times New Roman" w:hAnsi="Times New Roman" w:cs="Times New Roman"/>
+                <w:i/>
+                <w:sz w:val="24"/>
+                <w:szCs w:val="24"/>
+              </w:rPr>
+              <w:t>epsilonClosure()</w:t>
             </w:r>
             <w:r>
               <w:rPr>
@@ -3038,7 +3056,17 @@
                 <w:sz w:val="24"/>
                 <w:szCs w:val="24"/>
               </w:rPr>
-              <w:t>5.7 Тестване на операцията positive closure</w:t>
+              <w:t xml:space="preserve">5.7 Тестване на операцията </w:t>
+            </w:r>
+            <w:r>
+              <w:rPr>
+                <w:rStyle w:val="Hyperlink"/>
+                <w:rFonts w:ascii="Times New Roman" w:hAnsi="Times New Roman" w:cs="Times New Roman"/>
+                <w:i/>
+                <w:sz w:val="24"/>
+                <w:szCs w:val="24"/>
+              </w:rPr>
+              <w:t>positive closure</w:t>
             </w:r>
             <w:r>
               <w:rPr>
@@ -3471,8 +3499,6 @@
             <w:fldChar w:fldCharType="end"/>
           </w:r>
         </w:p>
-        <w:bookmarkStart w:id="0" w:name="_GoBack" w:displacedByCustomXml="next"/>
-        <w:bookmarkEnd w:id="0" w:displacedByCustomXml="next"/>
       </w:sdtContent>
     </w:sdt>
     <w:bookmarkStart w:id="1" w:name="_Toc229947535" w:displacedByCustomXml="prev"/>
@@ -3500,15 +3526,14 @@
     <w:p>
       <w:pPr>
         <w:pStyle w:val="Heading2"/>
+        <w:numPr>
+          <w:ilvl w:val="1"/>
+          <w:numId w:val="2"/>
+        </w:numPr>
+        <w:spacing w:line="320" w:lineRule="exact"/>
       </w:pPr>
       <w:bookmarkStart w:id="2" w:name="_Toc229947536"/>
       <w:r>
-        <w:rPr>
-          <w:lang w:val="en-US"/>
-        </w:rPr>
-        <w:t xml:space="preserve">1.1 </w:t>
-      </w:r>
-      <w:r>
         <w:t>Описание и идея на проекта</w:t>
       </w:r>
       <w:bookmarkEnd w:id="2"/>
@@ -3516,19 +3541,7 @@
     <w:p>
       <w:pPr>
         <w:pStyle w:val="ListParagraph"/>
-        <w:jc w:val="center"/>
-        <w:rPr>
-          <w:rFonts w:ascii="Times New Roman" w:hAnsi="Times New Roman" w:cs="Times New Roman"/>
-          <w:b/>
-          <w:sz w:val="36"/>
-          <w:szCs w:val="24"/>
-        </w:rPr>
-      </w:pPr>
-    </w:p>
-    <w:p>
-      <w:pPr>
-        <w:pStyle w:val="ListParagraph"/>
-        <w:spacing w:after="0" w:line="360" w:lineRule="auto"/>
+        <w:spacing w:after="0" w:line="320" w:lineRule="exact"/>
         <w:ind w:left="0"/>
         <w:jc w:val="both"/>
         <w:rPr>
@@ -3543,13 +3556,29 @@
           <w:sz w:val="24"/>
           <w:szCs w:val="24"/>
         </w:rPr>
-        <w:t>Настоящият курсов проект представлява конзолно приложение, реализирано на езика Java, предназначено за работа с недетерминирани крайни автомати.</w:t>
+        <w:t xml:space="preserve">Настоящият курсов проект представлява конзолно приложение, реализирано на езика Java, </w:t>
+      </w:r>
+      <w:r>
+        <w:rPr>
+          <w:rFonts w:ascii="Times New Roman" w:hAnsi="Times New Roman" w:cs="Times New Roman"/>
+          <w:sz w:val="24"/>
+          <w:szCs w:val="24"/>
+        </w:rPr>
+        <w:t>предназначено за работа с недетерминирани крайни автомати с ε-преходи</w:t>
+      </w:r>
+      <w:r>
+        <w:rPr>
+          <w:rFonts w:ascii="Times New Roman" w:hAnsi="Times New Roman" w:cs="Times New Roman"/>
+          <w:sz w:val="24"/>
+          <w:szCs w:val="24"/>
+        </w:rPr>
+        <w:t>.</w:t>
       </w:r>
     </w:p>
     <w:p>
       <w:pPr>
         <w:pStyle w:val="ListParagraph"/>
-        <w:spacing w:after="0" w:line="360" w:lineRule="auto"/>
+        <w:spacing w:after="0" w:line="320" w:lineRule="exact"/>
         <w:ind w:left="0"/>
         <w:jc w:val="both"/>
         <w:rPr>
@@ -3562,7 +3591,7 @@
     <w:p>
       <w:pPr>
         <w:pStyle w:val="ListParagraph"/>
-        <w:spacing w:after="0" w:line="360" w:lineRule="auto"/>
+        <w:spacing w:after="0" w:line="320" w:lineRule="exact"/>
         <w:ind w:left="0"/>
         <w:jc w:val="both"/>
         <w:rPr>
@@ -3577,13 +3606,54 @@
           <w:sz w:val="24"/>
           <w:szCs w:val="24"/>
         </w:rPr>
-        <w:t>Приложението позволява създаване, обработка и управление на автомати чрез набор от команди, въведени от потребителя през командния ред. Реализирани са операции за проверка на думи, обединение, конкатенация, positive closure, детерминиране на автомат и проверка дали езикът му е краен.</w:t>
+        <w:t>Приложението позволява създаване, обработка и управление на автомати чрез набор от команди, въведени от потребителя през командния ред.</w:t>
+      </w:r>
+      <w:r>
+        <w:rPr>
+          <w:rFonts w:ascii="Times New Roman" w:hAnsi="Times New Roman" w:cs="Times New Roman"/>
+          <w:sz w:val="24"/>
+          <w:szCs w:val="24"/>
+        </w:rPr>
+        <w:t xml:space="preserve"> </w:t>
+      </w:r>
+      <w:r>
+        <w:rPr>
+          <w:rFonts w:ascii="Times New Roman" w:hAnsi="Times New Roman" w:cs="Times New Roman"/>
+          <w:sz w:val="24"/>
+          <w:szCs w:val="24"/>
+        </w:rPr>
+        <w:t>Системата позволява зареждане и запис на автомати във файлове.</w:t>
+      </w:r>
+      <w:r>
+        <w:rPr>
+          <w:rFonts w:ascii="Times New Roman" w:hAnsi="Times New Roman" w:cs="Times New Roman"/>
+          <w:sz w:val="24"/>
+          <w:szCs w:val="24"/>
+        </w:rPr>
+        <w:t xml:space="preserve"> Реализирани са операции за проверка на думи, обединение, конкатенация, </w:t>
+      </w:r>
+      <w:r>
+        <w:rPr>
+          <w:rFonts w:ascii="Times New Roman" w:hAnsi="Times New Roman" w:cs="Times New Roman"/>
+          <w:i/>
+          <w:sz w:val="24"/>
+          <w:szCs w:val="24"/>
+        </w:rPr>
+        <w:t>positive closure</w:t>
+      </w:r>
+      <w:r>
+        <w:rPr>
+          <w:rFonts w:ascii="Times New Roman" w:hAnsi="Times New Roman" w:cs="Times New Roman"/>
+          <w:sz w:val="24"/>
+          <w:szCs w:val="24"/>
+        </w:rPr>
+        <w:t>, детерминиране на автомат и проверка дали езикът му е краен.</w:t>
       </w:r>
     </w:p>
     <w:p>
       <w:pPr>
         <w:pStyle w:val="ListParagraph"/>
-        <w:spacing w:after="0" w:line="360" w:lineRule="auto"/>
+        <w:spacing w:after="0" w:line="320" w:lineRule="exact"/>
         <w:ind w:left="0"/>
         <w:jc w:val="both"/>
         <w:rPr>
@@ -3596,7 +3666,7 @@
     <w:p>
       <w:pPr>
         <w:pStyle w:val="ListParagraph"/>
-        <w:spacing w:after="0" w:line="360" w:lineRule="auto"/>
+        <w:spacing w:after="0" w:line="320" w:lineRule="exact"/>
         <w:ind w:left="0"/>
         <w:jc w:val="both"/>
         <w:rPr>
@@ -3617,7 +3687,7 @@
     <w:p>
       <w:pPr>
         <w:pStyle w:val="ListParagraph"/>
-        <w:spacing w:after="0" w:line="360" w:lineRule="auto"/>
+        <w:spacing w:after="0" w:line="320" w:lineRule="exact"/>
         <w:ind w:left="0"/>
         <w:jc w:val="both"/>
         <w:rPr>
@@ -3630,7 +3700,7 @@
     <w:p>
       <w:pPr>
         <w:pStyle w:val="ListParagraph"/>
-        <w:spacing w:after="0" w:line="360" w:lineRule="auto"/>
+        <w:spacing w:after="0" w:line="320" w:lineRule="exact"/>
         <w:ind w:left="0"/>
         <w:jc w:val="both"/>
         <w:rPr>
@@ -3645,51 +3715,37 @@
           <w:sz w:val="24"/>
           <w:szCs w:val="24"/>
         </w:rPr>
-        <w:t>Основната идея на проекта е да се създаде система, която демонстрира основни операции върху крайни автомати и тяхното практическо приложение.</w:t>
+        <w:t xml:space="preserve">Основната идея на проекта е да се създаде система, която </w:t>
+      </w:r>
+      <w:r>
+        <w:rPr>
+          <w:rFonts w:ascii="Times New Roman" w:hAnsi="Times New Roman" w:cs="Times New Roman"/>
+          <w:sz w:val="24"/>
+          <w:szCs w:val="24"/>
+        </w:rPr>
+        <w:t>демонстрира основните алгоритми и операции</w:t>
+      </w:r>
+      <w:r>
+        <w:rPr>
+          <w:rFonts w:ascii="Times New Roman" w:hAnsi="Times New Roman" w:cs="Times New Roman"/>
+          <w:sz w:val="24"/>
+          <w:szCs w:val="24"/>
+        </w:rPr>
+        <w:t xml:space="preserve"> </w:t>
+      </w:r>
+      <w:r>
+        <w:rPr>
+          <w:rFonts w:ascii="Times New Roman" w:hAnsi="Times New Roman" w:cs="Times New Roman"/>
+          <w:sz w:val="24"/>
+          <w:szCs w:val="24"/>
+        </w:rPr>
+        <w:t>върху крайни автомати и тяхното практическо приложение.</w:t>
       </w:r>
     </w:p>
     <w:p>
       <w:pPr>
         <w:pStyle w:val="ListParagraph"/>
-        <w:rPr>
-          <w:rFonts w:ascii="Times New Roman" w:hAnsi="Times New Roman" w:cs="Times New Roman"/>
-          <w:b/>
-          <w:sz w:val="36"/>
-          <w:szCs w:val="24"/>
-        </w:rPr>
-      </w:pPr>
-    </w:p>
-    <w:p>
-      <w:pPr>
-        <w:pStyle w:val="Heading2"/>
-      </w:pPr>
-      <w:bookmarkStart w:id="3" w:name="_Toc229947537"/>
-      <w:r>
-        <w:rPr>
-          <w:lang w:val="en-US"/>
-        </w:rPr>
-        <w:t xml:space="preserve">1.2 </w:t>
-      </w:r>
-      <w:r>
-        <w:t>Цел и задачи на разработката</w:t>
-      </w:r>
-      <w:bookmarkEnd w:id="3"/>
-    </w:p>
-    <w:p>
-      <w:pPr>
-        <w:pStyle w:val="ListParagraph"/>
-        <w:rPr>
-          <w:rFonts w:ascii="Times New Roman" w:hAnsi="Times New Roman" w:cs="Times New Roman"/>
-          <w:b/>
-          <w:sz w:val="36"/>
-          <w:szCs w:val="24"/>
-        </w:rPr>
-      </w:pPr>
-    </w:p>
-    <w:p>
-      <w:pPr>
-        <w:pStyle w:val="ListParagraph"/>
-        <w:spacing w:line="360" w:lineRule="auto"/>
+        <w:spacing w:after="0" w:line="320" w:lineRule="exact"/>
         <w:ind w:left="0"/>
         <w:jc w:val="both"/>
         <w:rPr>
@@ -3698,19 +3754,27 @@
           <w:szCs w:val="24"/>
         </w:rPr>
       </w:pPr>
-      <w:r>
-        <w:rPr>
-          <w:rFonts w:ascii="Times New Roman" w:hAnsi="Times New Roman" w:cs="Times New Roman"/>
-          <w:sz w:val="24"/>
-          <w:szCs w:val="24"/>
-        </w:rPr>
-        <w:t>Основната цел на проекта е създаването на система за работа с недетерминирани крайни автомати с ε-преходи.</w:t>
-      </w:r>
+    </w:p>
+    <w:p>
+      <w:pPr>
+        <w:pStyle w:val="Heading2"/>
+        <w:numPr>
+          <w:ilvl w:val="1"/>
+          <w:numId w:val="2"/>
+        </w:numPr>
+        <w:spacing w:line="320" w:lineRule="exact"/>
+        <w:ind w:left="547" w:hanging="547"/>
+      </w:pPr>
+      <w:bookmarkStart w:id="3" w:name="_Toc229947537"/>
+      <w:r>
+        <w:t>Цел и задачи на разработката</w:t>
+      </w:r>
+      <w:bookmarkEnd w:id="3"/>
     </w:p>
     <w:p>
       <w:pPr>
         <w:pStyle w:val="ListParagraph"/>
-        <w:spacing w:line="360" w:lineRule="auto"/>
+        <w:spacing w:line="320" w:lineRule="exact"/>
         <w:ind w:left="0"/>
         <w:jc w:val="both"/>
         <w:rPr>
@@ -3719,38 +3783,43 @@
           <w:szCs w:val="24"/>
         </w:rPr>
       </w:pPr>
+      <w:r>
+        <w:rPr>
+          <w:rFonts w:ascii="Times New Roman" w:hAnsi="Times New Roman" w:cs="Times New Roman"/>
+          <w:sz w:val="24"/>
+          <w:szCs w:val="24"/>
+        </w:rPr>
+        <w:t>Основната цел на проекта е създаването на система за работа с недетерминирани крайни автомати с ε-преходи чрез команден интерфейс.</w:t>
+      </w:r>
     </w:p>
     <w:p>
       <w:pPr>
         <w:pStyle w:val="ListParagraph"/>
-        <w:spacing w:line="360" w:lineRule="auto"/>
+        <w:spacing w:line="320" w:lineRule="exact"/>
         <w:ind w:left="0"/>
         <w:jc w:val="both"/>
         <w:rPr>
           <w:rFonts w:ascii="Times New Roman" w:hAnsi="Times New Roman" w:cs="Times New Roman"/>
           <w:sz w:val="24"/>
-          <w:szCs w:val="24"/>
-        </w:rPr>
-      </w:pPr>
-      <w:r>
-        <w:rPr>
-          <w:rFonts w:ascii="Times New Roman" w:hAnsi="Times New Roman" w:cs="Times New Roman"/>
-          <w:sz w:val="24"/>
-          <w:szCs w:val="24"/>
-        </w:rPr>
-        <w:t>За реализиране на проекта са изпълнени следните задачи:</w:t>
+        </w:rPr>
+      </w:pPr>
+      <w:r>
+        <w:rPr>
+          <w:rFonts w:ascii="Times New Roman" w:hAnsi="Times New Roman" w:cs="Times New Roman"/>
+          <w:sz w:val="24"/>
+        </w:rPr>
+        <w:t>Приложението трябва да позволява създаване, обработка и управление на автомати, както и изпълнение на основни операции върху тях.</w:t>
       </w:r>
     </w:p>
     <w:p>
       <w:pPr>
         <w:pStyle w:val="ListParagraph"/>
-        <w:spacing w:line="360" w:lineRule="auto"/>
+        <w:spacing w:line="320" w:lineRule="exact"/>
         <w:ind w:left="0"/>
         <w:jc w:val="both"/>
         <w:rPr>
           <w:rFonts w:ascii="Times New Roman" w:hAnsi="Times New Roman" w:cs="Times New Roman"/>
-          <w:b/>
-          <w:sz w:val="36"/>
+          <w:sz w:val="28"/>
           <w:szCs w:val="24"/>
         </w:rPr>
       </w:pPr>
@@ -3758,7 +3827,7 @@
     <w:p>
       <w:pPr>
         <w:pStyle w:val="ListParagraph"/>
-        <w:spacing w:line="360" w:lineRule="auto"/>
+        <w:spacing w:line="320" w:lineRule="exact"/>
         <w:ind w:left="0"/>
         <w:jc w:val="both"/>
         <w:rPr>
@@ -3773,13 +3842,13 @@
           <w:sz w:val="24"/>
           <w:szCs w:val="24"/>
         </w:rPr>
-        <w:t>• създаване на структура за представяне на автомат;</w:t>
+        <w:t>За реализиране на проекта са изпълнени следните задачи:</w:t>
       </w:r>
     </w:p>
     <w:p>
       <w:pPr>
         <w:pStyle w:val="ListParagraph"/>
-        <w:spacing w:line="360" w:lineRule="auto"/>
+        <w:spacing w:line="320" w:lineRule="exact"/>
         <w:ind w:left="0"/>
         <w:jc w:val="both"/>
         <w:rPr>
@@ -3794,13 +3863,13 @@
           <w:sz w:val="24"/>
           <w:szCs w:val="24"/>
         </w:rPr>
-        <w:t>• реализиране на преходи между състояния;</w:t>
+        <w:t>• създаване на структура за представяне на автомат;</w:t>
       </w:r>
     </w:p>
     <w:p>
       <w:pPr>
         <w:pStyle w:val="ListParagraph"/>
-        <w:spacing w:line="360" w:lineRule="auto"/>
+        <w:spacing w:line="320" w:lineRule="exact"/>
         <w:ind w:left="0"/>
         <w:jc w:val="both"/>
         <w:rPr>
@@ -3815,14 +3884,13 @@
           <w:sz w:val="24"/>
           <w:szCs w:val="24"/>
         </w:rPr>
-        <w:lastRenderedPageBreak/>
-        <w:t>• реализиране на операции върху автомати;</w:t>
+        <w:t>• реализиране на преходи между състояния;</w:t>
       </w:r>
     </w:p>
     <w:p>
       <w:pPr>
         <w:pStyle w:val="ListParagraph"/>
-        <w:spacing w:line="360" w:lineRule="auto"/>
+        <w:spacing w:line="320" w:lineRule="exact"/>
         <w:ind w:left="0"/>
         <w:jc w:val="both"/>
         <w:rPr>
@@ -3837,13 +3905,13 @@
           <w:sz w:val="24"/>
           <w:szCs w:val="24"/>
         </w:rPr>
-        <w:t>• реализиране на разпознаване на думи;</w:t>
+        <w:t>• реализиране на операции върху автомати;</w:t>
       </w:r>
     </w:p>
     <w:p>
       <w:pPr>
         <w:pStyle w:val="ListParagraph"/>
-        <w:spacing w:line="360" w:lineRule="auto"/>
+        <w:spacing w:line="320" w:lineRule="exact"/>
         <w:ind w:left="0"/>
         <w:jc w:val="both"/>
         <w:rPr>
@@ -3858,13 +3926,13 @@
           <w:sz w:val="24"/>
           <w:szCs w:val="24"/>
         </w:rPr>
-        <w:t>• реализиране на проверка за детерминираност;</w:t>
+        <w:t>• реализиране на разпознаване на думи;</w:t>
       </w:r>
     </w:p>
     <w:p>
       <w:pPr>
         <w:pStyle w:val="ListParagraph"/>
-        <w:spacing w:line="360" w:lineRule="auto"/>
+        <w:spacing w:line="320" w:lineRule="exact"/>
         <w:ind w:left="0"/>
         <w:jc w:val="both"/>
         <w:rPr>
@@ -3879,13 +3947,13 @@
           <w:sz w:val="24"/>
           <w:szCs w:val="24"/>
         </w:rPr>
-        <w:t>• реализиране на операция за детерминиране;</w:t>
+        <w:t>• реализиране на проверка за детерминираност;</w:t>
       </w:r>
     </w:p>
     <w:p>
       <w:pPr>
         <w:pStyle w:val="ListParagraph"/>
-        <w:spacing w:line="360" w:lineRule="auto"/>
+        <w:spacing w:line="320" w:lineRule="exact"/>
         <w:ind w:left="0"/>
         <w:jc w:val="both"/>
         <w:rPr>
@@ -3900,13 +3968,13 @@
           <w:sz w:val="24"/>
           <w:szCs w:val="24"/>
         </w:rPr>
-        <w:t>• реализиране на проверка дали езикът е краен;</w:t>
+        <w:t>• реализиране на операция за детерминиране;</w:t>
       </w:r>
     </w:p>
     <w:p>
       <w:pPr>
         <w:pStyle w:val="ListParagraph"/>
-        <w:spacing w:line="360" w:lineRule="auto"/>
+        <w:spacing w:line="320" w:lineRule="exact"/>
         <w:ind w:left="0"/>
         <w:jc w:val="both"/>
         <w:rPr>
@@ -3921,13 +3989,13 @@
           <w:sz w:val="24"/>
           <w:szCs w:val="24"/>
         </w:rPr>
-        <w:t>• реализиране на работа с файлове;</w:t>
+        <w:t>• реализиране на проверка дали езикът е краен;</w:t>
       </w:r>
     </w:p>
     <w:p>
       <w:pPr>
         <w:pStyle w:val="ListParagraph"/>
-        <w:spacing w:line="360" w:lineRule="auto"/>
+        <w:spacing w:line="320" w:lineRule="exact"/>
         <w:ind w:left="0"/>
         <w:jc w:val="both"/>
         <w:rPr>
@@ -3942,42 +4010,43 @@
           <w:sz w:val="24"/>
           <w:szCs w:val="24"/>
         </w:rPr>
+        <w:t>• реализиране на работа с файлове;</w:t>
+      </w:r>
+    </w:p>
+    <w:p>
+      <w:pPr>
+        <w:pStyle w:val="ListParagraph"/>
+        <w:spacing w:line="320" w:lineRule="exact"/>
+        <w:ind w:left="0"/>
+        <w:jc w:val="both"/>
+        <w:rPr>
+          <w:rFonts w:ascii="Times New Roman" w:hAnsi="Times New Roman" w:cs="Times New Roman"/>
+          <w:sz w:val="24"/>
+          <w:szCs w:val="24"/>
+        </w:rPr>
+      </w:pPr>
+      <w:r>
+        <w:rPr>
+          <w:rFonts w:ascii="Times New Roman" w:hAnsi="Times New Roman" w:cs="Times New Roman"/>
+          <w:sz w:val="24"/>
+          <w:szCs w:val="24"/>
+        </w:rPr>
         <w:t>• реализиране на команден интерфейс за потребителя.</w:t>
       </w:r>
-    </w:p>
-    <w:p>
-      <w:pPr>
-        <w:pStyle w:val="ListParagraph"/>
-        <w:jc w:val="both"/>
-        <w:rPr>
-          <w:rFonts w:ascii="Times New Roman" w:hAnsi="Times New Roman" w:cs="Times New Roman"/>
-          <w:sz w:val="36"/>
-          <w:szCs w:val="24"/>
-        </w:rPr>
-      </w:pPr>
-    </w:p>
-    <w:p>
-      <w:pPr>
+      <w:r>
         <w:rPr>
           <w:rFonts w:ascii="Times New Roman" w:hAnsi="Times New Roman" w:cs="Times New Roman"/>
           <w:b/>
           <w:sz w:val="44"/>
           <w:szCs w:val="24"/>
         </w:rPr>
-      </w:pPr>
-      <w:r>
-        <w:rPr>
-          <w:rFonts w:ascii="Times New Roman" w:hAnsi="Times New Roman" w:cs="Times New Roman"/>
-          <w:b/>
-          <w:sz w:val="44"/>
-          <w:szCs w:val="24"/>
-        </w:rPr>
         <w:br w:type="page"/>
       </w:r>
     </w:p>
     <w:p>
       <w:pPr>
         <w:pStyle w:val="Heading1"/>
+        <w:spacing w:line="360" w:lineRule="auto"/>
       </w:pPr>
       <w:bookmarkStart w:id="4" w:name="_Toc229947538"/>
       <w:r>
@@ -3989,12 +4058,759 @@
     <w:p>
       <w:pPr>
         <w:pStyle w:val="Heading2"/>
+        <w:spacing w:line="320" w:lineRule="exact"/>
       </w:pPr>
       <w:bookmarkStart w:id="5" w:name="_Toc229947539"/>
       <w:r>
         <w:t>2.1 Основни концепции и алгоритми</w:t>
       </w:r>
       <w:bookmarkEnd w:id="5"/>
+    </w:p>
+    <w:p>
+      <w:pPr>
+        <w:spacing w:after="120" w:line="320" w:lineRule="exact"/>
+        <w:jc w:val="both"/>
+        <w:rPr>
+          <w:rFonts w:ascii="Times New Roman" w:hAnsi="Times New Roman" w:cs="Times New Roman"/>
+          <w:sz w:val="24"/>
+          <w:szCs w:val="24"/>
+        </w:rPr>
+      </w:pPr>
+      <w:r>
+        <w:rPr>
+          <w:rFonts w:ascii="Times New Roman" w:hAnsi="Times New Roman" w:cs="Times New Roman"/>
+          <w:sz w:val="24"/>
+          <w:szCs w:val="24"/>
+        </w:rPr>
+        <w:t>Крайните автомати представляват математически модели, използвани за разпознаване на езици и обработка на последователности от символи.</w:t>
+      </w:r>
+      <w:r>
+        <w:t xml:space="preserve"> </w:t>
+      </w:r>
+      <w:r>
+        <w:rPr>
+          <w:rFonts w:ascii="Times New Roman" w:hAnsi="Times New Roman" w:cs="Times New Roman"/>
+          <w:sz w:val="24"/>
+          <w:szCs w:val="24"/>
+        </w:rPr>
+        <w:t>[2]</w:t>
+      </w:r>
+    </w:p>
+    <w:p>
+      <w:pPr>
+        <w:spacing w:after="120" w:line="320" w:lineRule="exact"/>
+        <w:jc w:val="both"/>
+        <w:rPr>
+          <w:rFonts w:ascii="Times New Roman" w:hAnsi="Times New Roman" w:cs="Times New Roman"/>
+          <w:sz w:val="24"/>
+          <w:szCs w:val="24"/>
+        </w:rPr>
+      </w:pPr>
+    </w:p>
+    <w:p>
+      <w:pPr>
+        <w:spacing w:after="120" w:line="320" w:lineRule="exact"/>
+        <w:jc w:val="both"/>
+        <w:rPr>
+          <w:rFonts w:ascii="Times New Roman" w:hAnsi="Times New Roman" w:cs="Times New Roman"/>
+          <w:sz w:val="24"/>
+          <w:szCs w:val="24"/>
+        </w:rPr>
+      </w:pPr>
+      <w:r>
+        <w:rPr>
+          <w:rFonts w:ascii="Times New Roman" w:hAnsi="Times New Roman" w:cs="Times New Roman"/>
+          <w:sz w:val="24"/>
+          <w:szCs w:val="24"/>
+        </w:rPr>
+        <w:t>Недетерминираният краен автомат (НКА) позволява съществуването на повече от един преход за даден символ, както и ε-преходи, при които автоматът може да преминава между състояния без прочитане на символ.</w:t>
+      </w:r>
+    </w:p>
+    <w:p>
+      <w:pPr>
+        <w:spacing w:after="120" w:line="320" w:lineRule="exact"/>
+        <w:jc w:val="both"/>
+        <w:rPr>
+          <w:rFonts w:ascii="Times New Roman" w:hAnsi="Times New Roman" w:cs="Times New Roman"/>
+          <w:sz w:val="24"/>
+          <w:szCs w:val="24"/>
+        </w:rPr>
+      </w:pPr>
+    </w:p>
+    <w:p>
+      <w:pPr>
+        <w:spacing w:after="120" w:line="320" w:lineRule="exact"/>
+        <w:jc w:val="both"/>
+        <w:rPr>
+          <w:rFonts w:ascii="Times New Roman" w:hAnsi="Times New Roman" w:cs="Times New Roman"/>
+          <w:sz w:val="24"/>
+          <w:szCs w:val="24"/>
+        </w:rPr>
+      </w:pPr>
+      <w:r>
+        <w:rPr>
+          <w:rFonts w:ascii="Times New Roman" w:hAnsi="Times New Roman" w:cs="Times New Roman"/>
+          <w:sz w:val="24"/>
+          <w:szCs w:val="24"/>
+        </w:rPr>
+        <w:t xml:space="preserve">В проекта е реализирана поддръжка на ε-преходи чрез алгоритъм за </w:t>
+      </w:r>
+      <w:r>
+        <w:rPr>
+          <w:rFonts w:ascii="Times New Roman" w:hAnsi="Times New Roman" w:cs="Times New Roman"/>
+          <w:i/>
+          <w:sz w:val="24"/>
+          <w:szCs w:val="24"/>
+        </w:rPr>
+        <w:t>epsilon closure</w:t>
+      </w:r>
+      <w:r>
+        <w:rPr>
+          <w:rFonts w:ascii="Times New Roman" w:hAnsi="Times New Roman" w:cs="Times New Roman"/>
+          <w:sz w:val="24"/>
+          <w:szCs w:val="24"/>
+        </w:rPr>
+        <w:t>, който намира всички достижими състояния чрез ε-преходи.</w:t>
+      </w:r>
+      <w:r>
+        <w:t xml:space="preserve"> </w:t>
+      </w:r>
+      <w:r>
+        <w:rPr>
+          <w:rFonts w:ascii="Times New Roman" w:hAnsi="Times New Roman" w:cs="Times New Roman"/>
+          <w:sz w:val="24"/>
+          <w:szCs w:val="24"/>
+        </w:rPr>
+        <w:t>[3]</w:t>
+      </w:r>
+    </w:p>
+    <w:p>
+      <w:pPr>
+        <w:spacing w:after="120" w:line="320" w:lineRule="exact"/>
+        <w:jc w:val="both"/>
+        <w:rPr>
+          <w:rFonts w:ascii="Times New Roman" w:hAnsi="Times New Roman" w:cs="Times New Roman"/>
+          <w:sz w:val="24"/>
+          <w:szCs w:val="24"/>
+        </w:rPr>
+      </w:pPr>
+    </w:p>
+    <w:p>
+      <w:pPr>
+        <w:spacing w:after="120" w:line="320" w:lineRule="exact"/>
+        <w:jc w:val="both"/>
+        <w:rPr>
+          <w:rFonts w:ascii="Times New Roman" w:hAnsi="Times New Roman" w:cs="Times New Roman"/>
+          <w:sz w:val="24"/>
+          <w:szCs w:val="24"/>
+        </w:rPr>
+      </w:pPr>
+      <w:r>
+        <w:rPr>
+          <w:rFonts w:ascii="Times New Roman" w:hAnsi="Times New Roman" w:cs="Times New Roman"/>
+          <w:sz w:val="24"/>
+          <w:szCs w:val="24"/>
+        </w:rPr>
+        <w:t>При недетерминираните автомати е възможно автоматът да се намира в повече от едно състояние едновременно. Поради тази причина при разпознаване на думи се използва множество от текущи състояния вместо едно конкретно състояние.</w:t>
+      </w:r>
+    </w:p>
+    <w:p>
+      <w:pPr>
+        <w:spacing w:after="120" w:line="320" w:lineRule="exact"/>
+        <w:jc w:val="both"/>
+        <w:rPr>
+          <w:rFonts w:ascii="Times New Roman" w:hAnsi="Times New Roman" w:cs="Times New Roman"/>
+          <w:sz w:val="24"/>
+          <w:szCs w:val="24"/>
+        </w:rPr>
+      </w:pPr>
+    </w:p>
+    <w:p>
+      <w:pPr>
+        <w:spacing w:after="120" w:line="320" w:lineRule="exact"/>
+        <w:jc w:val="both"/>
+        <w:rPr>
+          <w:rFonts w:ascii="Times New Roman" w:hAnsi="Times New Roman" w:cs="Times New Roman"/>
+          <w:sz w:val="24"/>
+          <w:szCs w:val="24"/>
+        </w:rPr>
+      </w:pPr>
+      <w:r>
+        <w:rPr>
+          <w:rFonts w:ascii="Times New Roman" w:hAnsi="Times New Roman" w:cs="Times New Roman"/>
+          <w:sz w:val="24"/>
+          <w:szCs w:val="24"/>
+        </w:rPr>
+        <w:t>Това позволява едновременно проследяване на всички възможни преходи в автомата.</w:t>
+      </w:r>
+    </w:p>
+    <w:p>
+      <w:pPr>
+        <w:spacing w:after="120" w:line="320" w:lineRule="exact"/>
+        <w:jc w:val="both"/>
+        <w:rPr>
+          <w:rFonts w:ascii="Times New Roman" w:hAnsi="Times New Roman" w:cs="Times New Roman"/>
+          <w:sz w:val="24"/>
+          <w:szCs w:val="24"/>
+        </w:rPr>
+      </w:pPr>
+    </w:p>
+    <w:p>
+      <w:pPr>
+        <w:spacing w:after="120" w:line="320" w:lineRule="exact"/>
+        <w:jc w:val="both"/>
+        <w:rPr>
+          <w:rFonts w:ascii="Times New Roman" w:hAnsi="Times New Roman" w:cs="Times New Roman"/>
+          <w:sz w:val="24"/>
+          <w:szCs w:val="24"/>
+        </w:rPr>
+      </w:pPr>
+      <w:r>
+        <w:rPr>
+          <w:rFonts w:ascii="Times New Roman" w:hAnsi="Times New Roman" w:cs="Times New Roman"/>
+          <w:sz w:val="24"/>
+          <w:szCs w:val="24"/>
+        </w:rPr>
+        <w:t>За разпознаване на думи е използван алгоритъм, който поддържа множество текущи състояния, което позволява работа с недетерминирани автомати.</w:t>
+      </w:r>
+    </w:p>
+    <w:p>
+      <w:pPr>
+        <w:spacing w:after="120" w:line="320" w:lineRule="exact"/>
+        <w:jc w:val="both"/>
+        <w:rPr>
+          <w:rFonts w:ascii="Times New Roman" w:hAnsi="Times New Roman" w:cs="Times New Roman"/>
+          <w:sz w:val="24"/>
+          <w:szCs w:val="24"/>
+        </w:rPr>
+      </w:pPr>
+    </w:p>
+    <w:p>
+      <w:pPr>
+        <w:spacing w:after="120" w:line="320" w:lineRule="exact"/>
+        <w:jc w:val="both"/>
+        <w:rPr>
+          <w:rFonts w:ascii="Times New Roman" w:hAnsi="Times New Roman" w:cs="Times New Roman"/>
+          <w:sz w:val="24"/>
+          <w:szCs w:val="24"/>
+        </w:rPr>
+      </w:pPr>
+      <w:r>
+        <w:rPr>
+          <w:rFonts w:ascii="Times New Roman" w:hAnsi="Times New Roman" w:cs="Times New Roman"/>
+          <w:sz w:val="24"/>
+          <w:szCs w:val="24"/>
+        </w:rPr>
+        <w:t>Реализирана е и операция за детерминиране на автомат, чрез която недетерминиран автомат може да бъде преобразуван в детерминиран.</w:t>
+      </w:r>
+      <w:r>
+        <w:t xml:space="preserve"> </w:t>
+      </w:r>
+      <w:r>
+        <w:rPr>
+          <w:rFonts w:ascii="Times New Roman" w:hAnsi="Times New Roman" w:cs="Times New Roman"/>
+          <w:sz w:val="24"/>
+          <w:szCs w:val="24"/>
+        </w:rPr>
+        <w:t>[4]</w:t>
+      </w:r>
+    </w:p>
+    <w:p>
+      <w:pPr>
+        <w:spacing w:after="120" w:line="320" w:lineRule="exact"/>
+        <w:jc w:val="both"/>
+        <w:rPr>
+          <w:rFonts w:ascii="Times New Roman" w:hAnsi="Times New Roman" w:cs="Times New Roman"/>
+          <w:sz w:val="24"/>
+          <w:szCs w:val="24"/>
+        </w:rPr>
+      </w:pPr>
+    </w:p>
+    <w:p>
+      <w:pPr>
+        <w:spacing w:after="120" w:line="320" w:lineRule="exact"/>
+        <w:jc w:val="both"/>
+        <w:rPr>
+          <w:rFonts w:ascii="Times New Roman" w:hAnsi="Times New Roman" w:cs="Times New Roman"/>
+          <w:sz w:val="24"/>
+          <w:szCs w:val="24"/>
+        </w:rPr>
+      </w:pPr>
+      <w:r>
+        <w:rPr>
+          <w:rFonts w:ascii="Times New Roman" w:hAnsi="Times New Roman" w:cs="Times New Roman"/>
+          <w:sz w:val="24"/>
+          <w:szCs w:val="24"/>
+        </w:rPr>
+        <w:t>Допълнително е реализирана проверка дали езикът на автомат е краен чрез търсене на цикли в графа на преходите.</w:t>
+      </w:r>
+    </w:p>
+    <w:p>
+      <w:pPr>
+        <w:pStyle w:val="Heading2"/>
+        <w:spacing w:line="320" w:lineRule="exact"/>
+      </w:pPr>
+      <w:bookmarkStart w:id="6" w:name="_Toc229947540"/>
+      <w:r>
+        <w:t>2.2 Подход, технологии и средства за разработка</w:t>
+      </w:r>
+      <w:bookmarkEnd w:id="6"/>
+    </w:p>
+    <w:p>
+      <w:pPr>
+        <w:spacing w:after="120" w:line="320" w:lineRule="exact"/>
+        <w:jc w:val="both"/>
+        <w:rPr>
+          <w:rFonts w:ascii="Times New Roman" w:hAnsi="Times New Roman" w:cs="Times New Roman"/>
+          <w:sz w:val="24"/>
+          <w:szCs w:val="24"/>
+        </w:rPr>
+      </w:pPr>
+      <w:r>
+        <w:rPr>
+          <w:rFonts w:ascii="Times New Roman" w:hAnsi="Times New Roman" w:cs="Times New Roman"/>
+          <w:sz w:val="24"/>
+          <w:szCs w:val="24"/>
+        </w:rPr>
+        <w:t>Проектът е реализиран на езика Java чрез принципите на обектно-ориентираното програмиране.</w:t>
+      </w:r>
+      <w:r>
+        <w:t xml:space="preserve"> </w:t>
+      </w:r>
+      <w:r>
+        <w:rPr>
+          <w:rFonts w:ascii="Times New Roman" w:hAnsi="Times New Roman" w:cs="Times New Roman"/>
+          <w:sz w:val="24"/>
+          <w:szCs w:val="24"/>
+        </w:rPr>
+        <w:t>[1]</w:t>
+      </w:r>
+    </w:p>
+    <w:p>
+      <w:pPr>
+        <w:spacing w:after="120" w:line="320" w:lineRule="exact"/>
+        <w:jc w:val="both"/>
+        <w:rPr>
+          <w:rFonts w:ascii="Times New Roman" w:hAnsi="Times New Roman" w:cs="Times New Roman"/>
+          <w:sz w:val="24"/>
+          <w:szCs w:val="24"/>
+        </w:rPr>
+      </w:pPr>
+    </w:p>
+    <w:p>
+      <w:pPr>
+        <w:spacing w:after="120" w:line="320" w:lineRule="exact"/>
+        <w:jc w:val="both"/>
+        <w:rPr>
+          <w:rFonts w:ascii="Times New Roman" w:hAnsi="Times New Roman" w:cs="Times New Roman"/>
+          <w:sz w:val="24"/>
+          <w:szCs w:val="24"/>
+        </w:rPr>
+      </w:pPr>
+      <w:r>
+        <w:rPr>
+          <w:rFonts w:ascii="Times New Roman" w:hAnsi="Times New Roman" w:cs="Times New Roman"/>
+          <w:sz w:val="24"/>
+          <w:szCs w:val="24"/>
+        </w:rPr>
+        <w:lastRenderedPageBreak/>
+        <w:t xml:space="preserve">Използвани са класове за представяне на автомати, преходи, обработка на команди и работа с файлове. </w:t>
+      </w:r>
+      <w:r>
+        <w:rPr>
+          <w:rFonts w:ascii="Times New Roman" w:hAnsi="Times New Roman" w:cs="Times New Roman"/>
+          <w:sz w:val="24"/>
+          <w:szCs w:val="24"/>
+        </w:rPr>
+        <w:t>За съхраняване и обработка на данни са използвани структури от Java Collections Framework, включително ArrayList и Set.</w:t>
+      </w:r>
+    </w:p>
+    <w:p>
+      <w:pPr>
+        <w:spacing w:after="120" w:line="320" w:lineRule="exact"/>
+        <w:jc w:val="both"/>
+        <w:rPr>
+          <w:rFonts w:ascii="Times New Roman" w:hAnsi="Times New Roman" w:cs="Times New Roman"/>
+          <w:sz w:val="24"/>
+          <w:szCs w:val="24"/>
+        </w:rPr>
+      </w:pPr>
+    </w:p>
+    <w:p>
+      <w:pPr>
+        <w:spacing w:after="120" w:line="320" w:lineRule="exact"/>
+        <w:jc w:val="both"/>
+        <w:rPr>
+          <w:rFonts w:ascii="Times New Roman" w:hAnsi="Times New Roman" w:cs="Times New Roman"/>
+          <w:sz w:val="24"/>
+          <w:szCs w:val="24"/>
+        </w:rPr>
+      </w:pPr>
+      <w:r>
+        <w:rPr>
+          <w:rFonts w:ascii="Times New Roman" w:hAnsi="Times New Roman" w:cs="Times New Roman"/>
+          <w:sz w:val="24"/>
+          <w:szCs w:val="24"/>
+        </w:rPr>
+        <w:t>За разработката на проекта е използвана средата IntelliJ IDEA, а за управление на версиите е използвана платформата GitHub.</w:t>
+      </w:r>
+    </w:p>
+    <w:p>
+      <w:pPr>
+        <w:spacing w:after="120" w:line="320" w:lineRule="exact"/>
+        <w:jc w:val="both"/>
+        <w:rPr>
+          <w:rFonts w:ascii="Times New Roman" w:hAnsi="Times New Roman" w:cs="Times New Roman"/>
+          <w:sz w:val="24"/>
+          <w:szCs w:val="24"/>
+        </w:rPr>
+      </w:pPr>
+    </w:p>
+    <w:p>
+      <w:pPr>
+        <w:spacing w:after="120" w:line="320" w:lineRule="exact"/>
+        <w:jc w:val="both"/>
+        <w:rPr>
+          <w:rFonts w:ascii="Times New Roman" w:hAnsi="Times New Roman" w:cs="Times New Roman"/>
+          <w:sz w:val="24"/>
+          <w:szCs w:val="24"/>
+        </w:rPr>
+      </w:pPr>
+      <w:r>
+        <w:rPr>
+          <w:rFonts w:ascii="Times New Roman" w:hAnsi="Times New Roman" w:cs="Times New Roman"/>
+          <w:sz w:val="24"/>
+          <w:szCs w:val="24"/>
+        </w:rPr>
+        <w:t>Приложението използва команден интерфейс, чрез който потребителят въвежда команди за работа с автоматите.</w:t>
+      </w:r>
+    </w:p>
+    <w:p>
+      <w:pPr>
+        <w:spacing w:after="120" w:line="320" w:lineRule="exact"/>
+        <w:jc w:val="both"/>
+        <w:rPr>
+          <w:rFonts w:ascii="Times New Roman" w:hAnsi="Times New Roman" w:cs="Times New Roman"/>
+          <w:sz w:val="24"/>
+          <w:szCs w:val="24"/>
+        </w:rPr>
+      </w:pPr>
+    </w:p>
+    <w:p>
+      <w:pPr>
+        <w:spacing w:after="120" w:line="320" w:lineRule="exact"/>
+        <w:jc w:val="both"/>
+        <w:rPr>
+          <w:rFonts w:ascii="Times New Roman" w:hAnsi="Times New Roman" w:cs="Times New Roman"/>
+          <w:sz w:val="24"/>
+          <w:szCs w:val="24"/>
+        </w:rPr>
+      </w:pPr>
+      <w:r>
+        <w:rPr>
+          <w:rFonts w:ascii="Times New Roman" w:hAnsi="Times New Roman" w:cs="Times New Roman"/>
+          <w:sz w:val="24"/>
+          <w:szCs w:val="24"/>
+        </w:rPr>
+        <w:t>Командният интерфейс позволява изпълнение на операции върху автоматите чрез текстови команди, въведени от потребителя.</w:t>
+      </w:r>
+    </w:p>
+    <w:p>
+      <w:pPr>
+        <w:rPr>
+          <w:rFonts w:ascii="Times New Roman" w:hAnsi="Times New Roman" w:cs="Times New Roman"/>
+          <w:sz w:val="24"/>
+          <w:szCs w:val="24"/>
+        </w:rPr>
+      </w:pPr>
+      <w:r>
+        <w:rPr>
+          <w:rFonts w:ascii="Times New Roman" w:hAnsi="Times New Roman" w:cs="Times New Roman"/>
+          <w:sz w:val="24"/>
+          <w:szCs w:val="24"/>
+        </w:rPr>
+        <w:br w:type="page"/>
+      </w:r>
+    </w:p>
+    <w:p>
+      <w:pPr>
+        <w:pStyle w:val="Heading1"/>
+        <w:spacing w:line="360" w:lineRule="auto"/>
+        <w:rPr>
+          <w:sz w:val="24"/>
+        </w:rPr>
+      </w:pPr>
+      <w:bookmarkStart w:id="7" w:name="_Toc229947541"/>
+      <w:r>
+        <w:lastRenderedPageBreak/>
+        <w:t>Глава 3. Проектиране</w:t>
+      </w:r>
+      <w:bookmarkEnd w:id="7"/>
+    </w:p>
+    <w:p>
+      <w:pPr>
+        <w:pStyle w:val="Heading2"/>
+        <w:spacing w:line="320" w:lineRule="exact"/>
+      </w:pPr>
+      <w:bookmarkStart w:id="8" w:name="_Toc229947542"/>
+      <w:r>
+        <w:t>3.1 Обща структура на проекта</w:t>
+      </w:r>
+      <w:bookmarkEnd w:id="8"/>
+    </w:p>
+    <w:p>
+      <w:pPr>
+        <w:spacing w:after="120" w:line="320" w:lineRule="exact"/>
+        <w:jc w:val="both"/>
+        <w:rPr>
+          <w:rFonts w:ascii="Times New Roman" w:hAnsi="Times New Roman" w:cs="Times New Roman"/>
+          <w:sz w:val="24"/>
+          <w:szCs w:val="24"/>
+        </w:rPr>
+      </w:pPr>
+      <w:r>
+        <w:rPr>
+          <w:rFonts w:ascii="Times New Roman" w:hAnsi="Times New Roman" w:cs="Times New Roman"/>
+          <w:sz w:val="24"/>
+          <w:szCs w:val="24"/>
+        </w:rPr>
+        <w:t>Проектът е разделен на отделни пакети и класове, които реализират различните функционалности на системата.</w:t>
+      </w:r>
+    </w:p>
+    <w:p>
+      <w:pPr>
+        <w:spacing w:after="120" w:line="320" w:lineRule="exact"/>
+        <w:jc w:val="both"/>
+        <w:rPr>
+          <w:rFonts w:ascii="Times New Roman" w:hAnsi="Times New Roman" w:cs="Times New Roman"/>
+          <w:sz w:val="24"/>
+          <w:szCs w:val="24"/>
+        </w:rPr>
+      </w:pPr>
+    </w:p>
+    <w:p>
+      <w:pPr>
+        <w:spacing w:after="120" w:line="320" w:lineRule="exact"/>
+        <w:jc w:val="both"/>
+        <w:rPr>
+          <w:rFonts w:ascii="Times New Roman" w:hAnsi="Times New Roman" w:cs="Times New Roman"/>
+          <w:sz w:val="24"/>
+          <w:szCs w:val="24"/>
+        </w:rPr>
+      </w:pPr>
+      <w:r>
+        <w:rPr>
+          <w:rFonts w:ascii="Times New Roman" w:hAnsi="Times New Roman" w:cs="Times New Roman"/>
+          <w:sz w:val="24"/>
+          <w:szCs w:val="24"/>
+        </w:rPr>
+        <w:t>Основните класове в проекта са:</w:t>
+      </w:r>
+    </w:p>
+    <w:p>
+      <w:pPr>
+        <w:spacing w:after="120" w:line="320" w:lineRule="exact"/>
+        <w:jc w:val="both"/>
+        <w:rPr>
+          <w:rFonts w:ascii="Times New Roman" w:hAnsi="Times New Roman" w:cs="Times New Roman"/>
+          <w:sz w:val="24"/>
+          <w:szCs w:val="24"/>
+        </w:rPr>
+      </w:pPr>
+    </w:p>
+    <w:p>
+      <w:pPr>
+        <w:spacing w:after="120" w:line="320" w:lineRule="exact"/>
+        <w:jc w:val="both"/>
+        <w:rPr>
+          <w:rFonts w:ascii="Times New Roman" w:hAnsi="Times New Roman" w:cs="Times New Roman"/>
+          <w:sz w:val="24"/>
+          <w:szCs w:val="24"/>
+        </w:rPr>
+      </w:pPr>
+      <w:r>
+        <w:rPr>
+          <w:rFonts w:ascii="Times New Roman" w:hAnsi="Times New Roman" w:cs="Times New Roman"/>
+          <w:sz w:val="24"/>
+          <w:szCs w:val="24"/>
+        </w:rPr>
+        <w:t>• Automaton – представя краен автомат;</w:t>
+      </w:r>
+    </w:p>
+    <w:p>
+      <w:pPr>
+        <w:spacing w:after="120" w:line="320" w:lineRule="exact"/>
+        <w:jc w:val="both"/>
+        <w:rPr>
+          <w:rFonts w:ascii="Times New Roman" w:hAnsi="Times New Roman" w:cs="Times New Roman"/>
+          <w:sz w:val="24"/>
+          <w:szCs w:val="24"/>
+        </w:rPr>
+      </w:pPr>
+      <w:r>
+        <w:rPr>
+          <w:rFonts w:ascii="Times New Roman" w:hAnsi="Times New Roman" w:cs="Times New Roman"/>
+          <w:sz w:val="24"/>
+          <w:szCs w:val="24"/>
+        </w:rPr>
+        <w:t>• Transition – представя преход между две състояния;</w:t>
+      </w:r>
+    </w:p>
+    <w:p>
+      <w:pPr>
+        <w:spacing w:after="120" w:line="320" w:lineRule="exact"/>
+        <w:jc w:val="both"/>
+        <w:rPr>
+          <w:rFonts w:ascii="Times New Roman" w:hAnsi="Times New Roman" w:cs="Times New Roman"/>
+          <w:sz w:val="24"/>
+          <w:szCs w:val="24"/>
+        </w:rPr>
+      </w:pPr>
+      <w:r>
+        <w:rPr>
+          <w:rFonts w:ascii="Times New Roman" w:hAnsi="Times New Roman" w:cs="Times New Roman"/>
+          <w:sz w:val="24"/>
+          <w:szCs w:val="24"/>
+        </w:rPr>
+        <w:t>• AutomatonManager – управлява всички заредени автомати;</w:t>
+      </w:r>
+    </w:p>
+    <w:p>
+      <w:pPr>
+        <w:spacing w:after="120" w:line="320" w:lineRule="exact"/>
+        <w:jc w:val="both"/>
+        <w:rPr>
+          <w:rFonts w:ascii="Times New Roman" w:hAnsi="Times New Roman" w:cs="Times New Roman"/>
+          <w:sz w:val="24"/>
+          <w:szCs w:val="24"/>
+        </w:rPr>
+      </w:pPr>
+      <w:r>
+        <w:rPr>
+          <w:rFonts w:ascii="Times New Roman" w:hAnsi="Times New Roman" w:cs="Times New Roman"/>
+          <w:sz w:val="24"/>
+          <w:szCs w:val="24"/>
+        </w:rPr>
+        <w:t>• FileManager – обработва файловите операции;</w:t>
+      </w:r>
+    </w:p>
+    <w:p>
+      <w:pPr>
+        <w:spacing w:after="120" w:line="320" w:lineRule="exact"/>
+        <w:jc w:val="both"/>
+        <w:rPr>
+          <w:rFonts w:ascii="Times New Roman" w:hAnsi="Times New Roman" w:cs="Times New Roman"/>
+          <w:sz w:val="24"/>
+          <w:szCs w:val="24"/>
+        </w:rPr>
+      </w:pPr>
+      <w:r>
+        <w:rPr>
+          <w:rFonts w:ascii="Times New Roman" w:hAnsi="Times New Roman" w:cs="Times New Roman"/>
+          <w:sz w:val="24"/>
+          <w:szCs w:val="24"/>
+        </w:rPr>
+        <w:t>• CommandProcessor – обработва командите от потребителя;</w:t>
+      </w:r>
+    </w:p>
+    <w:p>
+      <w:pPr>
+        <w:spacing w:after="120" w:line="320" w:lineRule="exact"/>
+        <w:jc w:val="both"/>
+        <w:rPr>
+          <w:rFonts w:ascii="Times New Roman" w:hAnsi="Times New Roman" w:cs="Times New Roman"/>
+          <w:sz w:val="24"/>
+          <w:szCs w:val="24"/>
+        </w:rPr>
+      </w:pPr>
+      <w:r>
+        <w:rPr>
+          <w:rFonts w:ascii="Times New Roman" w:hAnsi="Times New Roman" w:cs="Times New Roman"/>
+          <w:sz w:val="24"/>
+          <w:szCs w:val="24"/>
+        </w:rPr>
+        <w:t>• Main – начална точка на приложението.</w:t>
+      </w:r>
+    </w:p>
+    <w:p>
+      <w:pPr>
+        <w:spacing w:after="120" w:line="320" w:lineRule="exact"/>
+        <w:jc w:val="both"/>
+        <w:rPr>
+          <w:rFonts w:ascii="Times New Roman" w:hAnsi="Times New Roman" w:cs="Times New Roman"/>
+          <w:sz w:val="24"/>
+          <w:szCs w:val="24"/>
+        </w:rPr>
+      </w:pPr>
+    </w:p>
+    <w:p>
+      <w:pPr>
+        <w:spacing w:after="120" w:line="320" w:lineRule="exact"/>
+        <w:jc w:val="both"/>
+        <w:rPr>
+          <w:rFonts w:ascii="Times New Roman" w:hAnsi="Times New Roman" w:cs="Times New Roman"/>
+          <w:sz w:val="24"/>
+          <w:szCs w:val="24"/>
+        </w:rPr>
+      </w:pPr>
+      <w:r>
+        <w:rPr>
+          <w:rFonts w:ascii="Times New Roman" w:hAnsi="Times New Roman" w:cs="Times New Roman"/>
+          <w:sz w:val="24"/>
+          <w:szCs w:val="24"/>
+        </w:rPr>
+        <w:t>Класовете в проекта комуникират помежду си чрез извикване на публични методи и обмен на обекти от тип Automaton и Transition.</w:t>
+      </w:r>
+    </w:p>
+    <w:p>
+      <w:pPr>
+        <w:spacing w:after="120" w:line="320" w:lineRule="exact"/>
+        <w:jc w:val="both"/>
+        <w:rPr>
+          <w:rFonts w:ascii="Times New Roman" w:hAnsi="Times New Roman" w:cs="Times New Roman"/>
+          <w:sz w:val="24"/>
+          <w:szCs w:val="24"/>
+        </w:rPr>
+      </w:pPr>
+      <w:r>
+        <w:rPr>
+          <w:rFonts w:ascii="Times New Roman" w:hAnsi="Times New Roman" w:cs="Times New Roman"/>
+          <w:sz w:val="24"/>
+          <w:szCs w:val="24"/>
+        </w:rPr>
+        <w:t>CommandProcessor изпраща командите към AutomatonManager, който извършва съответните операции върху автоматите.</w:t>
+      </w:r>
+    </w:p>
+    <w:p>
+      <w:pPr>
+        <w:spacing w:after="120" w:line="320" w:lineRule="exact"/>
+        <w:jc w:val="both"/>
+        <w:rPr>
+          <w:rFonts w:ascii="Times New Roman" w:hAnsi="Times New Roman" w:cs="Times New Roman"/>
+          <w:sz w:val="24"/>
+          <w:szCs w:val="24"/>
+        </w:rPr>
+      </w:pPr>
+    </w:p>
+    <w:p>
+      <w:pPr>
+        <w:spacing w:after="120" w:line="320" w:lineRule="exact"/>
+        <w:jc w:val="both"/>
+        <w:rPr>
+          <w:rFonts w:ascii="Times New Roman" w:hAnsi="Times New Roman" w:cs="Times New Roman"/>
+          <w:sz w:val="24"/>
+          <w:szCs w:val="24"/>
+          <w:lang w:val="en-US"/>
+        </w:rPr>
+      </w:pPr>
+      <w:r>
+        <w:rPr>
+          <w:rFonts w:ascii="Times New Roman" w:hAnsi="Times New Roman" w:cs="Times New Roman"/>
+          <w:sz w:val="24"/>
+          <w:szCs w:val="24"/>
+        </w:rPr>
+        <w:t>Структурата на проекта позволява отделяне на логиката за работа с автомати, обработката на команди и работата с файлове, което улеснява поддръжката и разширяването на приложението.</w:t>
+      </w:r>
     </w:p>
     <w:p>
       <w:pPr>
@@ -4006,18 +4822,21 @@
           <w:szCs w:val="24"/>
         </w:rPr>
       </w:pPr>
-      <w:r>
-        <w:rPr>
-          <w:rFonts w:ascii="Times New Roman" w:hAnsi="Times New Roman" w:cs="Times New Roman"/>
-          <w:sz w:val="24"/>
-          <w:szCs w:val="24"/>
-        </w:rPr>
-        <w:t>Крайните автомати представляват математически модели, използвани за разпознаване на езици и обработка на последователности от символи.</w:t>
-      </w:r>
-    </w:p>
-    <w:p>
-      <w:pPr>
-        <w:spacing w:after="120" w:line="360" w:lineRule="auto"/>
+    </w:p>
+    <w:p>
+      <w:pPr>
+        <w:pStyle w:val="Heading2"/>
+        <w:spacing w:line="320" w:lineRule="exact"/>
+      </w:pPr>
+      <w:bookmarkStart w:id="9" w:name="_Toc229947543"/>
+      <w:r>
+        <w:t>3.2 Диаграми и модели</w:t>
+      </w:r>
+      <w:bookmarkEnd w:id="9"/>
+    </w:p>
+    <w:p>
+      <w:pPr>
+        <w:spacing w:after="120" w:line="320" w:lineRule="exact"/>
         <w:jc w:val="both"/>
         <w:rPr>
           <w:rFonts w:ascii="Times New Roman" w:hAnsi="Times New Roman" w:cs="Times New Roman"/>
@@ -4025,10 +4844,18 @@
           <w:szCs w:val="24"/>
         </w:rPr>
       </w:pPr>
-    </w:p>
-    <w:p>
-      <w:pPr>
-        <w:spacing w:after="120" w:line="360" w:lineRule="auto"/>
+      <w:r>
+        <w:rPr>
+          <w:rFonts w:ascii="Times New Roman" w:hAnsi="Times New Roman" w:cs="Times New Roman"/>
+          <w:sz w:val="24"/>
+          <w:szCs w:val="24"/>
+        </w:rPr>
+        <w:t>За проектирането на системата са използвани диаграми, описващи структурата на класовете и логиката на основните алгоритми.</w:t>
+      </w:r>
+    </w:p>
+    <w:p>
+      <w:pPr>
+        <w:spacing w:after="120" w:line="320" w:lineRule="exact"/>
         <w:jc w:val="both"/>
         <w:rPr>
           <w:rFonts w:ascii="Times New Roman" w:hAnsi="Times New Roman" w:cs="Times New Roman"/>
@@ -4036,18 +4863,10 @@
           <w:szCs w:val="24"/>
         </w:rPr>
       </w:pPr>
-      <w:r>
-        <w:rPr>
-          <w:rFonts w:ascii="Times New Roman" w:hAnsi="Times New Roman" w:cs="Times New Roman"/>
-          <w:sz w:val="24"/>
-          <w:szCs w:val="24"/>
-        </w:rPr>
-        <w:t>Недетерминираният краен автомат (НКА) позволява съществуването на повече от един преход за даден символ, както и ε-преходи, при които автоматът може да преминава между състояния без прочитане на символ.</w:t>
-      </w:r>
-    </w:p>
-    <w:p>
-      <w:pPr>
-        <w:spacing w:after="120" w:line="360" w:lineRule="auto"/>
+    </w:p>
+    <w:p>
+      <w:pPr>
+        <w:spacing w:after="120" w:line="320" w:lineRule="exact"/>
         <w:jc w:val="both"/>
         <w:rPr>
           <w:rFonts w:ascii="Times New Roman" w:hAnsi="Times New Roman" w:cs="Times New Roman"/>
@@ -4055,10 +4874,18 @@
           <w:szCs w:val="24"/>
         </w:rPr>
       </w:pPr>
-    </w:p>
-    <w:p>
-      <w:pPr>
-        <w:spacing w:after="120" w:line="360" w:lineRule="auto"/>
+      <w:r>
+        <w:rPr>
+          <w:rFonts w:ascii="Times New Roman" w:hAnsi="Times New Roman" w:cs="Times New Roman"/>
+          <w:sz w:val="24"/>
+          <w:szCs w:val="24"/>
+        </w:rPr>
+        <w:t>Използвани са диаграми за:</w:t>
+      </w:r>
+    </w:p>
+    <w:p>
+      <w:pPr>
+        <w:spacing w:after="120" w:line="320" w:lineRule="exact"/>
         <w:jc w:val="both"/>
         <w:rPr>
           <w:rFonts w:ascii="Times New Roman" w:hAnsi="Times New Roman" w:cs="Times New Roman"/>
@@ -4072,12 +4899,12 @@
           <w:sz w:val="24"/>
           <w:szCs w:val="24"/>
         </w:rPr>
-        <w:t>В проекта е реализирана поддръжка на ε-преходи чрез алгоритъм за epsilon closure, който намира всички достижими състояния чрез ε-преходи.</w:t>
-      </w:r>
-    </w:p>
-    <w:p>
-      <w:pPr>
-        <w:spacing w:after="120" w:line="360" w:lineRule="auto"/>
+        <w:t>• структурата на класовете;</w:t>
+      </w:r>
+    </w:p>
+    <w:p>
+      <w:pPr>
+        <w:spacing w:after="120" w:line="320" w:lineRule="exact"/>
         <w:jc w:val="both"/>
         <w:rPr>
           <w:rFonts w:ascii="Times New Roman" w:hAnsi="Times New Roman" w:cs="Times New Roman"/>
@@ -4085,10 +4912,18 @@
           <w:szCs w:val="24"/>
         </w:rPr>
       </w:pPr>
-    </w:p>
-    <w:p>
-      <w:pPr>
-        <w:spacing w:after="120" w:line="360" w:lineRule="auto"/>
+      <w:r>
+        <w:rPr>
+          <w:rFonts w:ascii="Times New Roman" w:hAnsi="Times New Roman" w:cs="Times New Roman"/>
+          <w:sz w:val="24"/>
+          <w:szCs w:val="24"/>
+        </w:rPr>
+        <w:t>• алгоритъма за разпознаване на дума;</w:t>
+      </w:r>
+    </w:p>
+    <w:p>
+      <w:pPr>
+        <w:spacing w:after="120" w:line="320" w:lineRule="exact"/>
         <w:jc w:val="both"/>
         <w:rPr>
           <w:rFonts w:ascii="Times New Roman" w:hAnsi="Times New Roman" w:cs="Times New Roman"/>
@@ -4102,686 +4937,14 @@
           <w:sz w:val="24"/>
           <w:szCs w:val="24"/>
         </w:rPr>
-        <w:t>При недетерминираните автомати е възможно автоматът да се намира в повече от едно състояние едновременно. Поради тази причина при разпознаване на думи се използва множество от текущи състояния вместо едно конкретно състояние.</w:t>
-      </w:r>
-    </w:p>
-    <w:p>
-      <w:pPr>
-        <w:spacing w:after="120" w:line="360" w:lineRule="auto"/>
-        <w:jc w:val="both"/>
-        <w:rPr>
-          <w:rFonts w:ascii="Times New Roman" w:hAnsi="Times New Roman" w:cs="Times New Roman"/>
-          <w:sz w:val="24"/>
-          <w:szCs w:val="24"/>
-        </w:rPr>
-      </w:pPr>
-    </w:p>
-    <w:p>
-      <w:pPr>
-        <w:spacing w:after="120" w:line="360" w:lineRule="auto"/>
-        <w:jc w:val="both"/>
-        <w:rPr>
-          <w:rFonts w:ascii="Times New Roman" w:hAnsi="Times New Roman" w:cs="Times New Roman"/>
-          <w:sz w:val="24"/>
-          <w:szCs w:val="24"/>
-        </w:rPr>
-      </w:pPr>
-      <w:r>
-        <w:rPr>
-          <w:rFonts w:ascii="Times New Roman" w:hAnsi="Times New Roman" w:cs="Times New Roman"/>
-          <w:sz w:val="24"/>
-          <w:szCs w:val="24"/>
-        </w:rPr>
-        <w:t>Това позволява едновременно проследяване на всички възможни преходи в автомата.</w:t>
-      </w:r>
-    </w:p>
-    <w:p>
-      <w:pPr>
-        <w:spacing w:after="120" w:line="360" w:lineRule="auto"/>
-        <w:jc w:val="both"/>
-        <w:rPr>
-          <w:rFonts w:ascii="Times New Roman" w:hAnsi="Times New Roman" w:cs="Times New Roman"/>
-          <w:sz w:val="24"/>
-          <w:szCs w:val="24"/>
-        </w:rPr>
-      </w:pPr>
-    </w:p>
-    <w:p>
-      <w:pPr>
-        <w:spacing w:after="120" w:line="360" w:lineRule="auto"/>
-        <w:jc w:val="both"/>
-        <w:rPr>
-          <w:rFonts w:ascii="Times New Roman" w:hAnsi="Times New Roman" w:cs="Times New Roman"/>
-          <w:sz w:val="24"/>
-          <w:szCs w:val="24"/>
-        </w:rPr>
-      </w:pPr>
-      <w:r>
-        <w:rPr>
-          <w:rFonts w:ascii="Times New Roman" w:hAnsi="Times New Roman" w:cs="Times New Roman"/>
-          <w:sz w:val="24"/>
-          <w:szCs w:val="24"/>
-        </w:rPr>
-        <w:t>За разпознаване на думи е използван алгоритъм, който поддържа множество текущи състояния, което позволява работа с недетерминирани автомати.</w:t>
-      </w:r>
-    </w:p>
-    <w:p>
-      <w:pPr>
-        <w:spacing w:after="120" w:line="360" w:lineRule="auto"/>
-        <w:jc w:val="both"/>
-        <w:rPr>
-          <w:rFonts w:ascii="Times New Roman" w:hAnsi="Times New Roman" w:cs="Times New Roman"/>
-          <w:sz w:val="24"/>
-          <w:szCs w:val="24"/>
-        </w:rPr>
-      </w:pPr>
-    </w:p>
-    <w:p>
-      <w:pPr>
-        <w:spacing w:after="120" w:line="360" w:lineRule="auto"/>
-        <w:jc w:val="both"/>
-        <w:rPr>
-          <w:rFonts w:ascii="Times New Roman" w:hAnsi="Times New Roman" w:cs="Times New Roman"/>
-          <w:sz w:val="24"/>
-          <w:szCs w:val="24"/>
-        </w:rPr>
-      </w:pPr>
-      <w:r>
-        <w:rPr>
-          <w:rFonts w:ascii="Times New Roman" w:hAnsi="Times New Roman" w:cs="Times New Roman"/>
-          <w:sz w:val="24"/>
-          <w:szCs w:val="24"/>
-        </w:rPr>
-        <w:t>Реализирана е и операция за детерминиране на автомат, чрез която недетерминиран автомат може да бъде преобразуван в детерминиран.</w:t>
-      </w:r>
-    </w:p>
-    <w:p>
-      <w:pPr>
-        <w:spacing w:after="120" w:line="360" w:lineRule="auto"/>
-        <w:jc w:val="both"/>
-        <w:rPr>
-          <w:rFonts w:ascii="Times New Roman" w:hAnsi="Times New Roman" w:cs="Times New Roman"/>
-          <w:sz w:val="24"/>
-          <w:szCs w:val="24"/>
-        </w:rPr>
-      </w:pPr>
-    </w:p>
-    <w:p>
-      <w:pPr>
-        <w:spacing w:after="120" w:line="360" w:lineRule="auto"/>
-        <w:jc w:val="both"/>
-        <w:rPr>
-          <w:rFonts w:ascii="Times New Roman" w:hAnsi="Times New Roman" w:cs="Times New Roman"/>
-          <w:sz w:val="24"/>
-          <w:szCs w:val="24"/>
-        </w:rPr>
-      </w:pPr>
-      <w:r>
-        <w:rPr>
-          <w:rFonts w:ascii="Times New Roman" w:hAnsi="Times New Roman" w:cs="Times New Roman"/>
-          <w:sz w:val="24"/>
-          <w:szCs w:val="24"/>
-        </w:rPr>
-        <w:t>Допълнително е реализирана проверка дали езикът на автомат е краен чрез търсене на цикли в графа на преходите.</w:t>
-      </w:r>
-    </w:p>
-    <w:p>
-      <w:pPr>
-        <w:pStyle w:val="Heading2"/>
-      </w:pPr>
-      <w:bookmarkStart w:id="6" w:name="_Toc229947540"/>
-      <w:r>
         <w:lastRenderedPageBreak/>
-        <w:t>2.2 Подход, технологии и средства за разработка</w:t>
-      </w:r>
-      <w:bookmarkEnd w:id="6"/>
-    </w:p>
-    <w:p>
-      <w:pPr>
-        <w:spacing w:after="120" w:line="360" w:lineRule="auto"/>
-        <w:jc w:val="both"/>
-        <w:rPr>
-          <w:rFonts w:ascii="Times New Roman" w:hAnsi="Times New Roman" w:cs="Times New Roman"/>
-          <w:sz w:val="24"/>
-          <w:szCs w:val="24"/>
-        </w:rPr>
-      </w:pPr>
-      <w:r>
-        <w:rPr>
-          <w:rFonts w:ascii="Times New Roman" w:hAnsi="Times New Roman" w:cs="Times New Roman"/>
-          <w:sz w:val="24"/>
-          <w:szCs w:val="24"/>
-        </w:rPr>
-        <w:t>Проектът е реализиран на езика Java чрез принципите на обектно-ориентираното програмиране.</w:t>
-      </w:r>
-    </w:p>
-    <w:p>
-      <w:pPr>
-        <w:spacing w:after="120" w:line="360" w:lineRule="auto"/>
-        <w:jc w:val="both"/>
-        <w:rPr>
-          <w:rFonts w:ascii="Times New Roman" w:hAnsi="Times New Roman" w:cs="Times New Roman"/>
-          <w:sz w:val="24"/>
-          <w:szCs w:val="24"/>
-        </w:rPr>
-      </w:pPr>
-    </w:p>
-    <w:p>
-      <w:pPr>
-        <w:spacing w:after="120" w:line="360" w:lineRule="auto"/>
-        <w:jc w:val="both"/>
-        <w:rPr>
-          <w:rFonts w:ascii="Times New Roman" w:hAnsi="Times New Roman" w:cs="Times New Roman"/>
-          <w:sz w:val="24"/>
-          <w:szCs w:val="24"/>
-        </w:rPr>
-      </w:pPr>
-      <w:r>
-        <w:rPr>
-          <w:rFonts w:ascii="Times New Roman" w:hAnsi="Times New Roman" w:cs="Times New Roman"/>
-          <w:sz w:val="24"/>
-          <w:szCs w:val="24"/>
-        </w:rPr>
-        <w:t>Използвани са класове за представяне на автомати, преходи, обработка на команди и работа с файлове. За съхраняване на данни са използвани структури от тип ArrayList.</w:t>
-      </w:r>
-    </w:p>
-    <w:p>
-      <w:pPr>
-        <w:spacing w:after="120" w:line="360" w:lineRule="auto"/>
-        <w:jc w:val="both"/>
-        <w:rPr>
-          <w:rFonts w:ascii="Times New Roman" w:hAnsi="Times New Roman" w:cs="Times New Roman"/>
-          <w:sz w:val="24"/>
-          <w:szCs w:val="24"/>
-        </w:rPr>
-      </w:pPr>
-    </w:p>
-    <w:p>
-      <w:pPr>
-        <w:spacing w:after="120" w:line="360" w:lineRule="auto"/>
-        <w:jc w:val="both"/>
-        <w:rPr>
-          <w:rFonts w:ascii="Times New Roman" w:hAnsi="Times New Roman" w:cs="Times New Roman"/>
-          <w:sz w:val="24"/>
-          <w:szCs w:val="24"/>
-        </w:rPr>
-      </w:pPr>
-      <w:r>
-        <w:rPr>
-          <w:rFonts w:ascii="Times New Roman" w:hAnsi="Times New Roman" w:cs="Times New Roman"/>
-          <w:sz w:val="24"/>
-          <w:szCs w:val="24"/>
-        </w:rPr>
-        <w:t>За разработката на проекта е използвана средата IntelliJ IDEA, а за управление на версиите е използвана платформата GitHub.</w:t>
-      </w:r>
-    </w:p>
-    <w:p>
-      <w:pPr>
-        <w:spacing w:after="120" w:line="360" w:lineRule="auto"/>
-        <w:jc w:val="both"/>
-        <w:rPr>
-          <w:rFonts w:ascii="Times New Roman" w:hAnsi="Times New Roman" w:cs="Times New Roman"/>
-          <w:sz w:val="24"/>
-          <w:szCs w:val="24"/>
-        </w:rPr>
-      </w:pPr>
-    </w:p>
-    <w:p>
-      <w:pPr>
-        <w:spacing w:after="120" w:line="360" w:lineRule="auto"/>
-        <w:jc w:val="both"/>
-        <w:rPr>
-          <w:rFonts w:ascii="Times New Roman" w:hAnsi="Times New Roman" w:cs="Times New Roman"/>
-          <w:sz w:val="24"/>
-          <w:szCs w:val="24"/>
-        </w:rPr>
-      </w:pPr>
-      <w:r>
-        <w:rPr>
-          <w:rFonts w:ascii="Times New Roman" w:hAnsi="Times New Roman" w:cs="Times New Roman"/>
-          <w:sz w:val="24"/>
-          <w:szCs w:val="24"/>
-        </w:rPr>
-        <w:t>Приложението използва команден интерфейс (Command Line Interface), чрез който потребителят въвежда команди за работа с автоматите.</w:t>
-      </w:r>
-    </w:p>
-    <w:p>
-      <w:pPr>
-        <w:rPr>
-          <w:rFonts w:ascii="Times New Roman" w:hAnsi="Times New Roman" w:cs="Times New Roman"/>
-          <w:sz w:val="24"/>
-          <w:szCs w:val="24"/>
-        </w:rPr>
-      </w:pPr>
-      <w:r>
-        <w:rPr>
-          <w:rFonts w:ascii="Times New Roman" w:hAnsi="Times New Roman" w:cs="Times New Roman"/>
-          <w:sz w:val="24"/>
-          <w:szCs w:val="24"/>
-        </w:rPr>
-        <w:br w:type="page"/>
-      </w:r>
-    </w:p>
-    <w:p>
-      <w:pPr>
-        <w:pStyle w:val="Heading1"/>
-        <w:rPr>
-          <w:sz w:val="24"/>
-        </w:rPr>
-      </w:pPr>
-      <w:bookmarkStart w:id="7" w:name="_Toc229947541"/>
-      <w:r>
-        <w:lastRenderedPageBreak/>
-        <w:t>Глава 3. Проектиране</w:t>
-      </w:r>
-      <w:bookmarkEnd w:id="7"/>
-    </w:p>
-    <w:p>
-      <w:pPr>
-        <w:spacing w:after="120" w:line="360" w:lineRule="auto"/>
-        <w:jc w:val="center"/>
-        <w:rPr>
-          <w:rFonts w:ascii="Times New Roman" w:hAnsi="Times New Roman" w:cs="Times New Roman"/>
-          <w:b/>
-          <w:sz w:val="44"/>
-          <w:szCs w:val="24"/>
-        </w:rPr>
-      </w:pPr>
-    </w:p>
-    <w:p>
-      <w:pPr>
-        <w:pStyle w:val="Heading2"/>
-      </w:pPr>
-      <w:bookmarkStart w:id="8" w:name="_Toc229947542"/>
-      <w:r>
-        <w:t>3.1 Обща структура на проекта</w:t>
-      </w:r>
-      <w:bookmarkEnd w:id="8"/>
-    </w:p>
-    <w:p>
-      <w:pPr>
-        <w:spacing w:after="120" w:line="360" w:lineRule="auto"/>
-        <w:jc w:val="both"/>
-        <w:rPr>
-          <w:rFonts w:ascii="Times New Roman" w:hAnsi="Times New Roman" w:cs="Times New Roman"/>
-          <w:sz w:val="24"/>
-          <w:szCs w:val="24"/>
-        </w:rPr>
-      </w:pPr>
-      <w:r>
-        <w:rPr>
-          <w:rFonts w:ascii="Times New Roman" w:hAnsi="Times New Roman" w:cs="Times New Roman"/>
-          <w:sz w:val="24"/>
-          <w:szCs w:val="24"/>
-        </w:rPr>
-        <w:t>Проектът е разделен на отделни пакети и класове, които реализират различните функционалности на системата.</w:t>
-      </w:r>
-    </w:p>
-    <w:p>
-      <w:pPr>
-        <w:spacing w:after="120" w:line="360" w:lineRule="auto"/>
-        <w:jc w:val="both"/>
-        <w:rPr>
-          <w:rFonts w:ascii="Times New Roman" w:hAnsi="Times New Roman" w:cs="Times New Roman"/>
-          <w:sz w:val="24"/>
-          <w:szCs w:val="24"/>
-        </w:rPr>
-      </w:pPr>
-    </w:p>
-    <w:p>
-      <w:pPr>
-        <w:spacing w:after="120" w:line="360" w:lineRule="auto"/>
-        <w:jc w:val="both"/>
-        <w:rPr>
-          <w:rFonts w:ascii="Times New Roman" w:hAnsi="Times New Roman" w:cs="Times New Roman"/>
-          <w:sz w:val="24"/>
-          <w:szCs w:val="24"/>
-        </w:rPr>
-      </w:pPr>
-      <w:r>
-        <w:rPr>
-          <w:rFonts w:ascii="Times New Roman" w:hAnsi="Times New Roman" w:cs="Times New Roman"/>
-          <w:sz w:val="24"/>
-          <w:szCs w:val="24"/>
-        </w:rPr>
-        <w:t>Основните класове в проекта са:</w:t>
-      </w:r>
-    </w:p>
-    <w:p>
-      <w:pPr>
-        <w:spacing w:after="120" w:line="360" w:lineRule="auto"/>
-        <w:jc w:val="both"/>
-        <w:rPr>
-          <w:rFonts w:ascii="Times New Roman" w:hAnsi="Times New Roman" w:cs="Times New Roman"/>
-          <w:sz w:val="24"/>
-          <w:szCs w:val="24"/>
-        </w:rPr>
-      </w:pPr>
-    </w:p>
-    <w:p>
-      <w:pPr>
-        <w:spacing w:after="120" w:line="360" w:lineRule="auto"/>
-        <w:jc w:val="both"/>
-        <w:rPr>
-          <w:rFonts w:ascii="Times New Roman" w:hAnsi="Times New Roman" w:cs="Times New Roman"/>
-          <w:sz w:val="24"/>
-          <w:szCs w:val="24"/>
-        </w:rPr>
-      </w:pPr>
-      <w:r>
-        <w:rPr>
-          <w:rFonts w:ascii="Times New Roman" w:hAnsi="Times New Roman" w:cs="Times New Roman"/>
-          <w:sz w:val="24"/>
-          <w:szCs w:val="24"/>
-        </w:rPr>
-        <w:t>• Automaton – представя краен автомат;</w:t>
-      </w:r>
-    </w:p>
-    <w:p>
-      <w:pPr>
-        <w:spacing w:after="120" w:line="360" w:lineRule="auto"/>
-        <w:jc w:val="both"/>
-        <w:rPr>
-          <w:rFonts w:ascii="Times New Roman" w:hAnsi="Times New Roman" w:cs="Times New Roman"/>
-          <w:sz w:val="24"/>
-          <w:szCs w:val="24"/>
-        </w:rPr>
-      </w:pPr>
-      <w:r>
-        <w:rPr>
-          <w:rFonts w:ascii="Times New Roman" w:hAnsi="Times New Roman" w:cs="Times New Roman"/>
-          <w:sz w:val="24"/>
-          <w:szCs w:val="24"/>
-        </w:rPr>
-        <w:t>• Transition – представя преход между две състояния;</w:t>
-      </w:r>
-    </w:p>
-    <w:p>
-      <w:pPr>
-        <w:spacing w:after="120" w:line="360" w:lineRule="auto"/>
-        <w:jc w:val="both"/>
-        <w:rPr>
-          <w:rFonts w:ascii="Times New Roman" w:hAnsi="Times New Roman" w:cs="Times New Roman"/>
-          <w:sz w:val="24"/>
-          <w:szCs w:val="24"/>
-        </w:rPr>
-      </w:pPr>
-      <w:r>
-        <w:rPr>
-          <w:rFonts w:ascii="Times New Roman" w:hAnsi="Times New Roman" w:cs="Times New Roman"/>
-          <w:sz w:val="24"/>
-          <w:szCs w:val="24"/>
-        </w:rPr>
-        <w:t>• AutomatonManager – управлява всички заредени автомати;</w:t>
-      </w:r>
-    </w:p>
-    <w:p>
-      <w:pPr>
-        <w:spacing w:after="120" w:line="360" w:lineRule="auto"/>
-        <w:jc w:val="both"/>
-        <w:rPr>
-          <w:rFonts w:ascii="Times New Roman" w:hAnsi="Times New Roman" w:cs="Times New Roman"/>
-          <w:sz w:val="24"/>
-          <w:szCs w:val="24"/>
-        </w:rPr>
-      </w:pPr>
-      <w:r>
-        <w:rPr>
-          <w:rFonts w:ascii="Times New Roman" w:hAnsi="Times New Roman" w:cs="Times New Roman"/>
-          <w:sz w:val="24"/>
-          <w:szCs w:val="24"/>
-        </w:rPr>
-        <w:t>• FileManager – обработва файловите операции;</w:t>
-      </w:r>
-    </w:p>
-    <w:p>
-      <w:pPr>
-        <w:spacing w:after="120" w:line="360" w:lineRule="auto"/>
-        <w:jc w:val="both"/>
-        <w:rPr>
-          <w:rFonts w:ascii="Times New Roman" w:hAnsi="Times New Roman" w:cs="Times New Roman"/>
-          <w:sz w:val="24"/>
-          <w:szCs w:val="24"/>
-        </w:rPr>
-      </w:pPr>
-      <w:r>
-        <w:rPr>
-          <w:rFonts w:ascii="Times New Roman" w:hAnsi="Times New Roman" w:cs="Times New Roman"/>
-          <w:sz w:val="24"/>
-          <w:szCs w:val="24"/>
-        </w:rPr>
-        <w:t>• CommandProcessor – обработва командите от потребителя;</w:t>
-      </w:r>
-    </w:p>
-    <w:p>
-      <w:pPr>
-        <w:spacing w:after="120" w:line="360" w:lineRule="auto"/>
-        <w:jc w:val="both"/>
-        <w:rPr>
-          <w:rFonts w:ascii="Times New Roman" w:hAnsi="Times New Roman" w:cs="Times New Roman"/>
-          <w:sz w:val="24"/>
-          <w:szCs w:val="24"/>
-        </w:rPr>
-      </w:pPr>
-      <w:r>
-        <w:rPr>
-          <w:rFonts w:ascii="Times New Roman" w:hAnsi="Times New Roman" w:cs="Times New Roman"/>
-          <w:sz w:val="24"/>
-          <w:szCs w:val="24"/>
-        </w:rPr>
-        <w:t>• Main – начална точка на приложението.</w:t>
-      </w:r>
-    </w:p>
-    <w:p>
-      <w:pPr>
-        <w:spacing w:after="120" w:line="360" w:lineRule="auto"/>
-        <w:jc w:val="both"/>
-        <w:rPr>
-          <w:rFonts w:ascii="Times New Roman" w:hAnsi="Times New Roman" w:cs="Times New Roman"/>
-          <w:sz w:val="24"/>
-          <w:szCs w:val="24"/>
-        </w:rPr>
-      </w:pPr>
-    </w:p>
-    <w:p>
-      <w:pPr>
-        <w:spacing w:after="120" w:line="360" w:lineRule="auto"/>
-        <w:jc w:val="both"/>
-        <w:rPr>
-          <w:rFonts w:ascii="Times New Roman" w:hAnsi="Times New Roman" w:cs="Times New Roman"/>
-          <w:sz w:val="24"/>
-          <w:szCs w:val="24"/>
-        </w:rPr>
-      </w:pPr>
-      <w:r>
-        <w:rPr>
-          <w:rFonts w:ascii="Times New Roman" w:hAnsi="Times New Roman" w:cs="Times New Roman"/>
-          <w:sz w:val="24"/>
-          <w:szCs w:val="24"/>
-        </w:rPr>
-        <w:t>Класовете в проекта комуникират помежду си чрез извикване на публични методи и обмен на обекти от тип Automaton и Transition.</w:t>
-      </w:r>
-    </w:p>
-    <w:p>
-      <w:pPr>
-        <w:spacing w:after="120" w:line="360" w:lineRule="auto"/>
-        <w:jc w:val="both"/>
-        <w:rPr>
-          <w:rFonts w:ascii="Times New Roman" w:hAnsi="Times New Roman" w:cs="Times New Roman"/>
-          <w:sz w:val="24"/>
-          <w:szCs w:val="24"/>
-        </w:rPr>
-      </w:pPr>
-      <w:r>
-        <w:rPr>
-          <w:rFonts w:ascii="Times New Roman" w:hAnsi="Times New Roman" w:cs="Times New Roman"/>
-          <w:sz w:val="24"/>
-          <w:szCs w:val="24"/>
-        </w:rPr>
-        <w:t>CommandProcessor изпраща командите към AutomatonManager, който извършва съответните операции върху автоматите.</w:t>
-      </w:r>
-    </w:p>
-    <w:p>
-      <w:pPr>
-        <w:spacing w:after="120" w:line="360" w:lineRule="auto"/>
-        <w:jc w:val="both"/>
-        <w:rPr>
-          <w:rFonts w:ascii="Times New Roman" w:hAnsi="Times New Roman" w:cs="Times New Roman"/>
-          <w:sz w:val="24"/>
-          <w:szCs w:val="24"/>
-        </w:rPr>
-      </w:pPr>
-    </w:p>
-    <w:p>
-      <w:pPr>
-        <w:spacing w:after="120" w:line="360" w:lineRule="auto"/>
-        <w:jc w:val="both"/>
-        <w:rPr>
-          <w:rFonts w:ascii="Times New Roman" w:hAnsi="Times New Roman" w:cs="Times New Roman"/>
-          <w:sz w:val="24"/>
-          <w:szCs w:val="24"/>
-        </w:rPr>
-      </w:pPr>
-      <w:r>
-        <w:rPr>
-          <w:rFonts w:ascii="Times New Roman" w:hAnsi="Times New Roman" w:cs="Times New Roman"/>
-          <w:sz w:val="24"/>
-          <w:szCs w:val="24"/>
-        </w:rPr>
-        <w:t>Структурата на проекта позволява отделяне на логиката за работа с автомати, обработката на команди и работата с файлове, което улеснява поддръжката и разширяването на приложението.</w:t>
-      </w:r>
-    </w:p>
-    <w:p>
-      <w:pPr>
-        <w:spacing w:after="120" w:line="360" w:lineRule="auto"/>
-        <w:jc w:val="both"/>
-        <w:rPr>
-          <w:rFonts w:ascii="Times New Roman" w:hAnsi="Times New Roman" w:cs="Times New Roman"/>
-          <w:sz w:val="24"/>
-          <w:szCs w:val="24"/>
-        </w:rPr>
-      </w:pPr>
-    </w:p>
-    <w:p>
-      <w:pPr>
-        <w:pStyle w:val="Heading2"/>
-      </w:pPr>
-      <w:bookmarkStart w:id="9" w:name="_Toc229947543"/>
-      <w:r>
-        <w:lastRenderedPageBreak/>
-        <w:t>3.2 Диаграми и модели</w:t>
-      </w:r>
-      <w:bookmarkEnd w:id="9"/>
-    </w:p>
-    <w:p>
-      <w:pPr>
-        <w:spacing w:after="120" w:line="360" w:lineRule="auto"/>
-        <w:jc w:val="both"/>
-        <w:rPr>
-          <w:rFonts w:ascii="Times New Roman" w:hAnsi="Times New Roman" w:cs="Times New Roman"/>
-          <w:sz w:val="24"/>
-          <w:szCs w:val="24"/>
-        </w:rPr>
-      </w:pPr>
-      <w:r>
-        <w:rPr>
-          <w:rFonts w:ascii="Times New Roman" w:hAnsi="Times New Roman" w:cs="Times New Roman"/>
-          <w:sz w:val="24"/>
-          <w:szCs w:val="24"/>
-        </w:rPr>
-        <w:t>За проектирането на системата са използвани диаграми, описващи структурата на класовете и логиката на основните алгоритми.</w:t>
-      </w:r>
-    </w:p>
-    <w:p>
-      <w:pPr>
-        <w:spacing w:after="120" w:line="360" w:lineRule="auto"/>
-        <w:jc w:val="both"/>
-        <w:rPr>
-          <w:rFonts w:ascii="Times New Roman" w:hAnsi="Times New Roman" w:cs="Times New Roman"/>
-          <w:sz w:val="24"/>
-          <w:szCs w:val="24"/>
-        </w:rPr>
-      </w:pPr>
-    </w:p>
-    <w:p>
-      <w:pPr>
-        <w:spacing w:after="120" w:line="360" w:lineRule="auto"/>
-        <w:jc w:val="both"/>
-        <w:rPr>
-          <w:rFonts w:ascii="Times New Roman" w:hAnsi="Times New Roman" w:cs="Times New Roman"/>
-          <w:sz w:val="24"/>
-          <w:szCs w:val="24"/>
-        </w:rPr>
-      </w:pPr>
-      <w:r>
-        <w:rPr>
-          <w:rFonts w:ascii="Times New Roman" w:hAnsi="Times New Roman" w:cs="Times New Roman"/>
-          <w:sz w:val="24"/>
-          <w:szCs w:val="24"/>
-        </w:rPr>
-        <w:t>Използвани са диаграми за:</w:t>
-      </w:r>
-    </w:p>
-    <w:p>
-      <w:pPr>
-        <w:spacing w:after="120" w:line="360" w:lineRule="auto"/>
-        <w:jc w:val="both"/>
-        <w:rPr>
-          <w:rFonts w:ascii="Times New Roman" w:hAnsi="Times New Roman" w:cs="Times New Roman"/>
-          <w:sz w:val="24"/>
-          <w:szCs w:val="24"/>
-        </w:rPr>
-      </w:pPr>
-      <w:r>
-        <w:rPr>
-          <w:rFonts w:ascii="Times New Roman" w:hAnsi="Times New Roman" w:cs="Times New Roman"/>
-          <w:sz w:val="24"/>
-          <w:szCs w:val="24"/>
-        </w:rPr>
-        <w:t>• структурата на класовете;</w:t>
-      </w:r>
-    </w:p>
-    <w:p>
-      <w:pPr>
-        <w:spacing w:after="120" w:line="360" w:lineRule="auto"/>
-        <w:jc w:val="both"/>
-        <w:rPr>
-          <w:rFonts w:ascii="Times New Roman" w:hAnsi="Times New Roman" w:cs="Times New Roman"/>
-          <w:sz w:val="24"/>
-          <w:szCs w:val="24"/>
-        </w:rPr>
-      </w:pPr>
-      <w:r>
-        <w:rPr>
-          <w:rFonts w:ascii="Times New Roman" w:hAnsi="Times New Roman" w:cs="Times New Roman"/>
-          <w:sz w:val="24"/>
-          <w:szCs w:val="24"/>
-        </w:rPr>
-        <w:t>• алгоритъма за разпознаване на дума;</w:t>
-      </w:r>
-    </w:p>
-    <w:p>
-      <w:pPr>
-        <w:spacing w:after="120" w:line="360" w:lineRule="auto"/>
-        <w:jc w:val="both"/>
-        <w:rPr>
-          <w:rFonts w:ascii="Times New Roman" w:hAnsi="Times New Roman" w:cs="Times New Roman"/>
-          <w:sz w:val="24"/>
-          <w:szCs w:val="24"/>
-        </w:rPr>
-      </w:pPr>
-      <w:r>
-        <w:rPr>
-          <w:rFonts w:ascii="Times New Roman" w:hAnsi="Times New Roman" w:cs="Times New Roman"/>
-          <w:sz w:val="24"/>
-          <w:szCs w:val="24"/>
-        </w:rPr>
         <w:t>• обработка на потребителски команди.</w:t>
       </w:r>
     </w:p>
     <w:p>
       <w:pPr>
         <w:pStyle w:val="Heading3"/>
+        <w:spacing w:line="320" w:lineRule="exact"/>
       </w:pPr>
       <w:bookmarkStart w:id="10" w:name="_Toc229947544"/>
       <w:r>
@@ -4791,6 +4954,7 @@
     </w:p>
     <w:p>
       <w:pPr>
+        <w:spacing w:line="320" w:lineRule="exact"/>
         <w:rPr>
           <w:rFonts w:ascii="Times New Roman" w:hAnsi="Times New Roman" w:cs="Times New Roman"/>
           <w:sz w:val="24"/>
@@ -4923,15 +5087,60 @@
     <w:p>
       <w:pPr>
         <w:pStyle w:val="Heading3"/>
+        <w:spacing w:line="320" w:lineRule="exact"/>
       </w:pPr>
       <w:bookmarkStart w:id="11" w:name="_Toc229947545"/>
-      <w:r>
+    </w:p>
+    <w:p>
+      <w:pPr>
+        <w:pStyle w:val="Heading3"/>
+        <w:spacing w:line="320" w:lineRule="exact"/>
+      </w:pPr>
+    </w:p>
+    <w:p>
+      <w:pPr>
+        <w:pStyle w:val="Heading3"/>
+        <w:spacing w:line="320" w:lineRule="exact"/>
+      </w:pPr>
+    </w:p>
+    <w:p>
+      <w:pPr>
+        <w:pStyle w:val="Heading3"/>
+        <w:spacing w:line="320" w:lineRule="exact"/>
+      </w:pPr>
+    </w:p>
+    <w:p>
+      <w:pPr>
+        <w:pStyle w:val="Heading3"/>
+        <w:spacing w:line="320" w:lineRule="exact"/>
+      </w:pPr>
+    </w:p>
+    <w:p>
+      <w:pPr>
+        <w:pStyle w:val="Heading3"/>
+        <w:spacing w:line="320" w:lineRule="exact"/>
+      </w:pPr>
+    </w:p>
+    <w:p>
+      <w:pPr>
+        <w:pStyle w:val="Heading3"/>
+        <w:spacing w:line="320" w:lineRule="exact"/>
+      </w:pPr>
+    </w:p>
+    <w:p>
+      <w:pPr>
+        <w:pStyle w:val="Heading3"/>
+        <w:spacing w:line="320" w:lineRule="exact"/>
+      </w:pPr>
+      <w:r>
+        <w:lastRenderedPageBreak/>
         <w:t>3.2.2 Блок-схема на алгоритъма за разпознаване на дума</w:t>
       </w:r>
       <w:bookmarkEnd w:id="11"/>
     </w:p>
     <w:p>
       <w:pPr>
+        <w:spacing w:line="320" w:lineRule="exact"/>
         <w:rPr>
           <w:rFonts w:ascii="Times New Roman" w:hAnsi="Times New Roman" w:cs="Times New Roman"/>
           <w:sz w:val="24"/>
@@ -5244,7 +5453,17 @@
     </w:p>
     <w:p>
       <w:pPr>
+        <w:rPr>
+          <w:rFonts w:ascii="Times New Roman" w:hAnsi="Times New Roman" w:cs="Times New Roman"/>
+          <w:sz w:val="24"/>
+          <w:szCs w:val="24"/>
+        </w:rPr>
+      </w:pPr>
+    </w:p>
+    <w:p>
+      <w:pPr>
         <w:pStyle w:val="Heading3"/>
+        <w:spacing w:line="320" w:lineRule="exact"/>
       </w:pPr>
       <w:bookmarkStart w:id="12" w:name="_Toc229947546"/>
       <w:r>
@@ -5440,16 +5659,18 @@
       <w:pPr>
         <w:rPr>
           <w:rFonts w:ascii="Times New Roman" w:hAnsi="Times New Roman" w:cs="Times New Roman"/>
-          <w:sz w:val="24"/>
-          <w:szCs w:val="24"/>
-        </w:rPr>
-      </w:pPr>
+          <w:b/>
+          <w:sz w:val="44"/>
+          <w:szCs w:val="24"/>
+        </w:rPr>
+      </w:pPr>
+      <w:bookmarkStart w:id="13" w:name="_Toc229947547"/>
     </w:p>
     <w:p>
       <w:pPr>
         <w:pStyle w:val="Heading1"/>
-      </w:pPr>
-      <w:bookmarkStart w:id="13" w:name="_Toc229947547"/>
+        <w:spacing w:line="360" w:lineRule="auto"/>
+      </w:pPr>
       <w:r>
         <w:lastRenderedPageBreak/>
         <w:t>Глава 4. Реализация</w:t>
@@ -5458,18 +5679,8 @@
     </w:p>
     <w:p>
       <w:pPr>
-        <w:jc w:val="center"/>
-        <w:rPr>
-          <w:rFonts w:ascii="Times New Roman" w:hAnsi="Times New Roman" w:cs="Times New Roman"/>
-          <w:b/>
-          <w:sz w:val="24"/>
-          <w:szCs w:val="24"/>
-        </w:rPr>
-      </w:pPr>
-    </w:p>
-    <w:p>
-      <w:pPr>
         <w:pStyle w:val="Heading2"/>
+        <w:spacing w:line="320" w:lineRule="exact"/>
         <w:rPr>
           <w:sz w:val="24"/>
         </w:rPr>
@@ -5482,6 +5693,7 @@
     </w:p>
     <w:p>
       <w:pPr>
+        <w:spacing w:line="320" w:lineRule="exact"/>
         <w:rPr>
           <w:rFonts w:ascii="Times New Roman" w:hAnsi="Times New Roman" w:cs="Times New Roman"/>
           <w:sz w:val="24"/>
@@ -5499,15 +5711,17 @@
     </w:p>
     <w:p>
       <w:pPr>
-        <w:rPr>
-          <w:rFonts w:ascii="Times New Roman" w:hAnsi="Times New Roman" w:cs="Times New Roman"/>
-          <w:sz w:val="24"/>
-          <w:szCs w:val="24"/>
-        </w:rPr>
-      </w:pPr>
-    </w:p>
-    <w:p>
-      <w:pPr>
+        <w:spacing w:line="320" w:lineRule="exact"/>
+        <w:rPr>
+          <w:rFonts w:ascii="Times New Roman" w:hAnsi="Times New Roman" w:cs="Times New Roman"/>
+          <w:sz w:val="24"/>
+          <w:szCs w:val="24"/>
+        </w:rPr>
+      </w:pPr>
+    </w:p>
+    <w:p>
+      <w:pPr>
+        <w:spacing w:line="320" w:lineRule="exact"/>
         <w:rPr>
           <w:rFonts w:ascii="Times New Roman" w:hAnsi="Times New Roman" w:cs="Times New Roman"/>
           <w:sz w:val="24"/>
@@ -5525,15 +5739,17 @@
     </w:p>
     <w:p>
       <w:pPr>
-        <w:rPr>
-          <w:rFonts w:ascii="Times New Roman" w:hAnsi="Times New Roman" w:cs="Times New Roman"/>
-          <w:sz w:val="24"/>
-          <w:szCs w:val="24"/>
-        </w:rPr>
-      </w:pPr>
-    </w:p>
-    <w:p>
-      <w:pPr>
+        <w:spacing w:line="320" w:lineRule="exact"/>
+        <w:rPr>
+          <w:rFonts w:ascii="Times New Roman" w:hAnsi="Times New Roman" w:cs="Times New Roman"/>
+          <w:sz w:val="24"/>
+          <w:szCs w:val="24"/>
+        </w:rPr>
+      </w:pPr>
+    </w:p>
+    <w:p>
+      <w:pPr>
+        <w:spacing w:line="320" w:lineRule="exact"/>
         <w:rPr>
           <w:rFonts w:ascii="Times New Roman" w:hAnsi="Times New Roman" w:cs="Times New Roman"/>
           <w:sz w:val="24"/>
@@ -5551,15 +5767,17 @@
     </w:p>
     <w:p>
       <w:pPr>
-        <w:rPr>
-          <w:rFonts w:ascii="Times New Roman" w:hAnsi="Times New Roman" w:cs="Times New Roman"/>
-          <w:sz w:val="24"/>
-          <w:szCs w:val="24"/>
-        </w:rPr>
-      </w:pPr>
-    </w:p>
-    <w:p>
-      <w:pPr>
+        <w:spacing w:line="320" w:lineRule="exact"/>
+        <w:rPr>
+          <w:rFonts w:ascii="Times New Roman" w:hAnsi="Times New Roman" w:cs="Times New Roman"/>
+          <w:sz w:val="24"/>
+          <w:szCs w:val="24"/>
+        </w:rPr>
+      </w:pPr>
+    </w:p>
+    <w:p>
+      <w:pPr>
+        <w:spacing w:line="320" w:lineRule="exact"/>
         <w:rPr>
           <w:rFonts w:ascii="Times New Roman" w:hAnsi="Times New Roman" w:cs="Times New Roman"/>
           <w:sz w:val="24"/>
@@ -5577,15 +5795,17 @@
     </w:p>
     <w:p>
       <w:pPr>
-        <w:rPr>
-          <w:rFonts w:ascii="Times New Roman" w:hAnsi="Times New Roman" w:cs="Times New Roman"/>
-          <w:sz w:val="24"/>
-          <w:szCs w:val="24"/>
-        </w:rPr>
-      </w:pPr>
-    </w:p>
-    <w:p>
-      <w:pPr>
+        <w:spacing w:line="320" w:lineRule="exact"/>
+        <w:rPr>
+          <w:rFonts w:ascii="Times New Roman" w:hAnsi="Times New Roman" w:cs="Times New Roman"/>
+          <w:sz w:val="24"/>
+          <w:szCs w:val="24"/>
+        </w:rPr>
+      </w:pPr>
+    </w:p>
+    <w:p>
+      <w:pPr>
+        <w:spacing w:line="320" w:lineRule="exact"/>
         <w:rPr>
           <w:rFonts w:ascii="Times New Roman" w:hAnsi="Times New Roman" w:cs="Times New Roman"/>
           <w:sz w:val="24"/>
@@ -5603,15 +5823,17 @@
     </w:p>
     <w:p>
       <w:pPr>
-        <w:rPr>
-          <w:rFonts w:ascii="Times New Roman" w:hAnsi="Times New Roman" w:cs="Times New Roman"/>
-          <w:sz w:val="24"/>
-          <w:szCs w:val="24"/>
-        </w:rPr>
-      </w:pPr>
-    </w:p>
-    <w:p>
-      <w:pPr>
+        <w:spacing w:line="320" w:lineRule="exact"/>
+        <w:rPr>
+          <w:rFonts w:ascii="Times New Roman" w:hAnsi="Times New Roman" w:cs="Times New Roman"/>
+          <w:sz w:val="24"/>
+          <w:szCs w:val="24"/>
+        </w:rPr>
+      </w:pPr>
+    </w:p>
+    <w:p>
+      <w:pPr>
+        <w:spacing w:line="320" w:lineRule="exact"/>
         <w:rPr>
           <w:rFonts w:ascii="Times New Roman" w:hAnsi="Times New Roman" w:cs="Times New Roman"/>
           <w:sz w:val="24"/>
@@ -5629,15 +5851,17 @@
     </w:p>
     <w:p>
       <w:pPr>
-        <w:rPr>
-          <w:rFonts w:ascii="Times New Roman" w:hAnsi="Times New Roman" w:cs="Times New Roman"/>
-          <w:sz w:val="24"/>
-          <w:szCs w:val="24"/>
-        </w:rPr>
-      </w:pPr>
-    </w:p>
-    <w:p>
-      <w:pPr>
+        <w:spacing w:line="320" w:lineRule="exact"/>
+        <w:rPr>
+          <w:rFonts w:ascii="Times New Roman" w:hAnsi="Times New Roman" w:cs="Times New Roman"/>
+          <w:sz w:val="24"/>
+          <w:szCs w:val="24"/>
+        </w:rPr>
+      </w:pPr>
+    </w:p>
+    <w:p>
+      <w:pPr>
+        <w:spacing w:line="320" w:lineRule="exact"/>
         <w:rPr>
           <w:rFonts w:ascii="Times New Roman" w:hAnsi="Times New Roman" w:cs="Times New Roman"/>
           <w:sz w:val="24"/>
@@ -5655,15 +5879,17 @@
     </w:p>
     <w:p>
       <w:pPr>
-        <w:rPr>
-          <w:rFonts w:ascii="Times New Roman" w:hAnsi="Times New Roman" w:cs="Times New Roman"/>
-          <w:sz w:val="24"/>
-          <w:szCs w:val="24"/>
-        </w:rPr>
-      </w:pPr>
-    </w:p>
-    <w:p>
-      <w:pPr>
+        <w:spacing w:line="320" w:lineRule="exact"/>
+        <w:rPr>
+          <w:rFonts w:ascii="Times New Roman" w:hAnsi="Times New Roman" w:cs="Times New Roman"/>
+          <w:sz w:val="24"/>
+          <w:szCs w:val="24"/>
+        </w:rPr>
+      </w:pPr>
+    </w:p>
+    <w:p>
+      <w:pPr>
+        <w:spacing w:line="320" w:lineRule="exact"/>
         <w:rPr>
           <w:rFonts w:ascii="Times New Roman" w:hAnsi="Times New Roman" w:cs="Times New Roman"/>
           <w:sz w:val="24"/>
@@ -5681,6 +5907,7 @@
     </w:p>
     <w:p>
       <w:pPr>
+        <w:spacing w:line="320" w:lineRule="exact"/>
         <w:rPr>
           <w:rFonts w:ascii="Times New Roman" w:hAnsi="Times New Roman" w:cs="Times New Roman"/>
           <w:sz w:val="24"/>
@@ -5691,6 +5918,7 @@
     <w:p>
       <w:pPr>
         <w:pStyle w:val="Heading3"/>
+        <w:spacing w:line="320" w:lineRule="exact"/>
       </w:pPr>
       <w:bookmarkStart w:id="15" w:name="_Toc229947549"/>
       <w:r>
@@ -5700,6 +5928,7 @@
     </w:p>
     <w:p>
       <w:pPr>
+        <w:spacing w:line="320" w:lineRule="exact"/>
         <w:rPr>
           <w:rFonts w:ascii="Times New Roman" w:hAnsi="Times New Roman" w:cs="Times New Roman"/>
           <w:b/>
@@ -5710,6 +5939,7 @@
     </w:p>
     <w:p>
       <w:pPr>
+        <w:spacing w:line="320" w:lineRule="exact"/>
         <w:rPr>
           <w:rFonts w:ascii="Times New Roman" w:hAnsi="Times New Roman" w:cs="Times New Roman"/>
           <w:sz w:val="24"/>
@@ -5727,15 +5957,17 @@
     </w:p>
     <w:p>
       <w:pPr>
-        <w:rPr>
-          <w:rFonts w:ascii="Times New Roman" w:hAnsi="Times New Roman" w:cs="Times New Roman"/>
-          <w:sz w:val="24"/>
-          <w:szCs w:val="24"/>
-        </w:rPr>
-      </w:pPr>
-    </w:p>
-    <w:p>
-      <w:pPr>
+        <w:spacing w:line="320" w:lineRule="exact"/>
+        <w:rPr>
+          <w:rFonts w:ascii="Times New Roman" w:hAnsi="Times New Roman" w:cs="Times New Roman"/>
+          <w:sz w:val="24"/>
+          <w:szCs w:val="24"/>
+        </w:rPr>
+      </w:pPr>
+    </w:p>
+    <w:p>
+      <w:pPr>
+        <w:spacing w:line="320" w:lineRule="exact"/>
         <w:rPr>
           <w:rFonts w:ascii="Times New Roman" w:hAnsi="Times New Roman" w:cs="Times New Roman"/>
           <w:sz w:val="24"/>
@@ -5754,15 +5986,17 @@
     </w:p>
     <w:p>
       <w:pPr>
-        <w:rPr>
-          <w:rFonts w:ascii="Times New Roman" w:hAnsi="Times New Roman" w:cs="Times New Roman"/>
-          <w:sz w:val="24"/>
-          <w:szCs w:val="24"/>
-        </w:rPr>
-      </w:pPr>
-    </w:p>
-    <w:p>
-      <w:pPr>
+        <w:spacing w:line="320" w:lineRule="exact"/>
+        <w:rPr>
+          <w:rFonts w:ascii="Times New Roman" w:hAnsi="Times New Roman" w:cs="Times New Roman"/>
+          <w:sz w:val="24"/>
+          <w:szCs w:val="24"/>
+        </w:rPr>
+      </w:pPr>
+    </w:p>
+    <w:p>
+      <w:pPr>
+        <w:spacing w:line="320" w:lineRule="exact"/>
         <w:rPr>
           <w:rFonts w:ascii="Times New Roman" w:hAnsi="Times New Roman" w:cs="Times New Roman"/>
           <w:sz w:val="24"/>
@@ -5780,15 +6014,17 @@
     </w:p>
     <w:p>
       <w:pPr>
-        <w:rPr>
-          <w:rFonts w:ascii="Times New Roman" w:hAnsi="Times New Roman" w:cs="Times New Roman"/>
-          <w:sz w:val="24"/>
-          <w:szCs w:val="24"/>
-        </w:rPr>
-      </w:pPr>
-    </w:p>
-    <w:p>
-      <w:pPr>
+        <w:spacing w:line="320" w:lineRule="exact"/>
+        <w:rPr>
+          <w:rFonts w:ascii="Times New Roman" w:hAnsi="Times New Roman" w:cs="Times New Roman"/>
+          <w:sz w:val="24"/>
+          <w:szCs w:val="24"/>
+        </w:rPr>
+      </w:pPr>
+    </w:p>
+    <w:p>
+      <w:pPr>
+        <w:spacing w:line="320" w:lineRule="exact"/>
         <w:rPr>
           <w:rFonts w:ascii="Times New Roman" w:hAnsi="Times New Roman" w:cs="Times New Roman"/>
           <w:sz w:val="24"/>
@@ -5806,6 +6042,7 @@
     </w:p>
     <w:p>
       <w:pPr>
+        <w:spacing w:line="320" w:lineRule="exact"/>
         <w:rPr>
           <w:rFonts w:ascii="Times New Roman" w:hAnsi="Times New Roman" w:cs="Times New Roman"/>
           <w:sz w:val="24"/>
@@ -5823,15 +6060,17 @@
     </w:p>
     <w:p>
       <w:pPr>
-        <w:rPr>
-          <w:rFonts w:ascii="Times New Roman" w:hAnsi="Times New Roman" w:cs="Times New Roman"/>
-          <w:sz w:val="24"/>
-          <w:szCs w:val="24"/>
-        </w:rPr>
-      </w:pPr>
-    </w:p>
-    <w:p>
-      <w:pPr>
+        <w:spacing w:line="320" w:lineRule="exact"/>
+        <w:rPr>
+          <w:rFonts w:ascii="Times New Roman" w:hAnsi="Times New Roman" w:cs="Times New Roman"/>
+          <w:sz w:val="24"/>
+          <w:szCs w:val="24"/>
+        </w:rPr>
+      </w:pPr>
+    </w:p>
+    <w:p>
+      <w:pPr>
+        <w:spacing w:line="320" w:lineRule="exact"/>
         <w:rPr>
           <w:rFonts w:ascii="Times New Roman" w:hAnsi="Times New Roman" w:cs="Times New Roman"/>
           <w:sz w:val="24"/>
@@ -5849,15 +6088,17 @@
     </w:p>
     <w:p>
       <w:pPr>
-        <w:rPr>
-          <w:rFonts w:ascii="Times New Roman" w:hAnsi="Times New Roman" w:cs="Times New Roman"/>
-          <w:sz w:val="24"/>
-          <w:szCs w:val="24"/>
-        </w:rPr>
-      </w:pPr>
-    </w:p>
-    <w:p>
-      <w:pPr>
+        <w:spacing w:line="320" w:lineRule="exact"/>
+        <w:rPr>
+          <w:rFonts w:ascii="Times New Roman" w:hAnsi="Times New Roman" w:cs="Times New Roman"/>
+          <w:sz w:val="24"/>
+          <w:szCs w:val="24"/>
+        </w:rPr>
+      </w:pPr>
+    </w:p>
+    <w:p>
+      <w:pPr>
+        <w:spacing w:line="320" w:lineRule="exact"/>
         <w:rPr>
           <w:rFonts w:ascii="Times New Roman" w:hAnsi="Times New Roman" w:cs="Times New Roman"/>
           <w:sz w:val="24"/>
@@ -5875,15 +6116,17 @@
     </w:p>
     <w:p>
       <w:pPr>
-        <w:rPr>
-          <w:rFonts w:ascii="Times New Roman" w:hAnsi="Times New Roman" w:cs="Times New Roman"/>
-          <w:sz w:val="24"/>
-          <w:szCs w:val="24"/>
-        </w:rPr>
-      </w:pPr>
-    </w:p>
-    <w:p>
-      <w:pPr>
+        <w:spacing w:line="320" w:lineRule="exact"/>
+        <w:rPr>
+          <w:rFonts w:ascii="Times New Roman" w:hAnsi="Times New Roman" w:cs="Times New Roman"/>
+          <w:sz w:val="24"/>
+          <w:szCs w:val="24"/>
+        </w:rPr>
+      </w:pPr>
+    </w:p>
+    <w:p>
+      <w:pPr>
+        <w:spacing w:line="320" w:lineRule="exact"/>
         <w:rPr>
           <w:rFonts w:ascii="Times New Roman" w:hAnsi="Times New Roman" w:cs="Times New Roman"/>
           <w:sz w:val="24"/>
@@ -6132,22 +6375,22 @@
       <w:pPr>
         <w:rPr>
           <w:rFonts w:ascii="Times New Roman" w:hAnsi="Times New Roman" w:cs="Times New Roman"/>
-          <w:sz w:val="24"/>
-          <w:szCs w:val="24"/>
-        </w:rPr>
-      </w:pPr>
-    </w:p>
-    <w:p>
-      <w:pPr>
-        <w:rPr>
-          <w:rFonts w:ascii="Times New Roman" w:hAnsi="Times New Roman" w:cs="Times New Roman"/>
-          <w:sz w:val="36"/>
-        </w:rPr>
-      </w:pPr>
-      <w:r>
-        <w:rPr>
-          <w:rFonts w:ascii="Times New Roman" w:hAnsi="Times New Roman" w:cs="Times New Roman"/>
-          <w:sz w:val="36"/>
+          <w:sz w:val="18"/>
+          <w:szCs w:val="24"/>
+        </w:rPr>
+      </w:pPr>
+    </w:p>
+    <w:p>
+      <w:pPr>
+        <w:rPr>
+          <w:rFonts w:ascii="Times New Roman" w:hAnsi="Times New Roman" w:cs="Times New Roman"/>
+          <w:sz w:val="24"/>
+        </w:rPr>
+      </w:pPr>
+      <w:r>
+        <w:rPr>
+          <w:rFonts w:ascii="Times New Roman" w:hAnsi="Times New Roman" w:cs="Times New Roman"/>
+          <w:sz w:val="24"/>
         </w:rPr>
         <w:t>Фигура 4.1 Метод recognize()</w:t>
       </w:r>
@@ -6155,16 +6398,24 @@
     <w:p>
       <w:pPr>
         <w:pStyle w:val="Heading3"/>
+        <w:spacing w:line="320" w:lineRule="exact"/>
       </w:pPr>
       <w:bookmarkStart w:id="16" w:name="_Toc229947550"/>
       <w:r>
         <w:lastRenderedPageBreak/>
-        <w:t>4.1.2 Реализация на epsilonClosure()</w:t>
+        <w:t xml:space="preserve">4.1.2 Реализация на </w:t>
+      </w:r>
+      <w:r>
+        <w:rPr>
+          <w:i/>
+        </w:rPr>
+        <w:t>epsilonClosure()</w:t>
       </w:r>
       <w:bookmarkEnd w:id="16"/>
     </w:p>
     <w:p>
       <w:pPr>
+        <w:spacing w:line="320" w:lineRule="exact"/>
         <w:rPr>
           <w:rFonts w:ascii="Times New Roman" w:hAnsi="Times New Roman" w:cs="Times New Roman"/>
           <w:lang w:val="en-US"/>
@@ -6175,7 +6426,22 @@
           <w:rFonts w:ascii="Times New Roman" w:hAnsi="Times New Roman" w:cs="Times New Roman"/>
           <w:lang w:val="en-US"/>
         </w:rPr>
-        <w:t>За обработката на ε-преходите е реализиран метод epsilonClosure(), който намира всички достижими състояния чрез ε</w:t>
+        <w:t xml:space="preserve">За обработката на ε-преходите е реализиран метод </w:t>
+      </w:r>
+      <w:r>
+        <w:rPr>
+          <w:rFonts w:ascii="Times New Roman" w:hAnsi="Times New Roman" w:cs="Times New Roman"/>
+          <w:i/>
+          <w:lang w:val="en-US"/>
+        </w:rPr>
+        <w:t>epsilonClosure()</w:t>
+      </w:r>
+      <w:r>
+        <w:rPr>
+          <w:rFonts w:ascii="Times New Roman" w:hAnsi="Times New Roman" w:cs="Times New Roman"/>
+          <w:lang w:val="en-US"/>
+        </w:rPr>
+        <w:t>, който намира всички достижими състояния чрез ε</w:t>
       </w:r>
       <w:r>
         <w:rPr>
@@ -6193,6 +6459,7 @@
     </w:p>
     <w:p>
       <w:pPr>
+        <w:spacing w:line="320" w:lineRule="exact"/>
         <w:rPr>
           <w:rFonts w:ascii="Times New Roman" w:hAnsi="Times New Roman" w:cs="Times New Roman"/>
           <w:lang w:val="en-US"/>
@@ -6201,6 +6468,7 @@
     </w:p>
     <w:p>
       <w:pPr>
+        <w:spacing w:line="320" w:lineRule="exact"/>
         <w:rPr>
           <w:rFonts w:ascii="Times New Roman" w:hAnsi="Times New Roman" w:cs="Times New Roman"/>
           <w:lang w:val="en-US"/>
@@ -6216,6 +6484,7 @@
     </w:p>
     <w:p>
       <w:pPr>
+        <w:spacing w:line="320" w:lineRule="exact"/>
         <w:rPr>
           <w:rFonts w:ascii="Times New Roman" w:hAnsi="Times New Roman" w:cs="Times New Roman"/>
           <w:lang w:val="en-US"/>
@@ -6224,6 +6493,7 @@
     </w:p>
     <w:p>
       <w:pPr>
+        <w:spacing w:line="320" w:lineRule="exact"/>
         <w:rPr>
           <w:rFonts w:ascii="Times New Roman" w:hAnsi="Times New Roman" w:cs="Times New Roman"/>
         </w:rPr>
@@ -6300,21 +6570,38 @@
     </w:p>
     <w:p>
       <w:pPr>
-        <w:rPr>
-          <w:rFonts w:ascii="Times New Roman" w:hAnsi="Times New Roman" w:cs="Times New Roman"/>
-          <w:sz w:val="36"/>
-        </w:rPr>
-      </w:pPr>
-      <w:r>
-        <w:rPr>
-          <w:rFonts w:ascii="Times New Roman" w:hAnsi="Times New Roman" w:cs="Times New Roman"/>
-          <w:sz w:val="36"/>
-        </w:rPr>
-        <w:t>Фигура 4.2 Метод epsilonClosure() за обработка на ε-преходи</w:t>
-      </w:r>
-    </w:p>
-    <w:p>
-      <w:pPr>
+        <w:spacing w:line="320" w:lineRule="exact"/>
+        <w:rPr>
+          <w:rFonts w:ascii="Times New Roman" w:hAnsi="Times New Roman" w:cs="Times New Roman"/>
+          <w:sz w:val="24"/>
+        </w:rPr>
+      </w:pPr>
+      <w:r>
+        <w:rPr>
+          <w:rFonts w:ascii="Times New Roman" w:hAnsi="Times New Roman" w:cs="Times New Roman"/>
+          <w:sz w:val="24"/>
+        </w:rPr>
+        <w:t xml:space="preserve">Фигура 4.2 Метод </w:t>
+      </w:r>
+      <w:r>
+        <w:rPr>
+          <w:rFonts w:ascii="Times New Roman" w:hAnsi="Times New Roman" w:cs="Times New Roman"/>
+          <w:i/>
+          <w:sz w:val="24"/>
+        </w:rPr>
+        <w:t>epsilonClosure()</w:t>
+      </w:r>
+      <w:r>
+        <w:rPr>
+          <w:rFonts w:ascii="Times New Roman" w:hAnsi="Times New Roman" w:cs="Times New Roman"/>
+          <w:sz w:val="24"/>
+        </w:rPr>
+        <w:t xml:space="preserve"> за обработка на ε-преходи</w:t>
+      </w:r>
+    </w:p>
+    <w:p>
+      <w:pPr>
+        <w:spacing w:line="320" w:lineRule="exact"/>
         <w:rPr>
           <w:rFonts w:ascii="Times New Roman" w:hAnsi="Times New Roman" w:cs="Times New Roman"/>
         </w:rPr>
@@ -6329,6 +6616,7 @@
     <w:p>
       <w:pPr>
         <w:pStyle w:val="Heading3"/>
+        <w:spacing w:line="320" w:lineRule="exact"/>
       </w:pPr>
       <w:bookmarkStart w:id="17" w:name="_Toc229947551"/>
       <w:r>
@@ -6339,6 +6627,7 @@
     </w:p>
     <w:p>
       <w:pPr>
+        <w:spacing w:line="320" w:lineRule="exact"/>
         <w:rPr>
           <w:rFonts w:ascii="Times New Roman" w:hAnsi="Times New Roman" w:cs="Times New Roman"/>
           <w:sz w:val="24"/>
@@ -6358,6 +6647,7 @@
     </w:p>
     <w:p>
       <w:pPr>
+        <w:spacing w:line="320" w:lineRule="exact"/>
         <w:rPr>
           <w:rFonts w:ascii="Times New Roman" w:hAnsi="Times New Roman" w:cs="Times New Roman"/>
           <w:sz w:val="24"/>
@@ -6368,6 +6658,7 @@
     </w:p>
     <w:p>
       <w:pPr>
+        <w:spacing w:line="320" w:lineRule="exact"/>
         <w:rPr>
           <w:rFonts w:ascii="Times New Roman" w:hAnsi="Times New Roman" w:cs="Times New Roman"/>
           <w:sz w:val="24"/>
@@ -6387,6 +6678,7 @@
     </w:p>
     <w:p>
       <w:pPr>
+        <w:spacing w:line="320" w:lineRule="exact"/>
         <w:rPr>
           <w:rFonts w:ascii="Times New Roman" w:hAnsi="Times New Roman" w:cs="Times New Roman"/>
           <w:sz w:val="24"/>
@@ -6397,6 +6689,7 @@
     </w:p>
     <w:p>
       <w:pPr>
+        <w:spacing w:line="320" w:lineRule="exact"/>
         <w:rPr>
           <w:rFonts w:ascii="Times New Roman" w:hAnsi="Times New Roman" w:cs="Times New Roman"/>
           <w:sz w:val="24"/>
@@ -6479,26 +6772,37 @@
     </w:p>
     <w:p>
       <w:pPr>
-        <w:rPr>
-          <w:rFonts w:ascii="Times New Roman" w:hAnsi="Times New Roman" w:cs="Times New Roman"/>
-          <w:sz w:val="32"/>
+        <w:spacing w:line="320" w:lineRule="exact"/>
+        <w:rPr>
+          <w:rFonts w:ascii="Times New Roman" w:hAnsi="Times New Roman" w:cs="Times New Roman"/>
+          <w:sz w:val="24"/>
+          <w:szCs w:val="24"/>
+        </w:rPr>
+      </w:pPr>
+      <w:r>
+        <w:rPr>
+          <w:rFonts w:ascii="Times New Roman" w:hAnsi="Times New Roman" w:cs="Times New Roman"/>
+          <w:sz w:val="24"/>
           <w:szCs w:val="24"/>
           <w:lang w:val="en-US"/>
         </w:rPr>
-      </w:pPr>
-      <w:r>
-        <w:rPr>
-          <w:rFonts w:ascii="Times New Roman" w:hAnsi="Times New Roman" w:cs="Times New Roman"/>
-          <w:sz w:val="32"/>
-          <w:szCs w:val="24"/>
-          <w:lang w:val="en-US"/>
-        </w:rPr>
         <w:t>Фигура 4.3 Метод isDeterministic() за проверка на детерминираност</w:t>
       </w:r>
     </w:p>
     <w:p>
       <w:pPr>
+        <w:spacing w:line="320" w:lineRule="exact"/>
+        <w:rPr>
+          <w:rFonts w:ascii="Times New Roman" w:hAnsi="Times New Roman" w:cs="Times New Roman"/>
+          <w:sz w:val="24"/>
+          <w:szCs w:val="24"/>
+        </w:rPr>
+      </w:pPr>
+    </w:p>
+    <w:p>
+      <w:pPr>
         <w:pStyle w:val="Heading3"/>
+        <w:spacing w:line="320" w:lineRule="exact"/>
         <w:rPr>
           <w:lang w:val="en-US"/>
         </w:rPr>
@@ -6515,6 +6819,7 @@
     </w:p>
     <w:p>
       <w:pPr>
+        <w:spacing w:line="320" w:lineRule="exact"/>
         <w:rPr>
           <w:rFonts w:ascii="Times New Roman" w:hAnsi="Times New Roman" w:cs="Times New Roman"/>
           <w:sz w:val="24"/>
@@ -6534,6 +6839,7 @@
     </w:p>
     <w:p>
       <w:pPr>
+        <w:spacing w:line="320" w:lineRule="exact"/>
         <w:rPr>
           <w:rFonts w:ascii="Times New Roman" w:hAnsi="Times New Roman" w:cs="Times New Roman"/>
           <w:sz w:val="24"/>
@@ -6544,6 +6850,7 @@
     </w:p>
     <w:p>
       <w:pPr>
+        <w:spacing w:line="320" w:lineRule="exact"/>
         <w:rPr>
           <w:rFonts w:ascii="Times New Roman" w:hAnsi="Times New Roman" w:cs="Times New Roman"/>
           <w:sz w:val="24"/>
@@ -6563,6 +6870,7 @@
     </w:p>
     <w:p>
       <w:pPr>
+        <w:spacing w:line="320" w:lineRule="exact"/>
         <w:rPr>
           <w:rFonts w:ascii="Times New Roman" w:hAnsi="Times New Roman" w:cs="Times New Roman"/>
           <w:sz w:val="24"/>
@@ -6573,6 +6881,7 @@
     </w:p>
     <w:p>
       <w:pPr>
+        <w:spacing w:line="320" w:lineRule="exact"/>
         <w:rPr>
           <w:rFonts w:ascii="Times New Roman" w:hAnsi="Times New Roman" w:cs="Times New Roman"/>
           <w:sz w:val="24"/>
@@ -6592,6 +6901,7 @@
     </w:p>
     <w:p>
       <w:pPr>
+        <w:spacing w:line="320" w:lineRule="exact"/>
         <w:rPr>
           <w:rFonts w:ascii="Times New Roman" w:hAnsi="Times New Roman" w:cs="Times New Roman"/>
           <w:sz w:val="24"/>
@@ -6602,6 +6912,7 @@
     </w:p>
     <w:p>
       <w:pPr>
+        <w:spacing w:line="320" w:lineRule="exact"/>
         <w:rPr>
           <w:rFonts w:ascii="Times New Roman" w:hAnsi="Times New Roman" w:cs="Times New Roman"/>
           <w:sz w:val="24"/>
@@ -6621,6 +6932,7 @@
     </w:p>
     <w:p>
       <w:pPr>
+        <w:spacing w:line="320" w:lineRule="exact"/>
         <w:rPr>
           <w:rFonts w:ascii="Times New Roman" w:hAnsi="Times New Roman" w:cs="Times New Roman"/>
           <w:sz w:val="24"/>
@@ -6631,6 +6943,7 @@
     </w:p>
     <w:p>
       <w:pPr>
+        <w:spacing w:line="320" w:lineRule="exact"/>
         <w:rPr>
           <w:rFonts w:ascii="Times New Roman" w:hAnsi="Times New Roman" w:cs="Times New Roman"/>
           <w:sz w:val="24"/>
@@ -6650,6 +6963,7 @@
     </w:p>
     <w:p>
       <w:pPr>
+        <w:spacing w:line="320" w:lineRule="exact"/>
         <w:rPr>
           <w:rFonts w:ascii="Times New Roman" w:hAnsi="Times New Roman" w:cs="Times New Roman"/>
           <w:sz w:val="24"/>
@@ -6664,6 +6978,7 @@
           <w:szCs w:val="36"/>
           <w:lang w:val="en-US"/>
         </w:rPr>
+        <w:lastRenderedPageBreak/>
         <w:drawing>
           <wp:anchor distT="0" distB="0" distL="114300" distR="114300" simplePos="0" relativeHeight="251667456" behindDoc="0" locked="0" layoutInCell="1" allowOverlap="1" wp14:anchorId="3960FAAC">
             <wp:simplePos x="0" y="0"/>
@@ -6727,54 +7042,6 @@
           <w:szCs w:val="36"/>
           <w:lang w:val="en-US"/>
         </w:rPr>
-        <w:br/>
-      </w:r>
-      <w:r>
-        <w:rPr>
-          <w:rFonts w:ascii="Times New Roman" w:hAnsi="Times New Roman" w:cs="Times New Roman"/>
-          <w:sz w:val="24"/>
-          <w:szCs w:val="36"/>
-          <w:lang w:val="en-US"/>
-        </w:rPr>
-        <w:br/>
-      </w:r>
-    </w:p>
-    <w:p>
-      <w:pPr>
-        <w:rPr>
-          <w:rFonts w:ascii="Times New Roman" w:hAnsi="Times New Roman" w:cs="Times New Roman"/>
-          <w:sz w:val="24"/>
-          <w:szCs w:val="36"/>
-          <w:lang w:val="en-US"/>
-        </w:rPr>
-      </w:pPr>
-      <w:r>
-        <w:rPr>
-          <w:rFonts w:ascii="Times New Roman" w:hAnsi="Times New Roman" w:cs="Times New Roman"/>
-          <w:sz w:val="24"/>
-          <w:szCs w:val="36"/>
-          <w:lang w:val="en-US"/>
-        </w:rPr>
-        <w:br w:type="page"/>
-      </w:r>
-    </w:p>
-    <w:p>
-      <w:pPr>
-        <w:rPr>
-          <w:rFonts w:ascii="Times New Roman" w:hAnsi="Times New Roman" w:cs="Times New Roman"/>
-          <w:sz w:val="24"/>
-          <w:szCs w:val="36"/>
-          <w:lang w:val="en-US"/>
-        </w:rPr>
-      </w:pPr>
-      <w:r>
-        <w:rPr>
-          <w:rFonts w:ascii="Times New Roman" w:hAnsi="Times New Roman" w:cs="Times New Roman"/>
-          <w:sz w:val="24"/>
-          <w:szCs w:val="36"/>
-          <w:lang w:val="en-US"/>
-        </w:rPr>
-        <w:lastRenderedPageBreak/>
         <w:drawing>
           <wp:anchor distT="0" distB="0" distL="114300" distR="114300" simplePos="0" relativeHeight="251668480" behindDoc="0" locked="0" layoutInCell="1" allowOverlap="1" wp14:anchorId="246897CF">
             <wp:simplePos x="0" y="0"/>
@@ -6828,6 +7095,27 @@
     </w:p>
     <w:p>
       <w:pPr>
+        <w:spacing w:line="320" w:lineRule="exact"/>
+        <w:rPr>
+          <w:rFonts w:ascii="Times New Roman" w:hAnsi="Times New Roman" w:cs="Times New Roman"/>
+          <w:sz w:val="24"/>
+          <w:szCs w:val="36"/>
+          <w:lang w:val="en-US"/>
+        </w:rPr>
+      </w:pPr>
+      <w:r>
+        <w:rPr>
+          <w:rFonts w:ascii="Times New Roman" w:hAnsi="Times New Roman" w:cs="Times New Roman"/>
+          <w:sz w:val="24"/>
+          <w:szCs w:val="36"/>
+          <w:lang w:val="en-US"/>
+        </w:rPr>
+        <w:t>Фигура 4.5 Обработка на команда recognize</w:t>
+      </w:r>
+    </w:p>
+    <w:p>
+      <w:pPr>
+        <w:spacing w:line="320" w:lineRule="exact"/>
         <w:rPr>
           <w:rFonts w:ascii="Times New Roman" w:hAnsi="Times New Roman" w:cs="Times New Roman"/>
           <w:sz w:val="32"/>
@@ -6835,44 +7123,47 @@
           <w:lang w:val="en-US"/>
         </w:rPr>
       </w:pPr>
-      <w:r>
-        <w:rPr>
-          <w:rFonts w:ascii="Times New Roman" w:hAnsi="Times New Roman" w:cs="Times New Roman"/>
-          <w:sz w:val="32"/>
-          <w:szCs w:val="36"/>
+    </w:p>
+    <w:p>
+      <w:pPr>
+        <w:pStyle w:val="Heading3"/>
+        <w:spacing w:line="320" w:lineRule="exact"/>
+        <w:rPr>
           <w:lang w:val="en-US"/>
         </w:rPr>
-        <w:t>Фигура 4.5 Обработка на команда recognize</w:t>
-      </w:r>
-    </w:p>
-    <w:p>
-      <w:pPr>
-        <w:rPr>
-          <w:rFonts w:ascii="Times New Roman" w:hAnsi="Times New Roman" w:cs="Times New Roman"/>
-          <w:sz w:val="32"/>
-          <w:szCs w:val="36"/>
+      </w:pPr>
+      <w:bookmarkStart w:id="19" w:name="_Toc229947553"/>
+      <w:r>
+        <w:rPr>
           <w:lang w:val="en-US"/>
         </w:rPr>
-      </w:pPr>
-    </w:p>
-    <w:p>
-      <w:pPr>
-        <w:pStyle w:val="Heading3"/>
-        <w:rPr>
+        <w:t>4.1.5 Реализация на работата с файлове</w:t>
+      </w:r>
+      <w:bookmarkEnd w:id="19"/>
+    </w:p>
+    <w:p>
+      <w:pPr>
+        <w:spacing w:line="320" w:lineRule="exact"/>
+        <w:rPr>
+          <w:rFonts w:ascii="Times New Roman" w:hAnsi="Times New Roman" w:cs="Times New Roman"/>
+          <w:sz w:val="24"/>
+          <w:szCs w:val="36"/>
           <w:lang w:val="en-US"/>
         </w:rPr>
       </w:pPr>
-      <w:bookmarkStart w:id="19" w:name="_Toc229947553"/>
-      <w:r>
-        <w:rPr>
+      <w:r>
+        <w:rPr>
+          <w:rFonts w:ascii="Times New Roman" w:hAnsi="Times New Roman" w:cs="Times New Roman"/>
+          <w:sz w:val="24"/>
+          <w:szCs w:val="36"/>
           <w:lang w:val="en-US"/>
         </w:rPr>
-        <w:t>4.1.5 Реализация на работата с файлове</w:t>
-      </w:r>
-      <w:bookmarkEnd w:id="19"/>
-    </w:p>
-    <w:p>
-      <w:pPr>
+        <w:t>Работата с файлове се реализира чрез класа FileManager.</w:t>
+      </w:r>
+    </w:p>
+    <w:p>
+      <w:pPr>
+        <w:spacing w:line="320" w:lineRule="exact"/>
         <w:rPr>
           <w:rFonts w:ascii="Times New Roman" w:hAnsi="Times New Roman" w:cs="Times New Roman"/>
           <w:sz w:val="24"/>
@@ -6880,28 +7171,30 @@
           <w:lang w:val="en-US"/>
         </w:rPr>
       </w:pPr>
-      <w:r>
+    </w:p>
+    <w:p>
+      <w:pPr>
+        <w:spacing w:line="320" w:lineRule="exact"/>
         <w:rPr>
           <w:rFonts w:ascii="Times New Roman" w:hAnsi="Times New Roman" w:cs="Times New Roman"/>
           <w:sz w:val="24"/>
           <w:szCs w:val="36"/>
           <w:lang w:val="en-US"/>
         </w:rPr>
-        <w:t>Работата с файлове се реализира чрез класа FileManager.</w:t>
-      </w:r>
-    </w:p>
-    <w:p>
-      <w:pPr>
+      </w:pPr>
+      <w:r>
         <w:rPr>
           <w:rFonts w:ascii="Times New Roman" w:hAnsi="Times New Roman" w:cs="Times New Roman"/>
           <w:sz w:val="24"/>
           <w:szCs w:val="36"/>
           <w:lang w:val="en-US"/>
         </w:rPr>
-      </w:pPr>
-    </w:p>
-    <w:p>
-      <w:pPr>
+        <w:t>Класът предоставя операции за отваряне, записване и затваряне на файлове, съдържащи информация за автоматите.</w:t>
+      </w:r>
+    </w:p>
+    <w:p>
+      <w:pPr>
+        <w:spacing w:line="320" w:lineRule="exact"/>
         <w:rPr>
           <w:rFonts w:ascii="Times New Roman" w:hAnsi="Times New Roman" w:cs="Times New Roman"/>
           <w:sz w:val="24"/>
@@ -6909,28 +7202,30 @@
           <w:lang w:val="en-US"/>
         </w:rPr>
       </w:pPr>
-      <w:r>
+    </w:p>
+    <w:p>
+      <w:pPr>
+        <w:spacing w:line="320" w:lineRule="exact"/>
         <w:rPr>
           <w:rFonts w:ascii="Times New Roman" w:hAnsi="Times New Roman" w:cs="Times New Roman"/>
           <w:sz w:val="24"/>
           <w:szCs w:val="36"/>
           <w:lang w:val="en-US"/>
         </w:rPr>
-        <w:t>Класът предоставя операции за отваряне, записване и затваряне на файлове, съдържащи информация за автоматите.</w:t>
-      </w:r>
-    </w:p>
-    <w:p>
-      <w:pPr>
+      </w:pPr>
+      <w:r>
         <w:rPr>
           <w:rFonts w:ascii="Times New Roman" w:hAnsi="Times New Roman" w:cs="Times New Roman"/>
           <w:sz w:val="24"/>
           <w:szCs w:val="36"/>
           <w:lang w:val="en-US"/>
         </w:rPr>
-      </w:pPr>
-    </w:p>
-    <w:p>
-      <w:pPr>
+        <w:t>При отваряне на файл се зареждат автоматите и техните преходи, а при запис информацията се съхранява във файлов формат.</w:t>
+      </w:r>
+    </w:p>
+    <w:p>
+      <w:pPr>
+        <w:spacing w:line="320" w:lineRule="exact"/>
         <w:rPr>
           <w:rFonts w:ascii="Times New Roman" w:hAnsi="Times New Roman" w:cs="Times New Roman"/>
           <w:sz w:val="24"/>
@@ -6938,76 +7233,37 @@
           <w:lang w:val="en-US"/>
         </w:rPr>
       </w:pPr>
-      <w:r>
+    </w:p>
+    <w:p>
+      <w:pPr>
+        <w:spacing w:line="320" w:lineRule="exact"/>
         <w:rPr>
           <w:rFonts w:ascii="Times New Roman" w:hAnsi="Times New Roman" w:cs="Times New Roman"/>
           <w:sz w:val="24"/>
           <w:szCs w:val="36"/>
           <w:lang w:val="en-US"/>
         </w:rPr>
-        <w:t>При отваряне на файл се зареждат автоматите и техните преходи, а при запис информацията се съхранява във файлов формат.</w:t>
-      </w:r>
-    </w:p>
-    <w:p>
-      <w:pPr>
+      </w:pPr>
+      <w:r>
         <w:rPr>
           <w:rFonts w:ascii="Times New Roman" w:hAnsi="Times New Roman" w:cs="Times New Roman"/>
           <w:sz w:val="24"/>
           <w:szCs w:val="36"/>
           <w:lang w:val="en-US"/>
         </w:rPr>
-      </w:pPr>
-    </w:p>
-    <w:p>
-      <w:pPr>
-        <w:rPr>
-          <w:rFonts w:ascii="Times New Roman" w:hAnsi="Times New Roman" w:cs="Times New Roman"/>
-          <w:sz w:val="24"/>
-          <w:szCs w:val="36"/>
-          <w:lang w:val="en-US"/>
-        </w:rPr>
-      </w:pPr>
-      <w:r>
-        <w:rPr>
-          <w:rFonts w:ascii="Times New Roman" w:hAnsi="Times New Roman" w:cs="Times New Roman"/>
-          <w:sz w:val="24"/>
-          <w:szCs w:val="36"/>
-          <w:lang w:val="en-US"/>
-        </w:rPr>
         <w:lastRenderedPageBreak/>
-        <w:t>Чрез класа се реализират командите open, save, save as и close.</w:t>
-      </w:r>
-    </w:p>
-    <w:p>
-      <w:pPr>
-        <w:rPr>
-          <w:rFonts w:ascii="Times New Roman" w:hAnsi="Times New Roman" w:cs="Times New Roman"/>
-          <w:sz w:val="24"/>
-          <w:szCs w:val="36"/>
-          <w:lang w:val="en-US"/>
-        </w:rPr>
-      </w:pPr>
-    </w:p>
-    <w:p>
-      <w:pPr>
-        <w:rPr>
-          <w:rFonts w:ascii="Times New Roman" w:hAnsi="Times New Roman" w:cs="Times New Roman"/>
-          <w:sz w:val="24"/>
-          <w:szCs w:val="36"/>
-          <w:lang w:val="en-US"/>
-        </w:rPr>
-      </w:pPr>
-      <w:r>
-        <w:rPr>
-          <w:rFonts w:ascii="Times New Roman" w:hAnsi="Times New Roman" w:cs="Times New Roman"/>
-          <w:sz w:val="24"/>
-          <w:szCs w:val="36"/>
-          <w:lang w:val="en-US"/>
-        </w:rPr>
         <w:drawing>
-          <wp:inline distT="0" distB="0" distL="0" distR="0" wp14:anchorId="6C760818" wp14:editId="34CBC629">
+          <wp:anchor distT="0" distB="0" distL="114300" distR="114300" simplePos="0" relativeHeight="251683840" behindDoc="0" locked="0" layoutInCell="1" allowOverlap="1" wp14:anchorId="6C760818">
+            <wp:simplePos x="0" y="0"/>
+            <wp:positionH relativeFrom="margin">
+              <wp:align>right</wp:align>
+            </wp:positionH>
+            <wp:positionV relativeFrom="paragraph">
+              <wp:posOffset>466725</wp:posOffset>
+            </wp:positionV>
             <wp:extent cx="5943600" cy="5398135"/>
             <wp:effectExtent l="0" t="0" r="0" b="0"/>
+            <wp:wrapSquare wrapText="bothSides"/>
             <wp:docPr id="5" name="Picture 5"/>
             <wp:cNvGraphicFramePr>
               <a:graphicFrameLocks xmlns:a="http://schemas.openxmlformats.org/drawingml/2006/main" noChangeAspect="1"/>
@@ -7020,7 +7276,13 @@
                     <pic:cNvPicPr/>
                   </pic:nvPicPr>
                   <pic:blipFill>
-                    <a:blip r:embed="rId19"/>
+                    <a:blip r:embed="rId19">
+                      <a:extLst>
+                        <a:ext uri="{28A0092B-C50C-407E-A947-70E740481C1C}">
+                          <a14:useLocalDpi xmlns:a14="http://schemas.microsoft.com/office/drawing/2010/main" val="0"/>
+                        </a:ext>
+                      </a:extLst>
+                    </a:blip>
                     <a:stretch>
                       <a:fillRect/>
                     </a:stretch>
@@ -7037,22 +7299,22 @@
                 </pic:pic>
               </a:graphicData>
             </a:graphic>
-          </wp:inline>
+          </wp:anchor>
         </w:drawing>
       </w:r>
-    </w:p>
-    <w:p>
-      <w:pPr>
+      <w:r>
         <w:rPr>
           <w:rFonts w:ascii="Times New Roman" w:hAnsi="Times New Roman" w:cs="Times New Roman"/>
           <w:sz w:val="24"/>
           <w:szCs w:val="36"/>
           <w:lang w:val="en-US"/>
         </w:rPr>
-      </w:pPr>
-    </w:p>
-    <w:p>
-      <w:pPr>
+        <w:t>Чрез класа се реализират командите open, save, save as и close.</w:t>
+      </w:r>
+    </w:p>
+    <w:p>
+      <w:pPr>
+        <w:spacing w:line="320" w:lineRule="exact"/>
         <w:rPr>
           <w:rFonts w:ascii="Times New Roman" w:hAnsi="Times New Roman" w:cs="Times New Roman"/>
           <w:sz w:val="24"/>
@@ -7060,13 +7322,70 @@
           <w:lang w:val="en-US"/>
         </w:rPr>
       </w:pPr>
-      <w:r>
+    </w:p>
+    <w:p>
+      <w:pPr>
+        <w:spacing w:line="320" w:lineRule="exact"/>
         <w:rPr>
           <w:rFonts w:ascii="Times New Roman" w:hAnsi="Times New Roman" w:cs="Times New Roman"/>
           <w:sz w:val="24"/>
           <w:szCs w:val="36"/>
           <w:lang w:val="en-US"/>
         </w:rPr>
+      </w:pPr>
+      <w:r>
+        <w:rPr>
+          <w:rFonts w:ascii="Times New Roman" w:hAnsi="Times New Roman" w:cs="Times New Roman"/>
+          <w:sz w:val="24"/>
+          <w:szCs w:val="36"/>
+          <w:lang w:val="en-US"/>
+        </w:rPr>
+        <w:t>Фигура 4.</w:t>
+      </w:r>
+      <w:r>
+        <w:rPr>
+          <w:rFonts w:ascii="Times New Roman" w:hAnsi="Times New Roman" w:cs="Times New Roman"/>
+          <w:sz w:val="24"/>
+          <w:szCs w:val="36"/>
+          <w:lang w:val="en-US"/>
+        </w:rPr>
+        <w:t>6</w:t>
+      </w:r>
+      <w:r>
+        <w:rPr>
+          <w:rFonts w:ascii="Times New Roman" w:hAnsi="Times New Roman" w:cs="Times New Roman"/>
+          <w:sz w:val="24"/>
+          <w:szCs w:val="36"/>
+          <w:lang w:val="en-US"/>
+        </w:rPr>
+        <w:t xml:space="preserve"> Метод openFile() за работа с файлове</w:t>
+      </w:r>
+    </w:p>
+    <w:p>
+      <w:pPr>
+        <w:rPr>
+          <w:rFonts w:ascii="Times New Roman" w:hAnsi="Times New Roman" w:cs="Times New Roman"/>
+          <w:sz w:val="24"/>
+          <w:szCs w:val="36"/>
+          <w:lang w:val="en-US"/>
+        </w:rPr>
+      </w:pPr>
+    </w:p>
+    <w:p>
+      <w:pPr>
+        <w:rPr>
+          <w:rFonts w:ascii="Times New Roman" w:hAnsi="Times New Roman" w:cs="Times New Roman"/>
+          <w:sz w:val="24"/>
+          <w:szCs w:val="36"/>
+        </w:rPr>
+      </w:pPr>
+      <w:r>
+        <w:rPr>
+          <w:rFonts w:ascii="Times New Roman" w:hAnsi="Times New Roman" w:cs="Times New Roman"/>
+          <w:sz w:val="24"/>
+          <w:szCs w:val="36"/>
+          <w:lang w:val="en-US"/>
+        </w:rPr>
         <w:br w:type="page"/>
       </w:r>
     </w:p>
@@ -7078,6 +7397,7 @@
     <w:p>
       <w:pPr>
         <w:pStyle w:val="Heading1"/>
+        <w:spacing w:line="360" w:lineRule="auto"/>
         <w:rPr>
           <w:lang w:val="en-US"/>
         </w:rPr>
@@ -7094,6 +7414,7 @@
     <w:p>
       <w:pPr>
         <w:pStyle w:val="Heading2"/>
+        <w:spacing w:line="320" w:lineRule="exact"/>
         <w:rPr>
           <w:lang w:val="en-US"/>
         </w:rPr>
@@ -7109,6 +7430,7 @@
     </w:p>
     <w:p>
       <w:pPr>
+        <w:spacing w:line="320" w:lineRule="exact"/>
         <w:jc w:val="both"/>
         <w:rPr>
           <w:rFonts w:ascii="Times New Roman" w:hAnsi="Times New Roman" w:cs="Times New Roman"/>
@@ -7129,6 +7451,7 @@
     </w:p>
     <w:p>
       <w:pPr>
+        <w:spacing w:line="320" w:lineRule="exact"/>
         <w:jc w:val="both"/>
         <w:rPr>
           <w:rFonts w:ascii="Times New Roman" w:hAnsi="Times New Roman" w:cs="Times New Roman"/>
@@ -7140,6 +7463,7 @@
     </w:p>
     <w:p>
       <w:pPr>
+        <w:spacing w:line="320" w:lineRule="exact"/>
         <w:jc w:val="both"/>
         <w:rPr>
           <w:rFonts w:ascii="Times New Roman" w:hAnsi="Times New Roman" w:cs="Times New Roman"/>
@@ -7275,6 +7599,7 @@
     <w:p>
       <w:pPr>
         <w:pStyle w:val="Heading2"/>
+        <w:spacing w:line="320" w:lineRule="exact"/>
       </w:pPr>
       <w:bookmarkStart w:id="22" w:name="_Toc229947556"/>
       <w:r>
@@ -7284,6 +7609,7 @@
     </w:p>
     <w:p>
       <w:pPr>
+        <w:spacing w:line="320" w:lineRule="exact"/>
         <w:rPr>
           <w:rFonts w:ascii="Times New Roman" w:hAnsi="Times New Roman" w:cs="Times New Roman"/>
           <w:sz w:val="24"/>
@@ -7301,6 +7627,7 @@
     </w:p>
     <w:p>
       <w:pPr>
+        <w:spacing w:line="320" w:lineRule="exact"/>
         <w:rPr>
           <w:rFonts w:ascii="Times New Roman" w:hAnsi="Times New Roman" w:cs="Times New Roman"/>
           <w:sz w:val="24"/>
@@ -7522,6 +7849,7 @@
     <w:p>
       <w:pPr>
         <w:pStyle w:val="Heading2"/>
+        <w:spacing w:line="320" w:lineRule="exact"/>
       </w:pPr>
       <w:bookmarkStart w:id="23" w:name="_Toc229947557"/>
       <w:r>
@@ -7532,6 +7860,7 @@
     </w:p>
     <w:p>
       <w:pPr>
+        <w:spacing w:line="320" w:lineRule="exact"/>
         <w:rPr>
           <w:rFonts w:ascii="Times New Roman" w:hAnsi="Times New Roman" w:cs="Times New Roman"/>
           <w:sz w:val="24"/>
@@ -7549,15 +7878,17 @@
     </w:p>
     <w:p>
       <w:pPr>
-        <w:rPr>
-          <w:rFonts w:ascii="Times New Roman" w:hAnsi="Times New Roman" w:cs="Times New Roman"/>
-          <w:sz w:val="24"/>
-          <w:szCs w:val="36"/>
-        </w:rPr>
-      </w:pPr>
-    </w:p>
-    <w:p>
-      <w:pPr>
+        <w:spacing w:line="320" w:lineRule="exact"/>
+        <w:rPr>
+          <w:rFonts w:ascii="Times New Roman" w:hAnsi="Times New Roman" w:cs="Times New Roman"/>
+          <w:sz w:val="24"/>
+          <w:szCs w:val="36"/>
+        </w:rPr>
+      </w:pPr>
+    </w:p>
+    <w:p>
+      <w:pPr>
+        <w:spacing w:line="320" w:lineRule="exact"/>
         <w:rPr>
           <w:rFonts w:ascii="Times New Roman" w:hAnsi="Times New Roman" w:cs="Times New Roman"/>
           <w:sz w:val="24"/>
@@ -7575,15 +7906,17 @@
     </w:p>
     <w:p>
       <w:pPr>
-        <w:rPr>
-          <w:rFonts w:ascii="Times New Roman" w:hAnsi="Times New Roman" w:cs="Times New Roman"/>
-          <w:sz w:val="24"/>
-          <w:szCs w:val="36"/>
-        </w:rPr>
-      </w:pPr>
-    </w:p>
-    <w:p>
-      <w:pPr>
+        <w:spacing w:line="320" w:lineRule="exact"/>
+        <w:rPr>
+          <w:rFonts w:ascii="Times New Roman" w:hAnsi="Times New Roman" w:cs="Times New Roman"/>
+          <w:sz w:val="24"/>
+          <w:szCs w:val="36"/>
+        </w:rPr>
+      </w:pPr>
+    </w:p>
+    <w:p>
+      <w:pPr>
+        <w:spacing w:line="320" w:lineRule="exact"/>
         <w:rPr>
           <w:rFonts w:ascii="Times New Roman" w:hAnsi="Times New Roman" w:cs="Times New Roman"/>
           <w:sz w:val="24"/>
@@ -7744,16 +8077,6 @@
       <w:pPr>
         <w:rPr>
           <w:rFonts w:ascii="Times New Roman" w:hAnsi="Times New Roman" w:cs="Times New Roman"/>
-          <w:b/>
-          <w:sz w:val="24"/>
-          <w:szCs w:val="36"/>
-        </w:rPr>
-      </w:pPr>
-    </w:p>
-    <w:p>
-      <w:pPr>
-        <w:rPr>
-          <w:rFonts w:ascii="Times New Roman" w:hAnsi="Times New Roman" w:cs="Times New Roman"/>
           <w:sz w:val="24"/>
           <w:szCs w:val="36"/>
         </w:rPr>
@@ -7780,6 +8103,7 @@
     <w:p>
       <w:pPr>
         <w:pStyle w:val="Heading2"/>
+        <w:spacing w:line="320" w:lineRule="exact"/>
       </w:pPr>
       <w:bookmarkStart w:id="24" w:name="_Toc229947558"/>
       <w:r>
@@ -7789,6 +8113,7 @@
     </w:p>
     <w:p>
       <w:pPr>
+        <w:spacing w:line="320" w:lineRule="exact"/>
         <w:rPr>
           <w:rFonts w:ascii="Times New Roman" w:hAnsi="Times New Roman" w:cs="Times New Roman"/>
           <w:sz w:val="24"/>
@@ -7806,15 +8131,17 @@
     </w:p>
     <w:p>
       <w:pPr>
-        <w:rPr>
-          <w:rFonts w:ascii="Times New Roman" w:hAnsi="Times New Roman" w:cs="Times New Roman"/>
-          <w:sz w:val="24"/>
-          <w:szCs w:val="36"/>
-        </w:rPr>
-      </w:pPr>
-    </w:p>
-    <w:p>
-      <w:pPr>
+        <w:spacing w:line="320" w:lineRule="exact"/>
+        <w:rPr>
+          <w:rFonts w:ascii="Times New Roman" w:hAnsi="Times New Roman" w:cs="Times New Roman"/>
+          <w:sz w:val="24"/>
+          <w:szCs w:val="36"/>
+        </w:rPr>
+      </w:pPr>
+    </w:p>
+    <w:p>
+      <w:pPr>
+        <w:spacing w:line="320" w:lineRule="exact"/>
         <w:rPr>
           <w:rFonts w:ascii="Times New Roman" w:hAnsi="Times New Roman" w:cs="Times New Roman"/>
           <w:sz w:val="24"/>
@@ -7939,6 +8266,7 @@
     <w:p>
       <w:pPr>
         <w:pStyle w:val="Heading2"/>
+        <w:spacing w:line="320" w:lineRule="exact"/>
       </w:pPr>
       <w:bookmarkStart w:id="25" w:name="_Toc229947559"/>
       <w:r>
@@ -7948,6 +8276,7 @@
     </w:p>
     <w:p>
       <w:pPr>
+        <w:spacing w:line="320" w:lineRule="exact"/>
         <w:rPr>
           <w:rFonts w:ascii="Times New Roman" w:hAnsi="Times New Roman" w:cs="Times New Roman"/>
           <w:sz w:val="24"/>
@@ -7965,15 +8294,17 @@
     </w:p>
     <w:p>
       <w:pPr>
-        <w:rPr>
-          <w:rFonts w:ascii="Times New Roman" w:hAnsi="Times New Roman" w:cs="Times New Roman"/>
-          <w:sz w:val="24"/>
-          <w:szCs w:val="36"/>
-        </w:rPr>
-      </w:pPr>
-    </w:p>
-    <w:p>
-      <w:pPr>
+        <w:spacing w:line="320" w:lineRule="exact"/>
+        <w:rPr>
+          <w:rFonts w:ascii="Times New Roman" w:hAnsi="Times New Roman" w:cs="Times New Roman"/>
+          <w:sz w:val="24"/>
+          <w:szCs w:val="36"/>
+        </w:rPr>
+      </w:pPr>
+    </w:p>
+    <w:p>
+      <w:pPr>
+        <w:spacing w:line="320" w:lineRule="exact"/>
         <w:rPr>
           <w:rFonts w:ascii="Times New Roman" w:hAnsi="Times New Roman" w:cs="Times New Roman"/>
           <w:sz w:val="24"/>
@@ -8083,6 +8414,7 @@
     <w:p>
       <w:pPr>
         <w:pStyle w:val="Heading2"/>
+        <w:spacing w:line="320" w:lineRule="exact"/>
         <w:rPr>
           <w:sz w:val="40"/>
           <w:szCs w:val="36"/>
@@ -8100,6 +8432,7 @@
         <w:tabs>
           <w:tab w:val="left" w:pos="1980"/>
         </w:tabs>
+        <w:spacing w:line="320" w:lineRule="exact"/>
         <w:jc w:val="both"/>
         <w:rPr>
           <w:rFonts w:ascii="Times New Roman" w:hAnsi="Times New Roman" w:cs="Times New Roman"/>
@@ -8121,6 +8454,7 @@
         <w:tabs>
           <w:tab w:val="left" w:pos="1980"/>
         </w:tabs>
+        <w:spacing w:line="320" w:lineRule="exact"/>
         <w:jc w:val="both"/>
         <w:rPr>
           <w:rFonts w:ascii="Times New Roman" w:hAnsi="Times New Roman" w:cs="Times New Roman"/>
@@ -8134,6 +8468,7 @@
         <w:tabs>
           <w:tab w:val="left" w:pos="1980"/>
         </w:tabs>
+        <w:spacing w:line="320" w:lineRule="exact"/>
         <w:jc w:val="both"/>
         <w:rPr>
           <w:rFonts w:ascii="Times New Roman" w:hAnsi="Times New Roman" w:cs="Times New Roman"/>
@@ -8236,6 +8571,7 @@
     </w:p>
     <w:p>
       <w:pPr>
+        <w:spacing w:line="320" w:lineRule="exact"/>
         <w:rPr>
           <w:rFonts w:ascii="Times New Roman" w:hAnsi="Times New Roman" w:cs="Times New Roman"/>
           <w:sz w:val="24"/>
@@ -8254,41 +8590,68 @@
     <w:p>
       <w:pPr>
         <w:pStyle w:val="Heading2"/>
+        <w:spacing w:line="320" w:lineRule="exact"/>
       </w:pPr>
       <w:bookmarkStart w:id="27" w:name="_Toc229947561"/>
       <w:r>
-        <w:t>5.7 Тестване на операцията positive closure</w:t>
+        <w:t xml:space="preserve">5.7 Тестване на операцията </w:t>
+      </w:r>
+      <w:r>
+        <w:rPr>
+          <w:i/>
+        </w:rPr>
+        <w:t>positive closure</w:t>
       </w:r>
       <w:bookmarkEnd w:id="27"/>
     </w:p>
     <w:p>
       <w:pPr>
-        <w:rPr>
-          <w:rFonts w:ascii="Times New Roman" w:hAnsi="Times New Roman" w:cs="Times New Roman"/>
-          <w:sz w:val="24"/>
-          <w:szCs w:val="24"/>
-        </w:rPr>
-      </w:pPr>
-      <w:r>
-        <w:rPr>
-          <w:rFonts w:ascii="Times New Roman" w:hAnsi="Times New Roman" w:cs="Times New Roman"/>
-          <w:sz w:val="24"/>
-          <w:szCs w:val="24"/>
-        </w:rPr>
-        <w:t>Извършени са тестове за операцията positive closure върху автомат.</w:t>
-      </w:r>
-    </w:p>
-    <w:p>
-      <w:pPr>
-        <w:rPr>
-          <w:rFonts w:ascii="Times New Roman" w:hAnsi="Times New Roman" w:cs="Times New Roman"/>
-          <w:sz w:val="24"/>
-          <w:szCs w:val="24"/>
-        </w:rPr>
-      </w:pPr>
-    </w:p>
-    <w:p>
-      <w:pPr>
+        <w:spacing w:line="320" w:lineRule="exact"/>
+        <w:rPr>
+          <w:rFonts w:ascii="Times New Roman" w:hAnsi="Times New Roman" w:cs="Times New Roman"/>
+          <w:sz w:val="24"/>
+          <w:szCs w:val="24"/>
+        </w:rPr>
+      </w:pPr>
+      <w:r>
+        <w:rPr>
+          <w:rFonts w:ascii="Times New Roman" w:hAnsi="Times New Roman" w:cs="Times New Roman"/>
+          <w:sz w:val="24"/>
+          <w:szCs w:val="24"/>
+        </w:rPr>
+        <w:t xml:space="preserve">Извършени са тестове за операцията </w:t>
+      </w:r>
+      <w:r>
+        <w:rPr>
+          <w:rFonts w:ascii="Times New Roman" w:hAnsi="Times New Roman" w:cs="Times New Roman"/>
+          <w:i/>
+          <w:sz w:val="24"/>
+          <w:szCs w:val="24"/>
+        </w:rPr>
+        <w:t>positive closure</w:t>
+      </w:r>
+      <w:r>
+        <w:rPr>
+          <w:rFonts w:ascii="Times New Roman" w:hAnsi="Times New Roman" w:cs="Times New Roman"/>
+          <w:sz w:val="24"/>
+          <w:szCs w:val="24"/>
+        </w:rPr>
+        <w:t xml:space="preserve"> върху автомат.</w:t>
+      </w:r>
+    </w:p>
+    <w:p>
+      <w:pPr>
+        <w:spacing w:line="320" w:lineRule="exact"/>
+        <w:rPr>
+          <w:rFonts w:ascii="Times New Roman" w:hAnsi="Times New Roman" w:cs="Times New Roman"/>
+          <w:sz w:val="24"/>
+          <w:szCs w:val="24"/>
+        </w:rPr>
+      </w:pPr>
+    </w:p>
+    <w:p>
+      <w:pPr>
+        <w:spacing w:line="320" w:lineRule="exact"/>
         <w:rPr>
           <w:rFonts w:ascii="Times New Roman" w:hAnsi="Times New Roman" w:cs="Times New Roman"/>
           <w:sz w:val="24"/>
@@ -8388,24 +8751,35 @@
     </w:p>
     <w:p>
       <w:pPr>
-        <w:rPr>
-          <w:rFonts w:ascii="Times New Roman" w:hAnsi="Times New Roman" w:cs="Times New Roman"/>
-          <w:sz w:val="24"/>
-          <w:szCs w:val="24"/>
-        </w:rPr>
-      </w:pPr>
-      <w:r>
-        <w:rPr>
-          <w:rFonts w:ascii="Times New Roman" w:hAnsi="Times New Roman" w:cs="Times New Roman"/>
-          <w:sz w:val="24"/>
-          <w:szCs w:val="24"/>
-        </w:rPr>
-        <w:t>Фигура 5.7 Тестване на операцията positive closure</w:t>
+        <w:spacing w:line="320" w:lineRule="exact"/>
+        <w:rPr>
+          <w:rFonts w:ascii="Times New Roman" w:hAnsi="Times New Roman" w:cs="Times New Roman"/>
+          <w:sz w:val="24"/>
+          <w:szCs w:val="24"/>
+        </w:rPr>
+      </w:pPr>
+      <w:r>
+        <w:rPr>
+          <w:rFonts w:ascii="Times New Roman" w:hAnsi="Times New Roman" w:cs="Times New Roman"/>
+          <w:sz w:val="24"/>
+          <w:szCs w:val="24"/>
+        </w:rPr>
+        <w:t xml:space="preserve">Фигура 5.7 Тестване на операцията </w:t>
+      </w:r>
+      <w:r>
+        <w:rPr>
+          <w:rFonts w:ascii="Times New Roman" w:hAnsi="Times New Roman" w:cs="Times New Roman"/>
+          <w:i/>
+          <w:sz w:val="24"/>
+          <w:szCs w:val="24"/>
+        </w:rPr>
+        <w:t>positive closure</w:t>
       </w:r>
     </w:p>
     <w:p>
       <w:pPr>
         <w:pStyle w:val="Heading2"/>
+        <w:spacing w:line="320" w:lineRule="exact"/>
       </w:pPr>
       <w:bookmarkStart w:id="28" w:name="_Toc229947562"/>
       <w:r>
@@ -8415,6 +8789,7 @@
     </w:p>
     <w:p>
       <w:pPr>
+        <w:spacing w:line="320" w:lineRule="exact"/>
         <w:rPr>
           <w:rFonts w:ascii="Times New Roman" w:hAnsi="Times New Roman" w:cs="Times New Roman"/>
           <w:sz w:val="24"/>
@@ -8432,15 +8807,17 @@
     </w:p>
     <w:p>
       <w:pPr>
-        <w:rPr>
-          <w:rFonts w:ascii="Times New Roman" w:hAnsi="Times New Roman" w:cs="Times New Roman"/>
-          <w:sz w:val="24"/>
-          <w:szCs w:val="24"/>
-        </w:rPr>
-      </w:pPr>
-    </w:p>
-    <w:p>
-      <w:pPr>
+        <w:spacing w:line="320" w:lineRule="exact"/>
+        <w:rPr>
+          <w:rFonts w:ascii="Times New Roman" w:hAnsi="Times New Roman" w:cs="Times New Roman"/>
+          <w:sz w:val="24"/>
+          <w:szCs w:val="24"/>
+        </w:rPr>
+      </w:pPr>
+    </w:p>
+    <w:p>
+      <w:pPr>
+        <w:spacing w:line="320" w:lineRule="exact"/>
         <w:rPr>
           <w:rFonts w:ascii="Times New Roman" w:hAnsi="Times New Roman" w:cs="Times New Roman"/>
           <w:sz w:val="24"/>
@@ -8542,6 +8919,7 @@
     </w:p>
     <w:p>
       <w:pPr>
+        <w:spacing w:line="320" w:lineRule="exact"/>
         <w:rPr>
           <w:rFonts w:ascii="Times New Roman" w:hAnsi="Times New Roman" w:cs="Times New Roman"/>
           <w:sz w:val="24"/>
@@ -8561,6 +8939,7 @@
     </w:p>
     <w:p>
       <w:pPr>
+        <w:spacing w:line="320" w:lineRule="exact"/>
         <w:rPr>
           <w:rFonts w:ascii="Times New Roman" w:hAnsi="Times New Roman" w:cs="Times New Roman"/>
           <w:sz w:val="24"/>
@@ -8578,6 +8957,7 @@
     </w:p>
     <w:p>
       <w:pPr>
+        <w:spacing w:line="320" w:lineRule="exact"/>
         <w:rPr>
           <w:rFonts w:ascii="Times New Roman" w:hAnsi="Times New Roman" w:cs="Times New Roman"/>
           <w:sz w:val="24"/>
@@ -8588,6 +8968,7 @@
     <w:p>
       <w:pPr>
         <w:pStyle w:val="Heading2"/>
+        <w:spacing w:line="320" w:lineRule="exact"/>
       </w:pPr>
       <w:bookmarkStart w:id="29" w:name="_Toc229947563"/>
       <w:r>
@@ -8597,6 +8978,7 @@
     </w:p>
     <w:p>
       <w:pPr>
+        <w:spacing w:line="320" w:lineRule="exact"/>
         <w:rPr>
           <w:rFonts w:ascii="Times New Roman" w:hAnsi="Times New Roman" w:cs="Times New Roman"/>
           <w:sz w:val="24"/>
@@ -8614,15 +8996,17 @@
     </w:p>
     <w:p>
       <w:pPr>
-        <w:rPr>
-          <w:rFonts w:ascii="Times New Roman" w:hAnsi="Times New Roman" w:cs="Times New Roman"/>
-          <w:sz w:val="24"/>
-          <w:szCs w:val="24"/>
-        </w:rPr>
-      </w:pPr>
-    </w:p>
-    <w:p>
-      <w:pPr>
+        <w:spacing w:line="320" w:lineRule="exact"/>
+        <w:rPr>
+          <w:rFonts w:ascii="Times New Roman" w:hAnsi="Times New Roman" w:cs="Times New Roman"/>
+          <w:sz w:val="24"/>
+          <w:szCs w:val="24"/>
+        </w:rPr>
+      </w:pPr>
+    </w:p>
+    <w:p>
+      <w:pPr>
+        <w:spacing w:line="320" w:lineRule="exact"/>
         <w:rPr>
           <w:rFonts w:ascii="Times New Roman" w:hAnsi="Times New Roman" w:cs="Times New Roman"/>
           <w:sz w:val="24"/>
@@ -8640,6 +9024,7 @@
     </w:p>
     <w:p>
       <w:pPr>
+        <w:spacing w:line="320" w:lineRule="exact"/>
         <w:rPr>
           <w:rFonts w:ascii="Times New Roman" w:hAnsi="Times New Roman" w:cs="Times New Roman"/>
           <w:sz w:val="24"/>
@@ -8711,15 +9096,17 @@
     </w:p>
     <w:p>
       <w:pPr>
-        <w:rPr>
-          <w:rFonts w:ascii="Times New Roman" w:hAnsi="Times New Roman" w:cs="Times New Roman"/>
-          <w:sz w:val="24"/>
-          <w:szCs w:val="24"/>
-        </w:rPr>
-      </w:pPr>
-    </w:p>
-    <w:p>
-      <w:pPr>
+        <w:spacing w:line="320" w:lineRule="exact"/>
+        <w:rPr>
+          <w:rFonts w:ascii="Times New Roman" w:hAnsi="Times New Roman" w:cs="Times New Roman"/>
+          <w:sz w:val="24"/>
+          <w:szCs w:val="24"/>
+        </w:rPr>
+      </w:pPr>
+    </w:p>
+    <w:p>
+      <w:pPr>
+        <w:spacing w:line="320" w:lineRule="exact"/>
         <w:rPr>
           <w:rFonts w:ascii="Times New Roman" w:hAnsi="Times New Roman" w:cs="Times New Roman"/>
           <w:sz w:val="24"/>
@@ -8791,15 +9178,17 @@
     </w:p>
     <w:p>
       <w:pPr>
-        <w:rPr>
-          <w:rFonts w:ascii="Times New Roman" w:hAnsi="Times New Roman" w:cs="Times New Roman"/>
-          <w:sz w:val="24"/>
-          <w:szCs w:val="24"/>
-        </w:rPr>
-      </w:pPr>
-    </w:p>
-    <w:p>
-      <w:pPr>
+        <w:spacing w:line="320" w:lineRule="exact"/>
+        <w:rPr>
+          <w:rFonts w:ascii="Times New Roman" w:hAnsi="Times New Roman" w:cs="Times New Roman"/>
+          <w:sz w:val="24"/>
+          <w:szCs w:val="24"/>
+        </w:rPr>
+      </w:pPr>
+    </w:p>
+    <w:p>
+      <w:pPr>
+        <w:spacing w:line="320" w:lineRule="exact"/>
         <w:rPr>
           <w:rFonts w:ascii="Times New Roman" w:hAnsi="Times New Roman" w:cs="Times New Roman"/>
           <w:sz w:val="24"/>
@@ -8835,6 +9224,7 @@
     <w:p>
       <w:pPr>
         <w:pStyle w:val="Heading1"/>
+        <w:spacing w:line="360" w:lineRule="auto"/>
       </w:pPr>
       <w:bookmarkStart w:id="30" w:name="_Toc229947564"/>
       <w:r>
@@ -8848,7 +9238,7 @@
     </w:p>
     <w:p>
       <w:pPr>
-        <w:spacing w:line="360" w:lineRule="auto"/>
+        <w:spacing w:line="320" w:lineRule="exact"/>
         <w:rPr>
           <w:rFonts w:ascii="Times New Roman" w:hAnsi="Times New Roman" w:cs="Times New Roman"/>
           <w:sz w:val="24"/>
@@ -8874,7 +9264,22 @@
           <w:sz w:val="24"/>
         </w:rPr>
         <w:br/>
-        <w:t>Основната цел на проекта беше създаването на система, позволяваща обработка и управление на крайни автомати чрез команден интерфейс. В процеса на разработката бяха реализирани основните операции върху автоматите, включително разпознаване на думи, проверка за детерминираност, детерминиране, обединение, конкатенация, positive closure и проверка дали езикът на автомата е краен.</w:t>
+        <w:t xml:space="preserve">Основната цел на проекта беше създаването на система, позволяваща обработка и управление на крайни автомати чрез команден интерфейс. В процеса на разработката бяха реализирани основните операции върху автоматите, включително разпознаване на думи, проверка за детерминираност, детерминиране, обединение, конкатенация, </w:t>
+      </w:r>
+      <w:r>
+        <w:rPr>
+          <w:rFonts w:ascii="Times New Roman" w:hAnsi="Times New Roman" w:cs="Times New Roman"/>
+          <w:i/>
+          <w:sz w:val="24"/>
+        </w:rPr>
+        <w:t>positive closure</w:t>
+      </w:r>
+      <w:r>
+        <w:rPr>
+          <w:rFonts w:ascii="Times New Roman" w:hAnsi="Times New Roman" w:cs="Times New Roman"/>
+          <w:sz w:val="24"/>
+        </w:rPr>
+        <w:t xml:space="preserve"> и проверка дали езикът на автомата е краен.</w:t>
       </w:r>
       <w:r>
         <w:rPr>
@@ -8889,7 +9294,22 @@
           <w:sz w:val="24"/>
         </w:rPr>
         <w:br/>
-        <w:t>За реализацията на проекта бяха използвани различни алгоритми за обработка на преходи, ε-преходи и множества от състояния. Реализирана беше поддръжка на недетерминирани автомати чрез използване на множество текущи състояния и алгоритъм за epsilon closure.</w:t>
+        <w:t xml:space="preserve">За реализацията на проекта бяха използвани различни алгоритми за обработка на преходи, ε-преходи и множества от състояния. Реализирана беше поддръжка на недетерминирани автомати чрез използване на множество текущи състояния и алгоритъм за </w:t>
+      </w:r>
+      <w:r>
+        <w:rPr>
+          <w:rFonts w:ascii="Times New Roman" w:hAnsi="Times New Roman" w:cs="Times New Roman"/>
+          <w:i/>
+          <w:sz w:val="24"/>
+        </w:rPr>
+        <w:t>epsilon closure</w:t>
+      </w:r>
+      <w:r>
+        <w:rPr>
+          <w:rFonts w:ascii="Times New Roman" w:hAnsi="Times New Roman" w:cs="Times New Roman"/>
+          <w:sz w:val="24"/>
+        </w:rPr>
+        <w:t>.</w:t>
       </w:r>
       <w:r>
         <w:rPr>
@@ -8949,15 +9369,40 @@
           <w:sz w:val="24"/>
         </w:rPr>
         <w:br/>
-        <w:t xml:space="preserve">Разработеното приложение демонстрира практическото приложение на алгоритмите за </w:t>
-      </w:r>
-      <w:r>
-        <w:rPr>
-          <w:rFonts w:ascii="Times New Roman" w:hAnsi="Times New Roman" w:cs="Times New Roman"/>
-          <w:sz w:val="24"/>
-        </w:rPr>
-        <w:lastRenderedPageBreak/>
-        <w:t>работа с крайни автомати и може да бъде използвано като основа за бъдещо разширяване и добавяне на нови функционалности.</w:t>
+        <w:t>Разработеното приложение демонстрира практическото приложение на алгоритмите за работа с крайни автомати и може да бъде използвано като основа за бъдещо разширяване и добавяне на нови функционалности.</w:t>
+      </w:r>
+    </w:p>
+    <w:p>
+      <w:pPr>
+        <w:spacing w:line="320" w:lineRule="exact"/>
+        <w:rPr>
+          <w:rFonts w:ascii="Times New Roman" w:hAnsi="Times New Roman" w:cs="Times New Roman"/>
+          <w:sz w:val="24"/>
+        </w:rPr>
+      </w:pPr>
+    </w:p>
+    <w:p>
+      <w:pPr>
+        <w:spacing w:line="320" w:lineRule="exact"/>
+        <w:rPr>
+          <w:rFonts w:ascii="Times New Roman" w:hAnsi="Times New Roman" w:cs="Times New Roman"/>
+          <w:sz w:val="24"/>
+        </w:rPr>
+      </w:pPr>
+      <w:r>
+        <w:rPr>
+          <w:rFonts w:ascii="Times New Roman" w:hAnsi="Times New Roman" w:cs="Times New Roman"/>
+          <w:sz w:val="24"/>
+        </w:rPr>
+        <w:t>Изходният код на проекта е публикуван в GitHub repository.</w:t>
+      </w:r>
+      <w:r>
+        <w:rPr>
+          <w:rFonts w:ascii="Times New Roman" w:hAnsi="Times New Roman" w:cs="Times New Roman"/>
+          <w:sz w:val="24"/>
+          <w:lang w:val="en-US"/>
+        </w:rPr>
+        <w:t>[12]</w:t>
       </w:r>
       <w:r>
         <w:rPr>
@@ -8985,6 +9430,7 @@
     <w:p>
       <w:pPr>
         <w:pStyle w:val="Heading1"/>
+        <w:spacing w:line="360" w:lineRule="auto"/>
       </w:pPr>
       <w:bookmarkStart w:id="31" w:name="_Toc229947565"/>
       <w:r>
@@ -8995,148 +9441,207 @@
     </w:p>
     <w:p>
       <w:pPr>
-        <w:rPr>
-          <w:rFonts w:ascii="Times New Roman" w:hAnsi="Times New Roman" w:cs="Times New Roman"/>
-        </w:rPr>
-      </w:pPr>
-      <w:r>
-        <w:rPr>
-          <w:rFonts w:ascii="Times New Roman" w:hAnsi="Times New Roman" w:cs="Times New Roman"/>
-        </w:rPr>
-        <w:t>1. Oracle Java Documentation – https://docs.oracle.com/javase/</w:t>
-      </w:r>
-    </w:p>
-    <w:p>
-      <w:pPr>
-        <w:rPr>
-          <w:rFonts w:ascii="Times New Roman" w:hAnsi="Times New Roman" w:cs="Times New Roman"/>
-        </w:rPr>
-      </w:pPr>
-      <w:r>
-        <w:rPr>
-          <w:rFonts w:ascii="Times New Roman" w:hAnsi="Times New Roman" w:cs="Times New Roman"/>
-        </w:rPr>
-        <w:t>2. GeeksforGeeks – NFA to DFA Conversion – https://www.geeksforgeeks.org/theory-of-computation/program-implement-nfa-epsilon-move-dfa-conversion/</w:t>
-      </w:r>
-    </w:p>
-    <w:p>
-      <w:pPr>
-        <w:rPr>
-          <w:rFonts w:ascii="Times New Roman" w:hAnsi="Times New Roman" w:cs="Times New Roman"/>
-        </w:rPr>
-      </w:pPr>
-      <w:r>
-        <w:rPr>
-          <w:rFonts w:ascii="Times New Roman" w:hAnsi="Times New Roman" w:cs="Times New Roman"/>
-        </w:rPr>
-        <w:t>3. GeeksforGeeks – Finite Automata and Regular Expressions – https://www.geeksforgeeks.org/finite-automata-and-regular-expressions/</w:t>
-      </w:r>
-    </w:p>
-    <w:p>
-      <w:pPr>
-        <w:rPr>
-          <w:rFonts w:ascii="Times New Roman" w:hAnsi="Times New Roman" w:cs="Times New Roman"/>
-        </w:rPr>
-      </w:pPr>
-      <w:r>
-        <w:rPr>
-          <w:rFonts w:ascii="Times New Roman" w:hAnsi="Times New Roman" w:cs="Times New Roman"/>
-        </w:rPr>
-        <w:t>4. TutorialsPoint – Automata Theory – https://www.tutorialspoint.com/automata_theory/</w:t>
-      </w:r>
-    </w:p>
-    <w:p>
-      <w:pPr>
-        <w:rPr>
-          <w:rFonts w:ascii="Times New Roman" w:hAnsi="Times New Roman" w:cs="Times New Roman"/>
-        </w:rPr>
-      </w:pPr>
-      <w:r>
-        <w:rPr>
-          <w:rFonts w:ascii="Times New Roman" w:hAnsi="Times New Roman" w:cs="Times New Roman"/>
-        </w:rPr>
-        <w:t>5. Javatpoint – Nondeterministic Finite Automata – https://www.javatpoint.com/automata-nfa</w:t>
-      </w:r>
-    </w:p>
-    <w:p>
-      <w:pPr>
-        <w:rPr>
-          <w:rFonts w:ascii="Times New Roman" w:hAnsi="Times New Roman" w:cs="Times New Roman"/>
-        </w:rPr>
-      </w:pPr>
-      <w:r>
-        <w:rPr>
-          <w:rFonts w:ascii="Times New Roman" w:hAnsi="Times New Roman" w:cs="Times New Roman"/>
-        </w:rPr>
-        <w:t>6. Baeldung – Java Collections Framework – https://www.baeldung.com/java-collections</w:t>
-      </w:r>
-    </w:p>
-    <w:p>
-      <w:pPr>
-        <w:rPr>
-          <w:rFonts w:ascii="Times New Roman" w:hAnsi="Times New Roman" w:cs="Times New Roman"/>
-        </w:rPr>
-      </w:pPr>
-      <w:r>
-        <w:rPr>
-          <w:rFonts w:ascii="Times New Roman" w:hAnsi="Times New Roman" w:cs="Times New Roman"/>
-        </w:rPr>
-        <w:t>7. Programiz – Java HashSet – https://www.programiz.com/java-programming/hashset</w:t>
-      </w:r>
-    </w:p>
-    <w:p>
-      <w:pPr>
-        <w:rPr>
-          <w:rFonts w:ascii="Times New Roman" w:hAnsi="Times New Roman" w:cs="Times New Roman"/>
-        </w:rPr>
-      </w:pPr>
-      <w:r>
-        <w:rPr>
-          <w:rFonts w:ascii="Times New Roman" w:hAnsi="Times New Roman" w:cs="Times New Roman"/>
-        </w:rPr>
-        <w:t>8. TutorialsPoint – Java File Handling – https://www.tutorialspoint.com/java/java_files_io.htm</w:t>
-      </w:r>
-    </w:p>
-    <w:p>
-      <w:pPr>
-        <w:rPr>
-          <w:rFonts w:ascii="Times New Roman" w:hAnsi="Times New Roman" w:cs="Times New Roman"/>
-        </w:rPr>
-      </w:pPr>
-      <w:r>
-        <w:rPr>
-          <w:rFonts w:ascii="Times New Roman" w:hAnsi="Times New Roman" w:cs="Times New Roman"/>
-        </w:rPr>
-        <w:t>9. GeeksforGeeks – Depth First Search Algorithm – https://www.geeksforgeeks.org/depth-first-search-or-dfs-for-a-graph/</w:t>
-      </w:r>
-    </w:p>
-    <w:p>
-      <w:pPr>
-        <w:rPr>
-          <w:rFonts w:ascii="Times New Roman" w:hAnsi="Times New Roman" w:cs="Times New Roman"/>
-        </w:rPr>
-      </w:pPr>
-      <w:r>
-        <w:rPr>
-          <w:rFonts w:ascii="Times New Roman" w:hAnsi="Times New Roman" w:cs="Times New Roman"/>
-        </w:rPr>
-        <w:t>10. Oracle Java Documentation – Scanner Class – https://docs.oracle.com/javase/8/docs/api/java/util/Scanner.html</w:t>
-      </w:r>
-    </w:p>
-    <w:p>
-      <w:pPr>
-        <w:rPr>
-          <w:rFonts w:ascii="Times New Roman" w:hAnsi="Times New Roman" w:cs="Times New Roman"/>
-          <w:b/>
-          <w:sz w:val="48"/>
-          <w:szCs w:val="24"/>
-        </w:rPr>
-      </w:pPr>
-      <w:r>
-        <w:rPr>
-          <w:rFonts w:ascii="Times New Roman" w:hAnsi="Times New Roman" w:cs="Times New Roman"/>
-        </w:rPr>
-        <w:t>11. Материали и упражнения по дисциплината „Обектно-ориентирано програмиране“</w:t>
+        <w:spacing w:line="320" w:lineRule="exact"/>
+        <w:rPr>
+          <w:rFonts w:ascii="Times New Roman" w:hAnsi="Times New Roman" w:cs="Times New Roman"/>
+        </w:rPr>
+      </w:pPr>
+      <w:r>
+        <w:t xml:space="preserve">[1] </w:t>
+      </w:r>
+      <w:r>
+        <w:rPr>
+          <w:rFonts w:ascii="Times New Roman" w:hAnsi="Times New Roman" w:cs="Times New Roman"/>
+        </w:rPr>
+        <w:t>Oracle Java Documentation – https://docs.oracle.com/javase/</w:t>
+      </w:r>
+    </w:p>
+    <w:p>
+      <w:pPr>
+        <w:spacing w:line="320" w:lineRule="exact"/>
+        <w:rPr>
+          <w:rFonts w:ascii="Times New Roman" w:hAnsi="Times New Roman" w:cs="Times New Roman"/>
+        </w:rPr>
+      </w:pPr>
+      <w:r>
+        <w:t xml:space="preserve">[2] </w:t>
+      </w:r>
+      <w:r>
+        <w:rPr>
+          <w:rFonts w:ascii="Times New Roman" w:hAnsi="Times New Roman" w:cs="Times New Roman"/>
+        </w:rPr>
+        <w:t>GeeksforGeeks – NFA to DFA Conversion – https://www.geeksforgeeks.org/theory-of-computation/program-implement-nfa-epsilon-move-dfa-conversion/</w:t>
+      </w:r>
+    </w:p>
+    <w:p>
+      <w:pPr>
+        <w:spacing w:line="320" w:lineRule="exact"/>
+        <w:rPr>
+          <w:rFonts w:ascii="Times New Roman" w:hAnsi="Times New Roman" w:cs="Times New Roman"/>
+        </w:rPr>
+      </w:pPr>
+      <w:r>
+        <w:t xml:space="preserve">[3] </w:t>
+      </w:r>
+      <w:r>
+        <w:rPr>
+          <w:rFonts w:ascii="Times New Roman" w:hAnsi="Times New Roman" w:cs="Times New Roman"/>
+        </w:rPr>
+        <w:t>GeeksforGeeks – Finite Automata and Regular Expressions – https://www.geeksforgeeks.org/finite-automata-and-regular-expressions/</w:t>
+      </w:r>
+    </w:p>
+    <w:p>
+      <w:pPr>
+        <w:spacing w:line="320" w:lineRule="exact"/>
+        <w:rPr>
+          <w:rFonts w:ascii="Times New Roman" w:hAnsi="Times New Roman" w:cs="Times New Roman"/>
+        </w:rPr>
+      </w:pPr>
+      <w:r>
+        <w:t>[4]</w:t>
+      </w:r>
+      <w:r>
+        <w:rPr>
+          <w:rFonts w:ascii="Times New Roman" w:hAnsi="Times New Roman" w:cs="Times New Roman"/>
+        </w:rPr>
+        <w:t xml:space="preserve"> TutorialsPoint – Automata Theory – https://www.tutorialspoint.com/automata_theory/</w:t>
+      </w:r>
+    </w:p>
+    <w:p>
+      <w:pPr>
+        <w:spacing w:line="320" w:lineRule="exact"/>
+        <w:rPr>
+          <w:rFonts w:ascii="Times New Roman" w:hAnsi="Times New Roman" w:cs="Times New Roman"/>
+        </w:rPr>
+      </w:pPr>
+      <w:r>
+        <w:t>[5]</w:t>
+      </w:r>
+      <w:r>
+        <w:rPr>
+          <w:rFonts w:ascii="Times New Roman" w:hAnsi="Times New Roman" w:cs="Times New Roman"/>
+        </w:rPr>
+        <w:t xml:space="preserve"> Javatpoint – Nondeterministic Finite Automata – https://www.javatpoint.com/automata-nfa</w:t>
+      </w:r>
+    </w:p>
+    <w:p>
+      <w:pPr>
+        <w:spacing w:line="320" w:lineRule="exact"/>
+        <w:rPr>
+          <w:rFonts w:ascii="Times New Roman" w:hAnsi="Times New Roman" w:cs="Times New Roman"/>
+        </w:rPr>
+      </w:pPr>
+      <w:r>
+        <w:t>[6]</w:t>
+      </w:r>
+      <w:r>
+        <w:rPr>
+          <w:rFonts w:ascii="Times New Roman" w:hAnsi="Times New Roman" w:cs="Times New Roman"/>
+        </w:rPr>
+        <w:t xml:space="preserve"> Baeldung – Java Collections Framework – https://www.baeldung.com/java-collections</w:t>
+      </w:r>
+    </w:p>
+    <w:p>
+      <w:pPr>
+        <w:spacing w:line="320" w:lineRule="exact"/>
+        <w:rPr>
+          <w:rFonts w:ascii="Times New Roman" w:hAnsi="Times New Roman" w:cs="Times New Roman"/>
+        </w:rPr>
+      </w:pPr>
+      <w:r>
+        <w:t>[7]</w:t>
+      </w:r>
+      <w:r>
+        <w:rPr>
+          <w:rFonts w:ascii="Times New Roman" w:hAnsi="Times New Roman" w:cs="Times New Roman"/>
+        </w:rPr>
+        <w:t xml:space="preserve"> Programiz – Java HashSet – https://www.programiz.com/java-programming/hashset</w:t>
+      </w:r>
+    </w:p>
+    <w:p>
+      <w:pPr>
+        <w:spacing w:line="320" w:lineRule="exact"/>
+        <w:rPr>
+          <w:rFonts w:ascii="Times New Roman" w:hAnsi="Times New Roman" w:cs="Times New Roman"/>
+        </w:rPr>
+      </w:pPr>
+      <w:r>
+        <w:t>[8]</w:t>
+      </w:r>
+      <w:r>
+        <w:rPr>
+          <w:rFonts w:ascii="Times New Roman" w:hAnsi="Times New Roman" w:cs="Times New Roman"/>
+        </w:rPr>
+        <w:t xml:space="preserve"> TutorialsPoint – Java File Handling – https://www.tutorialspoint.com/java/java_files_io.htm</w:t>
+      </w:r>
+    </w:p>
+    <w:p>
+      <w:pPr>
+        <w:spacing w:line="320" w:lineRule="exact"/>
+        <w:rPr>
+          <w:rFonts w:ascii="Times New Roman" w:hAnsi="Times New Roman" w:cs="Times New Roman"/>
+        </w:rPr>
+      </w:pPr>
+      <w:r>
+        <w:t>[9]</w:t>
+      </w:r>
+      <w:r>
+        <w:rPr>
+          <w:rFonts w:ascii="Times New Roman" w:hAnsi="Times New Roman" w:cs="Times New Roman"/>
+        </w:rPr>
+        <w:t xml:space="preserve"> GeeksforGeeks – Depth First Search Algorithm – https://www.geeksforgeeks.org/depth-first-search-or-dfs-for-a-graph/</w:t>
+      </w:r>
+    </w:p>
+    <w:p>
+      <w:pPr>
+        <w:spacing w:line="320" w:lineRule="exact"/>
+        <w:rPr>
+          <w:rFonts w:ascii="Times New Roman" w:hAnsi="Times New Roman" w:cs="Times New Roman"/>
+        </w:rPr>
+      </w:pPr>
+      <w:r>
+        <w:t>[10]</w:t>
+      </w:r>
+      <w:r>
+        <w:rPr>
+          <w:rFonts w:ascii="Times New Roman" w:hAnsi="Times New Roman" w:cs="Times New Roman"/>
+        </w:rPr>
+        <w:t xml:space="preserve"> Oracle Java Documentation – Scanner Class – https://docs.oracle.com/javase/8/docs/api/java/util/Scanner.html</w:t>
+      </w:r>
+    </w:p>
+    <w:p>
+      <w:pPr>
+        <w:spacing w:line="320" w:lineRule="exact"/>
+        <w:rPr>
+          <w:rFonts w:ascii="Times New Roman" w:hAnsi="Times New Roman" w:cs="Times New Roman"/>
+        </w:rPr>
+      </w:pPr>
+      <w:r>
+        <w:t>[11]</w:t>
+      </w:r>
+      <w:r>
+        <w:rPr>
+          <w:rFonts w:ascii="Times New Roman" w:hAnsi="Times New Roman" w:cs="Times New Roman"/>
+        </w:rPr>
+        <w:t xml:space="preserve"> Материали и упражнения по дисциплината „Обектно-ориентирано програмиране“</w:t>
+      </w:r>
+    </w:p>
+    <w:p>
+      <w:pPr>
+        <w:spacing w:line="320" w:lineRule="exact"/>
+        <w:rPr>
+          <w:rFonts w:ascii="Times New Roman" w:hAnsi="Times New Roman" w:cs="Times New Roman"/>
+          <w:sz w:val="24"/>
+          <w:szCs w:val="24"/>
+        </w:rPr>
+      </w:pPr>
+      <w:r>
+        <w:rPr>
+          <w:rFonts w:ascii="Times New Roman" w:hAnsi="Times New Roman" w:cs="Times New Roman"/>
+          <w:sz w:val="24"/>
+          <w:szCs w:val="24"/>
+        </w:rPr>
+        <w:t>[12] GitHub Repository – https://github.com/USERNAME/REPOSITORY</w:t>
       </w:r>
     </w:p>
     <w:sectPr>
@@ -9259,16 +9764,16 @@
 <file path=word/numbering.xml><?xml version="1.0" encoding="utf-8"?>
 <w:numbering xmlns:wpc="http://schemas.microsoft.com/office/word/2010/wordprocessingCanvas" xmlns:cx="http://schemas.microsoft.com/office/drawing/2014/chartex" xmlns:cx1="http://schemas.microsoft.com/office/drawing/2015/9/8/chartex" xmlns:cx2="http://schemas.microsoft.com/office/drawing/2015/10/21/chartex" xmlns:cx3="http://schemas.microsoft.com/office/drawing/2016/5/9/chartex" xmlns:cx4="http://schemas.microsoft.com/office/drawing/2016/5/10/chartex" xmlns:cx5="http://schemas.microsoft.com/office/drawing/2016/5/11/chartex" xmlns:cx6="http://schemas.microsoft.com/office/drawing/2016/5/12/chartex" xmlns:cx7="http://schemas.microsoft.com/office/drawing/2016/5/13/chartex" xmlns:cx8="http://schemas.microsoft.com/office/drawing/2016/5/14/chartex" xmlns:mc="http://schemas.openxmlformats.org/markup-compatibility/2006" xmlns:aink="http://schemas.microsoft.com/office/drawing/2016/ink" xmlns:am3d="http://schemas.microsoft.com/office/drawing/2017/model3d" xmlns:o="urn:schemas-microsoft-com:office:office" xmlns:r="http://schemas.openxmlformats.org/officeDocument/2006/relationships" xmlns:m="http://schemas.openxmlformats.org/officeDocument/2006/math" xmlns:v="urn:schemas-microsoft-com:vml" xmlns:wp14="http://schemas.microsoft.com/office/word/2010/wordprocessingDrawing" xmlns:wp="http://schemas.openxmlformats.org/drawingml/2006/wordprocessingDrawing" xmlns:w10="urn:schemas-microsoft-com:office:word" xmlns:w="http://schemas.openxmlformats.org/wordprocessingml/2006/main" xmlns:w14="http://schemas.microsoft.com/office/word/2010/wordml" xmlns:w15="http://schemas.microsoft.com/office/word/2012/wordml" xmlns:w16cid="http://schemas.microsoft.com/office/word/2016/wordml/cid" xmlns:w16se="http://schemas.microsoft.com/office/word/2015/wordml/symex" xmlns:wpg="http://schemas.microsoft.com/office/word/2010/wordprocessingGroup" xmlns:wpi="http://schemas.microsoft.com/office/word/2010/wordprocessingInk" xmlns:wne="http://schemas.microsoft.com/office/word/2006/wordml" xmlns:wps="http://schemas.microsoft.com/office/word/2010/wordprocessingShape" mc:Ignorable="w14 w15 w16se w16cid wp14">
   <w:abstractNum w:abstractNumId="0" w15:restartNumberingAfterBreak="0">
-    <w:nsid w:val="33673CC1"/>
+    <w:nsid w:val="2EA539EC"/>
     <w:multiLevelType w:val="multilevel"/>
-    <w:tmpl w:val="0CB4B650"/>
+    <w:tmpl w:val="9272CA2A"/>
     <w:lvl w:ilvl="0">
       <w:start w:val="1"/>
       <w:numFmt w:val="decimal"/>
       <w:lvlText w:val="%1"/>
       <w:lvlJc w:val="left"/>
       <w:pPr>
-        <w:ind w:left="1380" w:hanging="660"/>
+        <w:ind w:left="540" w:hanging="540"/>
       </w:pPr>
       <w:rPr>
         <w:rFonts w:hint="default"/>
@@ -9280,7 +9785,7 @@
       <w:lvlText w:val="%1.%2"/>
       <w:lvlJc w:val="left"/>
       <w:pPr>
-        <w:ind w:left="1440" w:hanging="720"/>
+        <w:ind w:left="540" w:hanging="540"/>
       </w:pPr>
       <w:rPr>
         <w:rFonts w:hint="default"/>
@@ -9292,7 +9797,7 @@
       <w:lvlText w:val="%1.%2.%3"/>
       <w:lvlJc w:val="left"/>
       <w:pPr>
-        <w:ind w:left="1800" w:hanging="1080"/>
+        <w:ind w:left="720" w:hanging="720"/>
       </w:pPr>
       <w:rPr>
         <w:rFonts w:hint="default"/>
@@ -9304,7 +9809,7 @@
       <w:lvlText w:val="%1.%2.%3.%4"/>
       <w:lvlJc w:val="left"/>
       <w:pPr>
-        <w:ind w:left="2160" w:hanging="1440"/>
+        <w:ind w:left="720" w:hanging="720"/>
       </w:pPr>
       <w:rPr>
         <w:rFonts w:hint="default"/>
@@ -9316,7 +9821,7 @@
       <w:lvlText w:val="%1.%2.%3.%4.%5"/>
       <w:lvlJc w:val="left"/>
       <w:pPr>
-        <w:ind w:left="2520" w:hanging="1800"/>
+        <w:ind w:left="1080" w:hanging="1080"/>
       </w:pPr>
       <w:rPr>
         <w:rFonts w:hint="default"/>
@@ -9328,7 +9833,7 @@
       <w:lvlText w:val="%1.%2.%3.%4.%5.%6"/>
       <w:lvlJc w:val="left"/>
       <w:pPr>
-        <w:ind w:left="2880" w:hanging="2160"/>
+        <w:ind w:left="1080" w:hanging="1080"/>
       </w:pPr>
       <w:rPr>
         <w:rFonts w:hint="default"/>
@@ -9340,7 +9845,7 @@
       <w:lvlText w:val="%1.%2.%3.%4.%5.%6.%7"/>
       <w:lvlJc w:val="left"/>
       <w:pPr>
-        <w:ind w:left="3240" w:hanging="2520"/>
+        <w:ind w:left="1440" w:hanging="1440"/>
       </w:pPr>
       <w:rPr>
         <w:rFonts w:hint="default"/>
@@ -9352,7 +9857,7 @@
       <w:lvlText w:val="%1.%2.%3.%4.%5.%6.%7.%8"/>
       <w:lvlJc w:val="left"/>
       <w:pPr>
-        <w:ind w:left="3600" w:hanging="2880"/>
+        <w:ind w:left="1440" w:hanging="1440"/>
       </w:pPr>
       <w:rPr>
         <w:rFonts w:hint="default"/>
@@ -9364,6 +9869,119 @@
       <w:lvlText w:val="%1.%2.%3.%4.%5.%6.%7.%8.%9"/>
       <w:lvlJc w:val="left"/>
       <w:pPr>
+        <w:ind w:left="1440" w:hanging="1440"/>
+      </w:pPr>
+      <w:rPr>
+        <w:rFonts w:hint="default"/>
+      </w:rPr>
+    </w:lvl>
+  </w:abstractNum>
+  <w:abstractNum w:abstractNumId="1" w15:restartNumberingAfterBreak="0">
+    <w:nsid w:val="33673CC1"/>
+    <w:multiLevelType w:val="multilevel"/>
+    <w:tmpl w:val="0CB4B650"/>
+    <w:lvl w:ilvl="0">
+      <w:start w:val="1"/>
+      <w:numFmt w:val="decimal"/>
+      <w:lvlText w:val="%1"/>
+      <w:lvlJc w:val="left"/>
+      <w:pPr>
+        <w:ind w:left="1380" w:hanging="660"/>
+      </w:pPr>
+      <w:rPr>
+        <w:rFonts w:hint="default"/>
+      </w:rPr>
+    </w:lvl>
+    <w:lvl w:ilvl="1">
+      <w:start w:val="1"/>
+      <w:numFmt w:val="decimal"/>
+      <w:lvlText w:val="%1.%2"/>
+      <w:lvlJc w:val="left"/>
+      <w:pPr>
+        <w:ind w:left="1440" w:hanging="720"/>
+      </w:pPr>
+      <w:rPr>
+        <w:rFonts w:hint="default"/>
+      </w:rPr>
+    </w:lvl>
+    <w:lvl w:ilvl="2">
+      <w:start w:val="1"/>
+      <w:numFmt w:val="decimal"/>
+      <w:lvlText w:val="%1.%2.%3"/>
+      <w:lvlJc w:val="left"/>
+      <w:pPr>
+        <w:ind w:left="1800" w:hanging="1080"/>
+      </w:pPr>
+      <w:rPr>
+        <w:rFonts w:hint="default"/>
+      </w:rPr>
+    </w:lvl>
+    <w:lvl w:ilvl="3">
+      <w:start w:val="1"/>
+      <w:numFmt w:val="decimal"/>
+      <w:lvlText w:val="%1.%2.%3.%4"/>
+      <w:lvlJc w:val="left"/>
+      <w:pPr>
+        <w:ind w:left="2160" w:hanging="1440"/>
+      </w:pPr>
+      <w:rPr>
+        <w:rFonts w:hint="default"/>
+      </w:rPr>
+    </w:lvl>
+    <w:lvl w:ilvl="4">
+      <w:start w:val="1"/>
+      <w:numFmt w:val="decimal"/>
+      <w:lvlText w:val="%1.%2.%3.%4.%5"/>
+      <w:lvlJc w:val="left"/>
+      <w:pPr>
+        <w:ind w:left="2520" w:hanging="1800"/>
+      </w:pPr>
+      <w:rPr>
+        <w:rFonts w:hint="default"/>
+      </w:rPr>
+    </w:lvl>
+    <w:lvl w:ilvl="5">
+      <w:start w:val="1"/>
+      <w:numFmt w:val="decimal"/>
+      <w:lvlText w:val="%1.%2.%3.%4.%5.%6"/>
+      <w:lvlJc w:val="left"/>
+      <w:pPr>
+        <w:ind w:left="2880" w:hanging="2160"/>
+      </w:pPr>
+      <w:rPr>
+        <w:rFonts w:hint="default"/>
+      </w:rPr>
+    </w:lvl>
+    <w:lvl w:ilvl="6">
+      <w:start w:val="1"/>
+      <w:numFmt w:val="decimal"/>
+      <w:lvlText w:val="%1.%2.%3.%4.%5.%6.%7"/>
+      <w:lvlJc w:val="left"/>
+      <w:pPr>
+        <w:ind w:left="3240" w:hanging="2520"/>
+      </w:pPr>
+      <w:rPr>
+        <w:rFonts w:hint="default"/>
+      </w:rPr>
+    </w:lvl>
+    <w:lvl w:ilvl="7">
+      <w:start w:val="1"/>
+      <w:numFmt w:val="decimal"/>
+      <w:lvlText w:val="%1.%2.%3.%4.%5.%6.%7.%8"/>
+      <w:lvlJc w:val="left"/>
+      <w:pPr>
+        <w:ind w:left="3600" w:hanging="2880"/>
+      </w:pPr>
+      <w:rPr>
+        <w:rFonts w:hint="default"/>
+      </w:rPr>
+    </w:lvl>
+    <w:lvl w:ilvl="8">
+      <w:start w:val="1"/>
+      <w:numFmt w:val="decimal"/>
+      <w:lvlText w:val="%1.%2.%3.%4.%5.%6.%7.%8.%9"/>
+      <w:lvlJc w:val="left"/>
+      <w:pPr>
         <w:ind w:left="3600" w:hanging="2880"/>
       </w:pPr>
       <w:rPr>
@@ -9372,6 +9990,9 @@
     </w:lvl>
   </w:abstractNum>
   <w:num w:numId="1">
+    <w:abstractNumId w:val="1"/>
+  </w:num>
+  <w:num w:numId="2">
     <w:abstractNumId w:val="0"/>
   </w:num>
 </w:numbering>
@@ -10365,7 +10986,7 @@
 </file>
 
 <file path=customXml/itemProps1.xml><?xml version="1.0" encoding="utf-8"?>
-<ds:datastoreItem xmlns:ds="http://schemas.openxmlformats.org/officeDocument/2006/customXml" ds:itemID="{50F6EF69-F9A1-4951-9D99-42A24844107F}">
+<ds:datastoreItem xmlns:ds="http://schemas.openxmlformats.org/officeDocument/2006/customXml" ds:itemID="{70B97DDE-0BF1-443E-B81E-86D0D85E3E1E}">
   <ds:schemaRefs>
     <ds:schemaRef ds:uri="http://schemas.openxmlformats.org/officeDocument/2006/bibliography"/>
   </ds:schemaRefs>

</xml_diff>